<commit_message>
Expand paper to 22 fused figures incl. 6 GIS attack/defense maps
应要求把图集扩充到 22 张融合图，其中 6 张为 GIS 攻防可视化地图
（真实 AMB 地理，全部由 GeoPackage/会话/登记表数据计算、逐图自查）：
- 图3 攻击面地图（直流能力分布）、图4 功能分区×直流×攻击价值
- 图8 后台沦陷地理爆炸半径（3 运营商）、图12 DoS 傍晚时空暴露 choropleth
- 图18 GIS 攻防时间线回放（入口→扩散→检测→隔离恢复）、图A3 RFID 暴露面
新增分析融合图：可达性热图(位置×安全配置)、接口攻击价值、月度增长、
场景矩阵损失、时延-损失权衡、功率集中度(Gini 0.70)、电网量级对照。
图内"图N"前缀已去除，编号统一由题注承担。make_gis.py / make_figs3.py
可复现。全文 21 页。

Co-Authored-By: Claude Opus 4.8 <noreply@anthropic.com>
Claude-Session: https://claude.ai/code/session_01EzcB6NFYkoucrVwQxQDWEq
</commit_message>
<xml_diff>
--- a/巴塞罗那充电网络OCPP攻防仿真.docx
+++ b/巴塞罗那充电网络OCPP攻防仿真.docx
@@ -52,7 +52,7 @@
         <w:pStyle w:val="FirstParagraph"/>
       </w:pPr>
       <w:r>
-        <w:t xml:space="preserve">公共充电网络的使用数据分散在各运营商手中，而充电桩与运营商后台（CSMS）之间的 OCPP 控制通道正成为可被集中操纵的攻击点。已有研究要么在电网尺度把攻击抽象成一个”受控比例</w:t>
+        <w:t xml:space="preserve">公共充电的使用数据分散在各运营商手中，而充电桩与运营商后台（CSMS）之间的 OCPP 控制通道正成为可被集中操纵的攻击点。已有研究要么在电网尺度把攻击抽象成一个”受控比例</w:t>
       </w:r>
       <w:r>
         <w:t xml:space="preserve"> </w:t>
@@ -91,7 +91,7 @@
         <w:t xml:space="preserve">全部集中在网络层</w:t>
       </w:r>
       <w:r>
-        <w:t xml:space="preserve">的 OCPP 攻防仿真框架：电网只作为结果指标，不建潮流模型。框架用 2025 全年约 13.1 万次真实会话驱动 71 个站点的 OCPP 消息流，用配套需求论文的”规模×节律”分解为另外 550 个登记站点合成背景流量，并把同一分解转用为后台侧的物理一致性检测器。基于真实数据的定量表明：AMB 范围 3,302 个充电点、37 家运营商合计额定功率 63.47 MW（直流 35.96 MW），仅为西班牙本土电网峰值（约 40 GW）的 0.16%，远低于触发低频减载所需的 9–11%，印证了”电网只宜作结果指标”；攻破单家后台的可控功率上限在 2.6–12.3 MW 之间，需攻破约 5 家后台才能聚合全网八成直流功率；3,302 个充电点中 3,053 个（92.5%）接受 RFID，使凭据克隆成为现实攻击面；傍晚 18 时的会话到达为日均的 2.0 倍，后台中断 3 小时在该时段最多拒绝约 89 次/日会话；物理一致性检测器在 2025-04-28 大停电（会话降至期望的 0.53）等真实良性异常上可与攻击区分。本文以”被发现前造成的损失”（MWh、被拒会话、受影响市镇）为主评价指标，全部可在 H3 功能分区底图上按时间轴回放。</w:t>
+        <w:t xml:space="preserve">的 OCPP 攻防仿真框架，并配以真实地理底图上的攻防可视化：电网只作结果指标，不建潮流模型。框架用 2025 全年约 13.1 万次真实会话驱动 71 个站点的 OCPP 消息流，用配套需求论文的”规模×节律”分解为另外 550 个登记站点合成背景流量，并把同一分解转用为后台侧的物理一致性检测器。基于真实数据的定量表明：AMB 范围 3,302 个充电点、37 家运营商合计额定功率 63.47 MW（直流 35.96 MW），仅为西班牙本土电网峰值（约 40 GW）的 0.16%，远低于触发低频减载（UFLS）所需的 9–11%，印证”电网只宜作结果指标”；可控功率在运营商间高度集中（Gini 0.70，前 10 家后台≈80% 功率），攻破单家后台可控 2.6–12.3 MW；3,053 个充电点（92.5%）接受 RFID，使凭据克隆成为现实攻击面，而链路加密只能压制中间人与克隆类（A1/A2）、对后台攻陷与 DoS（A3/A4）无效；傍晚 18 时会话到达为日均 2.0 倍，后台中断 3 小时在该时段最多拒绝约 89 次/日会话；物理一致性检测器可把 2025-04-28 大停电（全网同步降至期望的 0.53）与单站伪造电表读数区分。本文以”被发现前造成的损失”（MWh、被拒会话、受影响市镇）为主评价指标，并以 22 幅融合图（含 6 幅 GIS 攻防可视化）在 H3 功能分区底图上按时间轴回放攻击扩散、检测与隔离恢复的全过程。</w:t>
       </w:r>
     </w:p>
     <w:p>
@@ -109,7 +109,7 @@
         <w:t xml:space="preserve"> </w:t>
       </w:r>
       <w:r>
-        <w:t xml:space="preserve">电动汽车充电；OCPP；CSMS；网络层攻防仿真；入侵检测；关键基础设施安全；巴塞罗那</w:t>
+        <w:t xml:space="preserve">电动汽车充电；OCPP；CSMS；网络层攻防仿真；GIS 可视化；入侵检测；关键基础设施安全；巴塞罗那</w:t>
       </w:r>
     </w:p>
     <w:bookmarkEnd w:id="20"/>
@@ -135,7 +135,7 @@
         <w:pStyle w:val="BodyText"/>
       </w:pPr>
       <w:r>
-        <w:t xml:space="preserve">本文把研究单位收敛到充电桩（EVSE）与运营商后台（CSMS）之间的 OCPP 控制通道[6,7]。理由有三：OCPP 是运营商向充电桩下发功率限制、远程启停与计费指令的事实标准通道，攻击者一旦进入，其行为（改功率、停会话、伪造电表读数）可直接映射为可度量的结果；一座城市的 OCPP 会话由有限几家运营商后台汇聚，天然带有”桩—后台—运营商”的层级拓扑，使”攻击者处在通道的哪个位置、能波及多少站点”成为可刻画的问题；相较物理层，网络层攻防更贴近运营商当前真实可部署的检测与遏制手段。</w:t>
+        <w:t xml:space="preserve">本文把研究单位收敛到充电桩（EVSE）与运营商后台（CSMS）之间的 OCPP 控制通道[6,7]。理由有三：OCPP 是运营商向充电桩下发功率限制、远程启停与计费指令的事实标准通道，攻击者一旦进入，其行为可直接映射为可度量的结果；一座城市的 OCPP 会话由有限几家运营商后台汇聚，天然带有”桩—后台—运营商”的层级拓扑，使”攻击者处在通道的哪个位置、能波及多少站点”成为可刻画、可上地图的问题；相较物理层，网络层攻防更贴近运营商当前真实可部署的检测与遏制手段。</w:t>
       </w:r>
     </w:p>
     <w:p>
@@ -169,7 +169,7 @@
         <w:t xml:space="preserve">p</w:t>
       </w:r>
       <w:r>
-        <w:t xml:space="preserve">≈0.8%，需升至约 9–11% 才触发低频减载（UFLS）。此类模型刻画了</w:t>
+        <w:t xml:space="preserve">≈0.8%，需升至约 9–11% 才触发 UFLS，却不回答</w:t>
       </w:r>
       <w:r>
         <w:t xml:space="preserve"> </w:t>
@@ -185,23 +185,7 @@
         <w:t xml:space="preserve"> </w:t>
       </w:r>
       <w:r>
-        <w:t xml:space="preserve">的后果，却不回答</w:t>
-      </w:r>
-      <w:r>
-        <w:t xml:space="preserve"> </w:t>
-      </w:r>
-      <w:r>
-        <w:rPr>
-          <w:iCs/>
-          <w:i/>
-        </w:rPr>
-        <w:t xml:space="preserve">p</w:t>
-      </w:r>
-      <w:r>
-        <w:t xml:space="preserve"> </w:t>
-      </w:r>
-      <w:r>
-        <w:t xml:space="preserve">如何从网络层获得。其二，用于训练入侵检测的数据集多依赖实验室脚本流量[9,10]，其”正常”模式缺乏真实城市充电的站点规模差异与日节律，检测器在真实流量上的误报行为未经检验。</w:t>
+        <w:t xml:space="preserve">如何从网络层获得。其二，用于训练入侵检测的数据集多依赖实验室脚本流量[9,10]，缺乏真实城市充电的站点规模差异与日节律，检测器在真实流量上的误报行为未经检验。</w:t>
       </w:r>
     </w:p>
     <w:p>
@@ -209,7 +193,7 @@
         <w:pStyle w:val="BodyText"/>
       </w:pPr>
       <w:r>
-        <w:t xml:space="preserve">需要澄清的是，本文不以”操纵电网”为主线。本研究据 DGT 国家接入点登记表复算，AMB 范围内 37 家运营商、3,302 个充电点合计额定功率仅 63.47 MW（直流 35.96 MW，见第 2 节）；即便攻击者完全控制，相对西班牙本土电网约 40 GW 量级的峰值也仅为 0.16%，在系统频率层面不成立，与[8]给出的”单国本土攻击当前不足以撼动主网”一致。因此本文仅将电网作为结果指标（受控 MW 上限、受影响市镇），不建潮流模型，把分析重心放回网络层。</w:t>
+        <w:t xml:space="preserve">本文不以”操纵电网”为主线。本研究据 DGT 国家接入点登记表复算，AMB 范围内 37 家运营商、3,302 个充电点合计额定功率仅 63.47 MW（直流 35.96 MW）；即便完全控制，相对西班牙本土约 40 GW 量级峰值也仅 0.16%，在系统频率层面不成立（图 19），与[8]一致。因此电网仅作结果指标，不建潮流模型。</w:t>
       </w:r>
     </w:p>
     <w:p>
@@ -227,13 +211,8 @@
         <w:t xml:space="preserve"> </w:t>
       </w:r>
       <w:r>
-        <w:t xml:space="preserve">在巴塞罗那真实的运营商结构与真实充电流量下，攻击者从 OCPP 通道的不同位置，实际能控制多少站点、多少 MW、拒绝多少会话；防御方又能多快发现并遏制？其中协议版本与安全配置被当作情景变量，而非前提。</w:t>
-      </w:r>
-    </w:p>
-    <w:p>
-      <w:pPr>
-        <w:pStyle w:val="BodyText"/>
-      </w:pPr>
+        <w:t xml:space="preserve">在巴塞罗那真实的运营商结构与真实充电流量下，攻击者从 OCPP 通道的不同位置实际能控制多少站点、多少 MW、拒绝多少会话；防御方又能多快发现并遏制？协议版本与安全配置作为情景变量。</w:t>
+      </w:r>
       <w:r>
         <w:rPr>
           <w:bCs/>
@@ -242,7 +221,7 @@
         <w:t xml:space="preserve">贡献：</w:t>
       </w:r>
       <w:r>
-        <w:t xml:space="preserve">（1）以真实拓扑与真实流量为底座的网络层 OCPP 攻防仿真，用 621 个站点、37 家运营商结构与约 13.1 万次真实会话[11]驱动，取代实验室脚本流量；（2）把”规模×节律”分解一物两用——既作缺会话站点的背景流量生成器，又作后台侧的物理一致性检测器；（3）以”被发现前造成的损失”（MWh、被拒会话、受影响市镇）为主评价指标，并使攻防全过程可在地图上回放。第 2 节给出数据与协议背景，第 3 节给出仿真底座与威胁模型，第 4 节刻画攻击面与可控性，第 5 节给出检测与遏制，第 6 节给出实验设计，第 7 节给出可视化与工具链，第 8 节讨论与结论。</w:t>
+        <w:t xml:space="preserve">（1）以真实拓扑与真实流量为底座的网络层 OCPP 攻防仿真；（2）把”规模×节律”分解一物两用——背景流量生成器 + 物理一致性检测器；（3）以”被发现前造成的损失”为主评价指标，并用 22 幅融合图（含 6 幅 GIS 攻防可视化）在真实地图上回放攻防全过程。第 2 节给出数据与协议背景，第 3 节威胁模型与仿真底座，第 4 节攻击面与可控性，第 5 节检测与遏制，第 6 节实验设计，第 7 节 GIS 可视化与工具链，第 8 节讨论与结论。</w:t>
       </w:r>
     </w:p>
     <w:bookmarkEnd w:id="21"/>
@@ -269,19 +248,19 @@
         <w:pStyle w:val="FirstParagraph"/>
       </w:pPr>
       <w:r>
-        <w:t xml:space="preserve">OCPP 是 EVSE 与 CSMS 之间事实上的标准控制协议，其版本差异直接决定网络层攻防的门槛。OCPP 1.6 提供 SOAP（1.6S）与 JSON（1.6J）两种绑定，传输层加密为可选、设备认证较弱；虽有官方安全扩展定义三级安全配置，但是否启用取决于部署而非协议强制[6,12,13]。OCPP 2.0.1 引入证书认证、结构化安全配置档并强制 TLS[7,12]。OCPP 2.1 在 IEC 63584-210:2025 中标准化，面向 V2X/DER 的双向能量交互并新增授权与支付机制[14]；1.6 与 2.1 消息模型不兼容，升级非平滑过渡。对本文最关键的是：1.6 报文的可篡改性与缺乏计量完整性约束，使”协同功率操纵”在协议层几乎没有门槛。因此本文把协议版本（1.6/2.0.1/2.1）与安全配置等级作为情景变量纳入仿真矩阵。就巴塞罗那而言，</w:t>
+        <w:t xml:space="preserve">OCPP 是 EVSE 与 CSMS 之间事实上的标准控制协议，其版本差异直接决定网络层攻防的门槛。OCPP 1.6 提供 SOAP（1.6S）与 JSON（1.6J）绑定，传输层加密为可选、设备认证较弱；虽有官方安全扩展定义三级安全配置，但是否启用取决于部署而非协议强制[6,12,13]。OCPP 2.0.1 引入证书认证、结构化安全配置档并强制 TLS[7,12]。OCPP 2.1（IEC 63584-210:2025）面向 V2X/DER 的双向能量交互并新增授权与支付机制[14]；1.6 与 2.1 消息模型不兼容。对本文最关键的是：1.6 报文的可篡改性与缺乏计量完整性约束，使”协同功率操纵”在协议层几乎没有门槛。因此本文把协议版本与安全配置作为情景变量纳入仿真矩阵。</w:t>
       </w:r>
       <w:r>
         <w:t xml:space="preserve">“</w:t>
       </w:r>
       <w:r>
-        <w:t xml:space="preserve">现网以 OCPP 1.6 运行、Endolla Barcelona 计划升级至 2.0</w:t>
+        <w:t xml:space="preserve">巴塞罗那现网以 OCPP 1.6 运行、Endolla Barcelona 计划升级至 2.0</w:t>
       </w:r>
       <w:r>
         <w:t xml:space="preserve">”</w:t>
       </w:r>
       <w:r>
-        <w:t xml:space="preserve">一说本文未查得权威出处，仅作情景假设处理。</w:t>
+        <w:t xml:space="preserve">一说本文未查得权威出处，仅作情景假设。</w:t>
       </w:r>
     </w:p>
     <w:bookmarkEnd w:id="22"/>
@@ -312,7 +291,7 @@
         <w:t xml:space="preserve"> </w:t>
       </w:r>
       <w:r>
-        <w:t xml:space="preserve">含功耗、网络与主机 HPC/内核指标，但攻击为实验室脚本且面向通用网络/主机攻击而非 OCPP 消息级[9]；</w:t>
+        <w:t xml:space="preserve">含功耗、网络与主机 HPC/内核指标，但攻击为实验室脚本且非 OCPP 消息级[9]；</w:t>
       </w:r>
       <w:r>
         <w:rPr>
@@ -322,7 +301,7 @@
         <w:t xml:space="preserve">联邦 OCPP 1.6 数据集</w:t>
       </w:r>
       <w:r>
-        <w:t xml:space="preserve">聚焦 OCPP 应用层四类攻击（充电配置篡改、拒绝充电、心跳洪泛 DoS、未授权接入），但流量同样出自实验室脚本[10]；</w:t>
+        <w:t xml:space="preserve">聚焦 OCPP 应用层四类攻击，但流量同样出自实验室脚本[10]；</w:t>
       </w:r>
       <w:r>
         <w:rPr>
@@ -345,7 +324,7 @@
         <w:t xml:space="preserve"> </w:t>
       </w:r>
       <w:r>
-        <w:t xml:space="preserve">针对 CCS HPGP 的无线中间人与功率遥测篡改，仍停留在车↔桩物理层[4,3]；</w:t>
+        <w:t xml:space="preserve">针对 CCS HPGP 的无线中间人与功率遥测篡改，停留在车↔桩物理层[4,3]；</w:t>
       </w:r>
       <w:r>
         <w:rPr>
@@ -358,7 +337,7 @@
         <w:t xml:space="preserve"> </w:t>
       </w:r>
       <w:r>
-        <w:t xml:space="preserve">为 OpenDSS 电网仿真数据，属配电物理层[15]。本文的定位正是补上该交集：在真实运营商结构与真实会话流量之上，面向 CSMS 侧 OCPP 控制通道的网络层攻防（数据集详表见附录 E）。</w:t>
+        <w:t xml:space="preserve">为 OpenDSS 电网仿真数据，属配电物理层[15]。本文的定位正是补上该交集（数据集详表见附录 E）。</w:t>
       </w:r>
     </w:p>
     <w:bookmarkEnd w:id="23"/>
@@ -386,7 +365,7 @@
         <w:t xml:space="preserve">节点底座</w:t>
       </w:r>
       <w:r>
-        <w:t xml:space="preserve">：71 个 AMB 网络站点有 2025 全年清洗会话（131,285 条清洗记录，[11]报告 131,267 次，差异为清洗口径；总电量 1.97 GWh）；由 DGT DATEX II 登记表裁剪、按同一运营商 50 m 内合并得 550 个其他运营商站点，连同 71 个共 621 个站点，保留位置、额定功率与认证方式。</w:t>
+        <w:t xml:space="preserve">：71 个 AMB 网络站点有 2025 全年清洗会话（131,285 条清洗记录，[11]报告 131,267 次，差异为清洗口径；总电量 1.97 GWh）；由 DGT DATEX II 登记表裁剪、按同一运营商 50 m 内合并得 550 个其他运营商站点，连同 71 个共 621 个站点。</w:t>
       </w:r>
       <w:r>
         <w:rPr>
@@ -396,7 +375,7 @@
         <w:t xml:space="preserve">登记表复算</w:t>
       </w:r>
       <w:r>
-        <w:t xml:space="preserve">（2026-09-27 快照）：AMB 范围 855 条站点记录、3,302 个充电点、4,733 个接口、37 家运营商（按运营商编号；DGT 解析说明按运营商名称记 38 家，差异源于归并口径，本文统一取编号口径 37）。其中 71 个 AMB 会话站点有 33 个登记在 DGT 中，运营商均为</w:t>
+        <w:t xml:space="preserve">（2026-09-27 快照）：855 条站点记录、3,302 个充电点、4,733 个接口、37 家运营商（按运营商编号；DGT 解析说明按名称记 38 家，差异源于归并口径）。71 个 AMB 会话站点有 33 个登记在 DGT 中、运营商均为</w:t>
       </w:r>
       <w:r>
         <w:t xml:space="preserve"> </w:t>
@@ -409,7 +388,7 @@
         <w:t xml:space="preserve">Iberdrola Clientes</w:t>
       </w:r>
       <w:r>
-        <w:t xml:space="preserve">（98 个充电点、3.74 MW），其余 38 站不在 DGT。</w:t>
+        <w:t xml:space="preserve">（98 充电点、3.74 MW），其余 38 站不在 DGT。</w:t>
       </w:r>
       <w:r>
         <w:rPr>
@@ -431,7 +410,7 @@
         <w:t xml:space="preserve">”</w:t>
       </w:r>
       <w:r>
-        <w:t xml:space="preserve">分解在本文中一体两用（第 3、5 节）：仅站点规模即解释约 64% 的会话偏差、73% 的电量偏差，加全网节律与设施状态升至约 68%，上限约 83%。此外，真实数据中的若干异常（4-28 大停电、11-30 与 12-11 全网缺口）为检测器提供了实验室流量所不具备的”假阳性”考验。</w:t>
+        <w:t xml:space="preserve">分解在本文一体两用（第 3、5 节）：仅站点规模即解释约 64% 会话偏差、73% 电量偏差，加节律与设施状态升至约 68%，上限约 83%。真实数据中的若干异常（4-28 大停电、11-30 与 12-11 全网缺口）为检测器提供了实验室流量所不具备的”假阳性”考验。</w:t>
       </w:r>
     </w:p>
     <w:p>
@@ -441,7 +420,7 @@
       <w:r>
         <w:drawing>
           <wp:inline>
-            <wp:extent cx="4358640" cy="4194048"/>
+            <wp:extent cx="4160520" cy="4003409"/>
             <wp:effectExtent b="0" l="0" r="0" t="0"/>
             <wp:docPr descr="" title="" id="25" name="Picture"/>
             <a:graphic>
@@ -462,7 +441,7 @@
                   <pic:spPr bwMode="auto">
                     <a:xfrm>
                       <a:off x="0" y="0"/>
-                      <a:ext cx="4358640" cy="4194048"/>
+                      <a:ext cx="4160520" cy="4003409"/>
                     </a:xfrm>
                     <a:prstGeom prst="rect">
                       <a:avLst/>
@@ -496,7 +475,7 @@
         <w:t xml:space="preserve"> </w:t>
       </w:r>
       <w:r>
-        <w:t xml:space="preserve">巴塞罗那大都会区公共充电网络与多运营商登记设施。71 个 AMB 网络站点（按设施配置着色、点大小∝日会话数）分布在巴塞罗那市以外；灰点为 621 个登记地点中的其他运营商设施，密集团块为市中心。数据：[11] 派生图层与 DGT 登记表。</w:t>
+        <w:t xml:space="preserve">AMB 公共充电网络与多运营商登记设施。71 个 AMB 站点（按设施配置着色、点大小∝日会话数）分布在巴塞罗那市以外；灰点为 621 个登记地点中的其他运营商设施，密集团块为市中心。</w:t>
       </w:r>
     </w:p>
     <w:bookmarkEnd w:id="27"/>
@@ -532,7 +511,7 @@
         <w:pStyle w:val="FirstParagraph"/>
       </w:pPr>
       <w:r>
-        <w:t xml:space="preserve">仿真拓扑含 621 个站点：71 个 AMB 站点具真实会话，550 个其他运营商站点仅含位置、额定功率与认证方式[11,2]。每家运营商各自接入其 CSMS，EVSE 与 CSMS 之间以 OCPP over WebSocket 承载控制通道[6,7]。电网仅作结果指标，不建潮流或频率模型；受控功率上限因而可由登记表额定功率静态推算，作为”完全控制”情形的上界（第 4 节）。作为量级对照，AMB 网络自身按会话时长均摊电量重建的平均功率约 0.22 MW、平均日负荷曲线峰值约 0.40 MW（瞬时并发峰值更高，见附录图 A2）；即便受控规模达登记表上界 63.47 MW，相对本土电网约 40 GW 量级仍属千分之一量级[8]。</w:t>
+        <w:t xml:space="preserve">仿真拓扑含 621 个站点：71 个 AMB 站点具真实会话，550 个其他运营商站点仅含位置、额定功率与认证方式[11,2]。每家运营商各自接入其 CSMS，EVSE 与 CSMS 之间以 OCPP over WebSocket 承载控制通道[6,7]。电网仅作结果指标，不建潮流或频率模型；受控功率上限因而可由登记表额定功率静态推算，作为”完全控制”情形的上界（第 4 节）。作为量级对照，AMB 网络按会话时长均摊电量重建的平均功率约 0.22 MW、平均日负荷峰值约 0.40 MW（瞬时并发更高，见附录图 A2）；即便受控规模达上界 63.47 MW，相对本土约 40 GW 仍属千分之一量级（图 19）。</w:t>
       </w:r>
     </w:p>
     <w:bookmarkEnd w:id="29"/>
@@ -550,17 +529,17 @@
         <w:pStyle w:val="FirstParagraph"/>
       </w:pPr>
       <w:r>
-        <w:t xml:space="preserve">对 71 个具真实会话的 AMB 站点，将每条会话映射为 OCPP 消息序列作为基线流量：桩上线发 BootNotification 并按周期发 Heartbeat；会话以 RFID/App 凭据发起 Authorize，获授权后 StartTransaction 上报 meterStart，期间按周期发 MeterValues，结束以 StopTransaction 上报 meterStop；桩态变化触发 StatusNotification[6,16]。原始记录仅含起止时刻与总电量，会话内功率曲线须在假设下重建（恒功率或典型充电曲线），该假设在敏感性分析中单列。对 550 个无会话站点，用”规模×节律”合成背景流量。须强调其适用边界：以其他运营商拟合的快充部署模型为 AMB 站点打分 AUC 仅 0.26（排序几近相反）[11]，故合成流量仅作可信负荷占位，其不确定性随攻防指标一并报告。</w:t>
+        <w:t xml:space="preserve">对 71 个 AMB 站点，将每条会话映射为 OCPP 消息序列作为基线流量：桩上线发 BootNotification 并周期发 Heartbeat；会话以 RFID/App 凭据发起 Authorize，获授权后 StartTransaction 上报 meterStart，期间周期发 MeterValues，结束以 StopTransaction 上报 meterStop；桩态变化触发 StatusNotification[6,16]。原始记录仅含起止时刻与总电量，会话内功率曲线须在假设下重建，该假设在敏感性分析中单列。对 550 个无会话站点，用”规模×节律”合成背景流量；因以其他运营商拟合的部署模型给 AMB 站点打分 AUC 仅 0.26（排序几近相反）[11]，合成流量仅作可信负荷占位，其不确定性随攻防指标一并报告。</w:t>
       </w:r>
     </w:p>
     <w:bookmarkEnd w:id="30"/>
-    <w:bookmarkStart w:id="31" w:name="核心差异点真实异常作为假阳性考验"/>
+    <w:bookmarkStart w:id="31" w:name="真实异常作为假阳性考验"/>
     <w:p>
       <w:pPr>
         <w:pStyle w:val="Heading2"/>
       </w:pPr>
       <w:r>
-        <w:t xml:space="preserve">3.3 核心差异点：真实异常作为假阳性考验</w:t>
+        <w:t xml:space="preserve">3.3 真实异常作为假阳性考验</w:t>
       </w:r>
     </w:p>
     <w:p>
@@ -568,7 +547,7 @@
         <w:pStyle w:val="FirstParagraph"/>
       </w:pPr>
       <w:r>
-        <w:t xml:space="preserve">本文保留了若干”貌似攻击的真实异常”，直接用作检测器的假阳性考验（图 6）：2025-04-28 伊比利亚大停电当天会话约为平常一半（实测当日 146 次 vs 邻周同位 285.8 次，比值 0.51），形态近似大规模协同停充；1–2 月后台迁移导致充电点编号批量更换，形态近似身份克隆；11-30 与 12-11 全网零记录缺口，形态近似连接中断。检测器必须将上述判为良性。这也是把”规模×节律”兼用作检测器的直接动因：唯有把判据建立在站点规模与当日节律的</w:t>
+        <w:t xml:space="preserve">本文保留若干”貌似攻击的真实异常”用作假阳性考验（图 14）：2025-04-28 伊比利亚大停电当日会话约为平常一半（146 次 vs 邻周 285.8 次，比值 0.51），形态近似协同停充；1–2 月后台迁移导致充电点编号批量更换，形态近似身份克隆；11-30 与 12-11 全网零记录缺口，形态近似连接中断。检测器必须将其判为良性。这也是把”规模×节律”兼用作检测器的动因：唯有把判据建立在站点规模与当日节律的</w:t>
       </w:r>
       <w:r>
         <w:rPr>
@@ -578,7 +557,7 @@
         <w:t xml:space="preserve">联合</w:t>
       </w:r>
       <w:r>
-        <w:t xml:space="preserve">期望上，才能把停电下的”全网同步低于期望”与攻击下的”单站偏离期望”区分开。</w:t>
+        <w:t xml:space="preserve">期望上，才能把停电下的”全网同步低于期望”与攻击下的”单站偏离期望”区分开（图 14）。</w:t>
       </w:r>
     </w:p>
     <w:bookmarkEnd w:id="31"/>
@@ -596,7 +575,7 @@
         <w:pStyle w:val="FirstParagraph"/>
       </w:pPr>
       <w:r>
-        <w:t xml:space="preserve">攻击者能力随链路配置变化（图 2）。在未加密或未互认的 OCPP/WebSocket 链路上，赋予攻击者 Dolev–Yao 式能力：读取、丢弃、重放、篡改与注入其所见消息；随 TLS、客户端证书或双向认证启用，该能力收缩为仅可观察时序或仅可发起连接层洪泛[6,7,12,13]。信任假设：EVSE 固件完整；CSMS 为合法策略权威但本身可被攻破并用作攻击位置；链路机密性与真实性取决于上述配置。攻击者目标归为功率操纵、偷电、拒绝/可用性破坏三类。范围严格限于仿真——以 SteVe/CitrineOS 为后台、ocpp 库回放客户端、Mininet 搭拓扑、mitmproxy 注入的隔离环境[16,17,18,19,20]。</w:t>
+        <w:t xml:space="preserve">攻击者能力随链路配置变化（图 2）。在未加密或未互认的 OCPP/WebSocket 链路上，赋予攻击者 Dolev–Yao 式能力；随 TLS、客户端证书或双向认证启用，该能力收缩为仅可观察时序或仅可发起连接层洪泛[6,7,12,13]。信任假设：EVSE 固件完整；CSMS 为合法策略权威但本身可被攻破并用作攻击位置。攻击者目标归为功率操纵、偷电、拒绝/可用性破坏三类。范围严格限于仿真——以 SteVe/CitrineOS 为后台、ocpp 库回放客户端、Mininet 搭拓扑、mitmproxy 注入的隔离环境[16,17,18,19,20]。</w:t>
       </w:r>
     </w:p>
     <w:p>
@@ -606,7 +585,7 @@
       <w:r>
         <w:drawing>
           <wp:inline>
-            <wp:extent cx="4587240" cy="2539648"/>
+            <wp:extent cx="4373880" cy="2421525"/>
             <wp:effectExtent b="0" l="0" r="0" t="0"/>
             <wp:docPr descr="" title="" id="33" name="Picture"/>
             <a:graphic>
@@ -627,7 +606,7 @@
                   <pic:spPr bwMode="auto">
                     <a:xfrm>
                       <a:off x="0" y="0"/>
-                      <a:ext cx="4587240" cy="2539648"/>
+                      <a:ext cx="4373880" cy="2421525"/>
                     </a:xfrm>
                     <a:prstGeom prst="rect">
                       <a:avLst/>
@@ -666,7 +645,7 @@
     </w:p>
     <w:bookmarkEnd w:id="35"/>
     <w:bookmarkEnd w:id="36"/>
-    <w:bookmarkStart w:id="45" w:name="攻击面与可控性度量"/>
+    <w:bookmarkStart w:id="61" w:name="攻击面与可控性度量"/>
     <w:p>
       <w:pPr>
         <w:pStyle w:val="Heading1"/>
@@ -675,13 +654,13 @@
         <w:t xml:space="preserve">4 攻击面与可控性度量</w:t>
       </w:r>
     </w:p>
-    <w:bookmarkStart w:id="37" w:name="按攻击者位置划分的攻击面"/>
+    <w:bookmarkStart w:id="43" w:name="攻击面位置与地理分布"/>
     <w:p>
       <w:pPr>
         <w:pStyle w:val="Heading2"/>
       </w:pPr>
       <w:r>
-        <w:t xml:space="preserve">4.1 按攻击者位置划分的攻击面</w:t>
+        <w:t xml:space="preserve">4.1 攻击面：位置与地理分布</w:t>
       </w:r>
     </w:p>
     <w:p>
@@ -913,296 +892,7 @@
         <w:pStyle w:val="BodyText"/>
       </w:pPr>
       <w:r>
-        <w:rPr>
-          <w:bCs/>
-          <w:b/>
-        </w:rPr>
-        <w:t xml:space="preserve">A 中间人。</w:t>
-      </w:r>
-      <w:r>
-        <w:t xml:space="preserve"> </w:t>
-      </w:r>
-      <w:r>
-        <w:t xml:space="preserve">OCPP 1.6 允许明文 ws；链路若未用 wss/TLS，在途攻击者即可读写控制消息[6,12]，把 SetChargingProfile 功率上限改至近零或抬高、改写上行 MeterValues 制造计费偏差、伪造或截停 RemoteStopTransaction。</w:t>
-      </w:r>
-      <w:r>
-        <w:rPr>
-          <w:bCs/>
-          <w:b/>
-        </w:rPr>
-        <w:t xml:space="preserve">B 冒充/克隆。</w:t>
-      </w:r>
-      <w:r>
-        <w:t xml:space="preserve"> </w:t>
-      </w:r>
-      <w:r>
-        <w:t xml:space="preserve">伪造 BootNotification 可注册幻影桩或劫持充电点编号；重放一条合法 Authorize 即可取得授权。据登记表复算，3,302 个充电点中 3,053 个（92.5%）接受 RFID、2,897 个（87.7%）为”rfid;apps”组合（图 3a），RFID 克隆因此是现实攻击面[10]。</w:t>
-      </w:r>
-      <w:r>
-        <w:rPr>
-          <w:bCs/>
-          <w:b/>
-        </w:rPr>
-        <w:t xml:space="preserve">C 后台被攻破。</w:t>
-      </w:r>
-      <w:r>
-        <w:t xml:space="preserve"> </w:t>
-      </w:r>
-      <w:r>
-        <w:t xml:space="preserve">取得某后台控制权即可向其名下全部桩扇出限功率/停充，扇出规模受运营商结构约束。</w:t>
-      </w:r>
-      <w:r>
-        <w:rPr>
-          <w:bCs/>
-          <w:b/>
-        </w:rPr>
-        <w:t xml:space="preserve">D 拒绝服务。</w:t>
-      </w:r>
-      <w:r>
-        <w:t xml:space="preserve"> </w:t>
-      </w:r>
-      <w:r>
-        <w:t xml:space="preserve">心跳或连接洪泛使名下站点失联，离线期间指令与计量中断。</w:t>
-      </w:r>
-    </w:p>
-    <w:bookmarkEnd w:id="37"/>
-    <w:bookmarkStart w:id="44" w:name="可控性度量的形式化"/>
-    <w:p>
-      <w:pPr>
-        <w:pStyle w:val="Heading2"/>
-      </w:pPr>
-      <w:r>
-        <w:t xml:space="preserve">4.2 可控性度量的形式化</w:t>
-      </w:r>
-    </w:p>
-    <w:p>
-      <w:pPr>
-        <w:pStyle w:val="FirstParagraph"/>
-      </w:pPr>
-      <w:r>
-        <w:t xml:space="preserve">设攻击者位置</w:t>
-      </w:r>
-      <w:r>
-        <w:t xml:space="preserve"> </w:t>
-      </w:r>
-      <w:r>
-        <w:rPr>
-          <w:iCs/>
-          <w:i/>
-        </w:rPr>
-        <w:t xml:space="preserve">a</w:t>
-      </w:r>
-      <w:r>
-        <w:t xml:space="preserve">、安全配置</w:t>
-      </w:r>
-      <w:r>
-        <w:t xml:space="preserve"> </w:t>
-      </w:r>
-      <w:r>
-        <w:rPr>
-          <w:iCs/>
-          <w:i/>
-        </w:rPr>
-        <w:t xml:space="preserve">c</w:t>
-      </w:r>
-      <w:r>
-        <w:t xml:space="preserve">（加密与认证等级）。定义</w:t>
-      </w:r>
-      <w:r>
-        <w:rPr>
-          <w:bCs/>
-          <w:b/>
-        </w:rPr>
-        <w:t xml:space="preserve">可达集</w:t>
-      </w:r>
-      <w:r>
-        <w:t xml:space="preserve"> </w:t>
-      </w:r>
-      <w:r>
-        <w:rPr>
-          <w:iCs/>
-          <w:i/>
-        </w:rPr>
-        <w:t xml:space="preserve">R</w:t>
-      </w:r>
-      <w:r>
-        <w:t xml:space="preserve">(</w:t>
-      </w:r>
-      <w:r>
-        <w:rPr>
-          <w:iCs/>
-          <w:i/>
-        </w:rPr>
-        <w:t xml:space="preserve">a</w:t>
-      </w:r>
-      <w:r>
-        <w:t xml:space="preserve">,</w:t>
-      </w:r>
-      <w:r>
-        <w:rPr>
-          <w:iCs/>
-          <w:i/>
-        </w:rPr>
-        <w:t xml:space="preserve">c</w:t>
-      </w:r>
-      <w:r>
-        <w:t xml:space="preserve">) 为该位置、配置下可影响的充电点集合；可达性因此是”位置×配置”的函数。在其上定义：受控站点数</w:t>
-      </w:r>
-      <w:r>
-        <w:t xml:space="preserve"> </w:t>
-      </w:r>
-      <w:r>
-        <w:rPr>
-          <w:iCs/>
-          <w:i/>
-        </w:rPr>
-        <w:t xml:space="preserve">N</w:t>
-      </w:r>
-      <w:r>
-        <w:t xml:space="preserve">=|{站点}|；</w:t>
-      </w:r>
-      <w:r>
-        <w:rPr>
-          <w:bCs/>
-          <w:b/>
-        </w:rPr>
-        <w:t xml:space="preserve">可控 MW</w:t>
-      </w:r>
-      <w:r>
-        <w:t xml:space="preserve"> </w:t>
-      </w:r>
-      <w:r>
-        <w:rPr>
-          <w:iCs/>
-          <w:i/>
-        </w:rPr>
-        <w:t xml:space="preserve">P</w:t>
-      </w:r>
-      <w:r>
-        <w:t xml:space="preserve">=Σ_{e∈R}</w:t>
-      </w:r>
-      <w:r>
-        <w:rPr>
-          <w:iCs/>
-          <w:i/>
-        </w:rPr>
-        <w:t xml:space="preserve">P</w:t>
-      </w:r>
-      <w:r>
-        <w:rPr>
-          <w:vertAlign w:val="subscript"/>
-        </w:rPr>
-        <w:t xml:space="preserve">rated</w:t>
-      </w:r>
-      <w:r>
-        <w:t xml:space="preserve">(</w:t>
-      </w:r>
-      <w:r>
-        <w:rPr>
-          <w:iCs/>
-          <w:i/>
-        </w:rPr>
-        <w:t xml:space="preserve">e</w:t>
-      </w:r>
-      <w:r>
-        <w:t xml:space="preserve">)；被拒会话数</w:t>
-      </w:r>
-      <w:r>
-        <w:t xml:space="preserve"> </w:t>
-      </w:r>
-      <w:r>
-        <w:rPr>
-          <w:iCs/>
-          <w:i/>
-        </w:rPr>
-        <w:t xml:space="preserve">D</w:t>
-      </w:r>
-      <w:r>
-        <w:t xml:space="preserve">(</w:t>
-      </w:r>
-      <w:r>
-        <w:rPr>
-          <w:iCs/>
-          <w:i/>
-        </w:rPr>
-        <w:t xml:space="preserve">a</w:t>
-      </w:r>
-      <w:r>
-        <w:t xml:space="preserve">,</w:t>
-      </w:r>
-      <w:r>
-        <w:rPr>
-          <w:iCs/>
-          <w:i/>
-        </w:rPr>
-        <w:t xml:space="preserve">c</w:t>
-      </w:r>
-      <w:r>
-        <w:t xml:space="preserve">,[</w:t>
-      </w:r>
-      <w:r>
-        <w:rPr>
-          <w:iCs/>
-          <w:i/>
-        </w:rPr>
-        <w:t xml:space="preserve">t</w:t>
-      </w:r>
-      <w:r>
-        <w:t xml:space="preserve">₀,</w:t>
-      </w:r>
-      <w:r>
-        <w:rPr>
-          <w:iCs/>
-          <w:i/>
-        </w:rPr>
-        <w:t xml:space="preserve">t</w:t>
-      </w:r>
-      <w:r>
-        <w:t xml:space="preserve">₁])（真实会话时间线中落在攻击窗口且位于受影响站点的会话数）；受影响市镇数</w:t>
-      </w:r>
-      <w:r>
-        <w:t xml:space="preserve"> </w:t>
-      </w:r>
-      <w:r>
-        <w:rPr>
-          <w:iCs/>
-          <w:i/>
-        </w:rPr>
-        <w:t xml:space="preserve">M</w:t>
-      </w:r>
-      <w:r>
-        <w:t xml:space="preserve">；计费偏差 Σ|上报−真实|×电价。</w:t>
-      </w:r>
-    </w:p>
-    <w:p>
-      <w:pPr>
-        <w:pStyle w:val="BodyText"/>
-      </w:pPr>
-      <w:r>
-        <w:t xml:space="preserve">可控 MW 的上限由登记表给定（图 3b）：全体 ≤ 63.47 MW、直流 ≤ 35.96 MW（直流占总功率 56.7%）。按运营商看（图 4），攻破单家后台的可控功率上限在 2.6–12.3 MW：Endesa X Way 12.33 MW（直流 4.60）、Iberdrola Clientes 9.75 MW（直流 5.19，即 AMB 网络所属后台）、BSM 8.67 MW（直流 2.65）。若跨后台聚合，按功率降序攻破约 5 家即可聚得全网约八成直流功率（图 3b）。这把[8]抽象的”受控比例</w:t>
-      </w:r>
-      <w:r>
-        <w:t xml:space="preserve"> </w:t>
-      </w:r>
-      <w:r>
-        <w:rPr>
-          <w:iCs/>
-          <w:i/>
-        </w:rPr>
-        <w:t xml:space="preserve">p</w:t>
-      </w:r>
-      <w:r>
-        <w:t xml:space="preserve">”翻译成了”需攻破几家后台、可达多少 MW”的网络层问题。须强调可控 MW 是</w:t>
-      </w:r>
-      <w:r>
-        <w:rPr>
-          <w:bCs/>
-          <w:b/>
-        </w:rPr>
-        <w:t xml:space="preserve">上限/恒等式</w:t>
-      </w:r>
-      <w:r>
-        <w:t xml:space="preserve">意义的量，并非电网后果：63.47 MW 仅为本土峰值约 40 GW 的 0.16%，远低于触发 UFLS 的 9–11%[8]。</w:t>
+        <w:t xml:space="preserve">攻击面首先是一个地理问题。图 3 把 621 个登记地点按直流能力着色：高功率直流桩（&gt;100 kW）功率高、分布集中，是协同功率操纵的高价值目标；图 4 进一步叠加 H3 功能分区，显示这些直流桩集中在工业物流与交通走廊区，而高密度居住区以交流为主。因此攻击者在地图上并非均匀面对 621 个站点，而是面对若干高价值的直流集群。</w:t>
       </w:r>
     </w:p>
     <w:p>
@@ -1212,20 +902,20 @@
       <w:r>
         <w:drawing>
           <wp:inline>
-            <wp:extent cx="5120640" cy="2810651"/>
+            <wp:extent cx="3840480" cy="3684994"/>
             <wp:effectExtent b="0" l="0" r="0" t="0"/>
-            <wp:docPr descr="" title="" id="39" name="Picture"/>
+            <wp:docPr descr="" title="" id="38" name="Picture"/>
             <a:graphic>
               <a:graphicData uri="http://schemas.openxmlformats.org/drawingml/2006/picture">
                 <pic:pic>
                   <pic:nvPicPr>
-                    <pic:cNvPr descr="figs/fig3_surface.png" id="40" name="Picture"/>
+                    <pic:cNvPr descr="figs/fig07_gis_surface.png" id="39" name="Picture"/>
                     <pic:cNvPicPr>
                       <a:picLocks noChangeArrowheads="1" noChangeAspect="1"/>
                     </pic:cNvPicPr>
                   </pic:nvPicPr>
                   <pic:blipFill>
-                    <a:blip r:embed="rId38"/>
+                    <a:blip r:embed="rId37"/>
                     <a:stretch>
                       <a:fillRect/>
                     </a:stretch>
@@ -1233,7 +923,7 @@
                   <pic:spPr bwMode="auto">
                     <a:xfrm>
                       <a:off x="0" y="0"/>
-                      <a:ext cx="5120640" cy="2810651"/>
+                      <a:ext cx="3840480" cy="3684994"/>
                     </a:xfrm>
                     <a:prstGeom prst="rect">
                       <a:avLst/>
@@ -1264,10 +954,7 @@
         <w:t xml:space="preserve">图 3</w:t>
       </w:r>
       <w:r>
-        <w:t xml:space="preserve"> </w:t>
-      </w:r>
-      <w:r>
-        <w:t xml:space="preserve">攻击面的静态上限（DGT 登记表，2026-09-27 快照）。(a) 认证可达面：3,053 个充电点接受 RFID；(b) 后台聚合的可控功率：按功率降序累积，约 5 家后台即达全网八成直流功率，全网上限 63.47 MW（直流 35.96 MW）。</w:t>
+        <w:t xml:space="preserve">（GIS）攻击面地图：多运营商设施的直流能力分布。红点为含 &gt;100 kW 直流的高价值目标，蓝圈为 71 个 AMB 网络站点。</w:t>
       </w:r>
     </w:p>
     <w:p>
@@ -1277,20 +964,20 @@
       <w:r>
         <w:drawing>
           <wp:inline>
-            <wp:extent cx="4800600" cy="2330756"/>
+            <wp:extent cx="3733800" cy="3568187"/>
             <wp:effectExtent b="0" l="0" r="0" t="0"/>
-            <wp:docPr descr="" title="" id="42" name="Picture"/>
+            <wp:docPr descr="" title="" id="41" name="Picture"/>
             <a:graphic>
               <a:graphicData uri="http://schemas.openxmlformats.org/drawingml/2006/picture">
                 <pic:pic>
                   <pic:nvPicPr>
-                    <pic:cNvPr descr="figs/fig4_blast.png" id="43" name="Picture"/>
+                    <pic:cNvPr descr="figs/fig12_gis_zones.png" id="42" name="Picture"/>
                     <pic:cNvPicPr>
                       <a:picLocks noChangeArrowheads="1" noChangeAspect="1"/>
                     </pic:cNvPicPr>
                   </pic:nvPicPr>
                   <pic:blipFill>
-                    <a:blip r:embed="rId41"/>
+                    <a:blip r:embed="rId40"/>
                     <a:stretch>
                       <a:fillRect/>
                     </a:stretch>
@@ -1298,7 +985,7 @@
                   <pic:spPr bwMode="auto">
                     <a:xfrm>
                       <a:off x="0" y="0"/>
-                      <a:ext cx="4800600" cy="2330756"/>
+                      <a:ext cx="3733800" cy="3568187"/>
                     </a:xfrm>
                     <a:prstGeom prst="rect">
                       <a:avLst/>
@@ -1329,21 +1016,17 @@
         <w:t xml:space="preserve">图 4</w:t>
       </w:r>
       <w:r>
-        <w:t xml:space="preserve"> </w:t>
-      </w:r>
-      <w:r>
-        <w:t xml:space="preserve">后台被攻破的爆炸半径：AMB 范围前 8 家运营商，单个 CSMS 被攻破时的可控额定功率（总/直流）及其充电点数与覆盖市镇数。</w:t>
-      </w:r>
-    </w:p>
-    <w:bookmarkEnd w:id="44"/>
-    <w:bookmarkEnd w:id="45"/>
-    <w:bookmarkStart w:id="55" w:name="防御检测与遏制"/>
-    <w:p>
-      <w:pPr>
-        <w:pStyle w:val="Heading1"/>
-      </w:pPr>
-      <w:r>
-        <w:t xml:space="preserve">5 防御：检测与遏制</w:t>
+        <w:t xml:space="preserve">（GIS）功能分区 × 直流部署 × 攻击价值。H3 功能分区为底色，直流桩按功率档着色，高价值直流集中于工业物流与走廊区。</w:t>
+      </w:r>
+    </w:p>
+    <w:bookmarkEnd w:id="43"/>
+    <w:bookmarkStart w:id="50" w:name="可控性度量与可达性"/>
+    <w:p>
+      <w:pPr>
+        <w:pStyle w:val="Heading2"/>
+      </w:pPr>
+      <w:r>
+        <w:t xml:space="preserve">4.2 可控性度量与可达性</w:t>
       </w:r>
     </w:p>
     <w:p>
@@ -1351,84 +1034,50 @@
         <w:pStyle w:val="FirstParagraph"/>
       </w:pPr>
       <w:r>
-        <w:t xml:space="preserve">与攻击侧一致，全部检测与遏制逻辑置于网络层与 CSMS，电网量仅作结果指标。仿真尚未执行，本节给出检测器构造、指标形式化与评估方案，不报告”测得”数值；基于真实数据可直接计算的量（如时间暴露）据实给出。</w:t>
-      </w:r>
-    </w:p>
-    <w:bookmarkStart w:id="46" w:name="检测后台侧"/>
-    <w:p>
-      <w:pPr>
-        <w:pStyle w:val="Heading2"/>
-      </w:pPr>
-      <w:r>
-        <w:t xml:space="preserve">5.1 检测（后台侧）</w:t>
-      </w:r>
-    </w:p>
-    <w:p>
-      <w:pPr>
-        <w:pStyle w:val="FirstParagraph"/>
-      </w:pPr>
-      <w:r>
-        <w:t xml:space="preserve">检测融合两路特征：传输层流量特征由 NFStream 从 OCPP/WebSocket 连接提取（包/字节速率、到达间隔、连接频繁建断、心跳节律），识别 DoS 洪泛与中间人痕迹；OCPP 消息层特征包括消息类型序列、远程控制指令下发节律、授权/重放模式与 MeterValues 内部一致性[20]。</w:t>
-      </w:r>
-    </w:p>
-    <w:p>
-      <w:pPr>
-        <w:pStyle w:val="BodyText"/>
-      </w:pPr>
-      <w:r>
-        <w:t xml:space="preserve">核心检测器把”规模×节律”分解转为</w:t>
+        <w:t xml:space="preserve">设攻击者位置</w:t>
+      </w:r>
+      <w:r>
+        <w:t xml:space="preserve"> </w:t>
+      </w:r>
+      <w:r>
+        <w:rPr>
+          <w:iCs/>
+          <w:i/>
+        </w:rPr>
+        <w:t xml:space="preserve">a</w:t>
+      </w:r>
+      <w:r>
+        <w:t xml:space="preserve">、安全配置</w:t>
+      </w:r>
+      <w:r>
+        <w:t xml:space="preserve"> </w:t>
+      </w:r>
+      <w:r>
+        <w:rPr>
+          <w:iCs/>
+          <w:i/>
+        </w:rPr>
+        <w:t xml:space="preserve">c</w:t>
+      </w:r>
+      <w:r>
+        <w:t xml:space="preserve">。定义</w:t>
       </w:r>
       <w:r>
         <w:rPr>
           <w:bCs/>
           <w:b/>
         </w:rPr>
-        <w:t xml:space="preserve">物理一致性检验</w:t>
-      </w:r>
-      <w:r>
-        <w:t xml:space="preserve">。站点</w:t>
-      </w:r>
-      <w:r>
-        <w:t xml:space="preserve"> </w:t>
-      </w:r>
-      <w:r>
-        <w:rPr>
-          <w:iCs/>
-          <w:i/>
-        </w:rPr>
-        <w:t xml:space="preserve">s</w:t>
-      </w:r>
-      <w:r>
-        <w:t xml:space="preserve"> </w:t>
-      </w:r>
-      <w:r>
-        <w:t xml:space="preserve">在时片</w:t>
-      </w:r>
-      <w:r>
-        <w:t xml:space="preserve"> </w:t>
-      </w:r>
-      <w:r>
-        <w:rPr>
-          <w:iCs/>
-          <w:i/>
-        </w:rPr>
-        <w:t xml:space="preserve">t</w:t>
-      </w:r>
-      <w:r>
-        <w:t xml:space="preserve"> </w:t>
-      </w:r>
-      <w:r>
-        <w:t xml:space="preserve">的期望电量</w:t>
-      </w:r>
-      <w:r>
-        <w:t xml:space="preserve"> </w:t>
-      </w:r>
-      <w:r>
-        <w:rPr>
-          <w:iCs/>
-          <w:i/>
-        </w:rPr>
-        <w:t xml:space="preserve">Ê</w:t>
+        <w:t xml:space="preserve">可达集</w:t>
+      </w:r>
+      <w:r>
+        <w:t xml:space="preserve"> </w:t>
+      </w:r>
+      <w:r>
+        <w:rPr>
+          <w:iCs/>
+          <w:i/>
+        </w:rPr>
+        <w:t xml:space="preserve">R</w:t>
       </w:r>
       <w:r>
         <w:t xml:space="preserve">(</w:t>
@@ -1438,7 +1087,7 @@
           <w:iCs/>
           <w:i/>
         </w:rPr>
-        <w:t xml:space="preserve">s</w:t>
+        <w:t xml:space="preserve">a</w:t>
       </w:r>
       <w:r>
         <w:t xml:space="preserve">,</w:t>
@@ -1448,231 +1097,119 @@
           <w:iCs/>
           <w:i/>
         </w:rPr>
-        <w:t xml:space="preserve">t</w:t>
-      </w:r>
-      <w:r>
-        <w:t xml:space="preserve">)=scale</w:t>
-      </w:r>
-      <w:r>
-        <w:rPr>
-          <w:vertAlign w:val="subscript"/>
-          <w:iCs/>
-          <w:i/>
-        </w:rPr>
-        <w:t xml:space="preserve">s</w:t>
-      </w:r>
-      <w:r>
-        <w:t xml:space="preserve">·ρ(</w:t>
-      </w:r>
-      <w:r>
-        <w:rPr>
-          <w:iCs/>
-          <w:i/>
-        </w:rPr>
-        <w:t xml:space="preserve">t</w:t>
-      </w:r>
-      <w:r>
-        <w:t xml:space="preserve">)·</w:t>
-      </w:r>
-      <w:r>
-        <w:rPr>
-          <w:iCs/>
-          <w:i/>
-        </w:rPr>
-        <w:t xml:space="preserve">g</w:t>
-      </w:r>
-      <w:r>
-        <w:t xml:space="preserve">(</w:t>
-      </w:r>
-      <w:r>
-        <w:rPr>
-          <w:iCs/>
-          <w:i/>
-        </w:rPr>
-        <w:t xml:space="preserve">s</w:t>
-      </w:r>
-      <w:r>
-        <w:t xml:space="preserve">,</w:t>
-      </w:r>
-      <w:r>
-        <w:rPr>
-          <w:iCs/>
-          <w:i/>
-        </w:rPr>
-        <w:t xml:space="preserve">d</w:t>
-      </w:r>
-      <w:r>
-        <w:t xml:space="preserve">)，其中 scale</w:t>
-      </w:r>
-      <w:r>
-        <w:rPr>
-          <w:vertAlign w:val="subscript"/>
-          <w:iCs/>
-          <w:i/>
-        </w:rPr>
-        <w:t xml:space="preserve">s</w:t>
-      </w:r>
-      <w:r>
-        <w:t xml:space="preserve"> </w:t>
-      </w:r>
-      <w:r>
-        <w:t xml:space="preserve">为站点规模、ρ(</w:t>
-      </w:r>
-      <w:r>
-        <w:rPr>
-          <w:iCs/>
-          <w:i/>
-        </w:rPr>
-        <w:t xml:space="preserve">t</w:t>
-      </w:r>
-      <w:r>
-        <w:t xml:space="preserve">) 为全网归一化日节律、</w:t>
-      </w:r>
-      <w:r>
-        <w:rPr>
-          <w:iCs/>
-          <w:i/>
-        </w:rPr>
-        <w:t xml:space="preserve">g</w:t>
-      </w:r>
-      <w:r>
-        <w:t xml:space="preserve">(</w:t>
-      </w:r>
-      <w:r>
-        <w:rPr>
-          <w:iCs/>
-          <w:i/>
-        </w:rPr>
-        <w:t xml:space="preserve">s</w:t>
-      </w:r>
-      <w:r>
-        <w:t xml:space="preserve">,</w:t>
-      </w:r>
-      <w:r>
-        <w:rPr>
-          <w:iCs/>
-          <w:i/>
-        </w:rPr>
-        <w:t xml:space="preserve">d</w:t>
-      </w:r>
-      <w:r>
-        <w:t xml:space="preserve">) 为逐日设施状态（如同站直流可用日会话为不可用日的 3.45 倍[11]）。以观测/期望比</w:t>
-      </w:r>
-      <w:r>
-        <w:t xml:space="preserve"> </w:t>
-      </w:r>
-      <w:r>
-        <w:rPr>
-          <w:iCs/>
-          <w:i/>
-        </w:rPr>
-        <w:t xml:space="preserve">r</w:t>
-      </w:r>
-      <w:r>
-        <w:t xml:space="preserve">(</w:t>
-      </w:r>
-      <w:r>
-        <w:rPr>
-          <w:iCs/>
-          <w:i/>
-        </w:rPr>
-        <w:t xml:space="preserve">s</w:t>
-      </w:r>
-      <w:r>
-        <w:t xml:space="preserve">,</w:t>
-      </w:r>
-      <w:r>
-        <w:rPr>
-          <w:iCs/>
-          <w:i/>
-        </w:rPr>
-        <w:t xml:space="preserve">t</w:t>
-      </w:r>
-      <w:r>
-        <w:t xml:space="preserve">)=</w:t>
-      </w:r>
-      <w:r>
-        <w:rPr>
-          <w:iCs/>
-          <w:i/>
-        </w:rPr>
-        <w:t xml:space="preserve">E</w:t>
-      </w:r>
-      <w:r>
-        <w:rPr>
-          <w:vertAlign w:val="subscript"/>
-        </w:rPr>
-        <w:t xml:space="preserve">obs</w:t>
-      </w:r>
-      <w:r>
-        <w:t xml:space="preserve">/</w:t>
-      </w:r>
-      <w:r>
-        <w:rPr>
-          <w:iCs/>
-          <w:i/>
-        </w:rPr>
-        <w:t xml:space="preserve">Ê</w:t>
-      </w:r>
-      <w:r>
-        <w:t xml:space="preserve"> </w:t>
-      </w:r>
-      <w:r>
-        <w:t xml:space="preserve">为判据：伪造电表读数或把功率推出”规模×当日节律”包络之外都会使</w:t>
-      </w:r>
-      <w:r>
-        <w:t xml:space="preserve"> </w:t>
-      </w:r>
-      <w:r>
-        <w:rPr>
-          <w:iCs/>
-          <w:i/>
-        </w:rPr>
-        <w:t xml:space="preserve">r</w:t>
-      </w:r>
-      <w:r>
-        <w:t xml:space="preserve"> </w:t>
-      </w:r>
-      <w:r>
-        <w:t xml:space="preserve">越过正常带。这相当于给攻击者施加物理合理性先验：要么把篡改压在站点自身历史包络内（自限损害），要么冒被检测的风险。图 6 在真实日序列上展示其行为——4-28 大停电使</w:t>
+        <w:t xml:space="preserve">c</w:t>
+      </w:r>
+      <w:r>
+        <w:t xml:space="preserve">) 为该位置、配置下可影响的充电点集合；在其上定义受控站点数</w:t>
+      </w:r>
+      <w:r>
+        <w:t xml:space="preserve"> </w:t>
+      </w:r>
+      <w:r>
+        <w:rPr>
+          <w:iCs/>
+          <w:i/>
+        </w:rPr>
+        <w:t xml:space="preserve">N</w:t>
+      </w:r>
+      <w:r>
+        <w:t xml:space="preserve">、</w:t>
       </w:r>
       <w:r>
         <w:rPr>
           <w:bCs/>
           <w:b/>
         </w:rPr>
-        <w:t xml:space="preserve">全网同步</w:t>
-      </w:r>
-      <w:r>
-        <w:t xml:space="preserve">跌至期望的 0.53（全站一致→判为良性、须白名单），而注入的伪造电表读数在</w:t>
+        <w:t xml:space="preserve">可控 MW</w:t>
+      </w:r>
+      <w:r>
+        <w:t xml:space="preserve"> </w:t>
+      </w:r>
+      <w:r>
+        <w:rPr>
+          <w:iCs/>
+          <w:i/>
+        </w:rPr>
+        <w:t xml:space="preserve">P</w:t>
+      </w:r>
+      <w:r>
+        <w:t xml:space="preserve">=Σ</w:t>
+      </w:r>
+      <w:r>
+        <w:rPr>
+          <w:iCs/>
+          <w:i/>
+        </w:rPr>
+        <w:t xml:space="preserve">P</w:t>
+      </w:r>
+      <w:r>
+        <w:rPr>
+          <w:vertAlign w:val="subscript"/>
+        </w:rPr>
+        <w:t xml:space="preserve">rated</w:t>
+      </w:r>
+      <w:r>
+        <w:t xml:space="preserve">、被拒会话数</w:t>
+      </w:r>
+      <w:r>
+        <w:t xml:space="preserve"> </w:t>
+      </w:r>
+      <w:r>
+        <w:rPr>
+          <w:iCs/>
+          <w:i/>
+        </w:rPr>
+        <w:t xml:space="preserve">D</w:t>
+      </w:r>
+      <w:r>
+        <w:t xml:space="preserve">、受影响市镇数</w:t>
+      </w:r>
+      <w:r>
+        <w:t xml:space="preserve"> </w:t>
+      </w:r>
+      <w:r>
+        <w:rPr>
+          <w:iCs/>
+          <w:i/>
+        </w:rPr>
+        <w:t xml:space="preserve">M</w:t>
+      </w:r>
+      <w:r>
+        <w:t xml:space="preserve"> </w:t>
+      </w:r>
+      <w:r>
+        <w:t xml:space="preserve">与计费偏差。可控 MW 的上限由登记表给定（图 5）：全体 ≤ 63.47 MW、直流 ≤ 35.96 MW（直流占总功率 56.7%）；按功率降序攻破约 5 家后台即达全网约八成直流功率。认证侧，3,053 个充电点（92.5%）接受 RFID、2,897 个（87.7%）为”rfid;apps”组合，使 B 类克隆现实可行。</w:t>
+      </w:r>
+    </w:p>
+    <w:p>
+      <w:pPr>
+        <w:pStyle w:val="BodyText"/>
+      </w:pPr>
+      <w:r>
+        <w:t xml:space="preserve">可达性是”位置×配置”的函数（图 6）：链路加密（wss/TLS、双向证书）可把中间人（A1）的可达功率从上限 63.47 MW 压到 0、把 RFID 克隆（A2）在 2.1 Plug&amp;Charge 下由 3,053 点压到约 305 点；但后台被攻破（A3）与连接层 DoS（A4）不依赖链路机密性，无论协议版本如何都可达目标运营商整支机队。这把[8]抽象的”受控比例</w:t>
+      </w:r>
+      <w:r>
+        <w:t xml:space="preserve"> </w:t>
+      </w:r>
+      <w:r>
+        <w:rPr>
+          <w:iCs/>
+          <w:i/>
+        </w:rPr>
+        <w:t xml:space="preserve">p</w:t>
+      </w:r>
+      <w:r>
+        <w:t xml:space="preserve">”翻译成了”需攻破几家后台、以何种配置、可达多少 MW”的网络层问题。须强调可控 MW 是</w:t>
       </w:r>
       <w:r>
         <w:rPr>
           <w:bCs/>
           <w:b/>
         </w:rPr>
-        <w:t xml:space="preserve">单站</w:t>
-      </w:r>
-      <w:r>
-        <w:t xml:space="preserve">使比值冲高越过上带（告警）；二者的区分正来自”规模×节律”的联合期望。跨运营商联邦检测使各运营商日志本地化、仅共享模型参数与异常统计[10,21]，契合 AMB 真实的多运营商结构。所有检测器须通过第 3.3 节三类真实异常的假阳性考验并单独报告误报率。</w:t>
-      </w:r>
-    </w:p>
-    <w:bookmarkEnd w:id="46"/>
-    <w:bookmarkStart w:id="50" w:name="遏制与时间暴露"/>
-    <w:p>
-      <w:pPr>
-        <w:pStyle w:val="Heading2"/>
-      </w:pPr>
-      <w:r>
-        <w:t xml:space="preserve">5.2 遏制与时间暴露</w:t>
-      </w:r>
-    </w:p>
-    <w:p>
-      <w:pPr>
-        <w:pStyle w:val="FirstParagraph"/>
-      </w:pPr>
-      <w:r>
-        <w:t xml:space="preserve">遏制手段建模为情景变量：加密与认证等级（OCPP 安全配置档）；远程功率/停充指令限速（据[8]限速有效）；按运营商或区域隔离；跨运营商联邦检测作前置。防御的紧迫性取决于真实流量的时间暴露（图 5）：工作日会话到达在 18 时达日均的 2.0 倍，45.4% 的会话在 12–19 时开始；因此对 AMB 网络（Iberdrola 后台）的一次拒绝服务，其被拒会话数强烈依赖攻击时刻——中断 3 小时在傍晚最多拒绝约 89 次/日会话，而深夜不足其 1/4。这说明”被发现前的损失”不仅取决于遏制速度，也取决于攻击落在节律的哪一段。</w:t>
+        <w:t xml:space="preserve">上限/恒等式</w:t>
+      </w:r>
+      <w:r>
+        <w:t xml:space="preserve">意义的量，并非电网后果（图 19）。</w:t>
       </w:r>
     </w:p>
     <w:p>
@@ -1682,20 +1219,20 @@
       <w:r>
         <w:drawing>
           <wp:inline>
-            <wp:extent cx="5120640" cy="2964021"/>
+            <wp:extent cx="4907280" cy="2693540"/>
             <wp:effectExtent b="0" l="0" r="0" t="0"/>
-            <wp:docPr descr="" title="" id="48" name="Picture"/>
+            <wp:docPr descr="" title="" id="45" name="Picture"/>
             <a:graphic>
               <a:graphicData uri="http://schemas.openxmlformats.org/drawingml/2006/picture">
                 <pic:pic>
                   <pic:nvPicPr>
-                    <pic:cNvPr descr="figs/fig5_temporal.png" id="49" name="Picture"/>
+                    <pic:cNvPr descr="figs/fig3_surface.png" id="46" name="Picture"/>
                     <pic:cNvPicPr>
                       <a:picLocks noChangeArrowheads="1" noChangeAspect="1"/>
                     </pic:cNvPicPr>
                   </pic:nvPicPr>
                   <pic:blipFill>
-                    <a:blip r:embed="rId47"/>
+                    <a:blip r:embed="rId44"/>
                     <a:stretch>
                       <a:fillRect/>
                     </a:stretch>
@@ -1703,7 +1240,7 @@
                   <pic:spPr bwMode="auto">
                     <a:xfrm>
                       <a:off x="0" y="0"/>
-                      <a:ext cx="5120640" cy="2964021"/>
+                      <a:ext cx="4907280" cy="2693540"/>
                     </a:xfrm>
                     <a:prstGeom prst="rect">
                       <a:avLst/>
@@ -1737,25 +1274,7 @@
         <w:t xml:space="preserve"> </w:t>
       </w:r>
       <w:r>
-        <w:t xml:space="preserve">真实充电流量下的时间暴露（AMB 网络 2025 全年会话）。(a) 工作日/周末到达节律，工作日傍晚峰为日均 2.0 倍；(b) 后台中断 1/3 小时在不同起始时刻的被拒会话数。</w:t>
-      </w:r>
-    </w:p>
-    <w:bookmarkEnd w:id="50"/>
-    <w:bookmarkStart w:id="54" w:name="评价主指标"/>
-    <w:p>
-      <w:pPr>
-        <w:pStyle w:val="Heading2"/>
-      </w:pPr>
-      <w:r>
-        <w:t xml:space="preserve">5.3 评价主指标</w:t>
-      </w:r>
-    </w:p>
-    <w:p>
-      <w:pPr>
-        <w:pStyle w:val="FirstParagraph"/>
-      </w:pPr>
-      <w:r>
-        <w:t xml:space="preserve">主指标为”被发现前造成的损失”而非仅 AUC：累计受控电量（MWh，受控功率上限为登记表额定功率的函数）、被拒会话数（按真实会话流量折算）、受影响市镇数（AMB 网络覆盖 33 个市镇）。定义检测时延为攻击注入到首次正确告警的时间，损失即检测时延沿攻击功率曲线的积分。三量全部可在 H3 功能分区与站点图层上随时间轴回放（第 7 节），使”被发现前的损失”既是数值指标也是可视化的攻防时间线。</w:t>
+        <w:t xml:space="preserve">攻击面的静态上限（DGT 登记表）。(a) 认证可达面：3,053 点接受 RFID；(b) 后台聚合的可控功率：约 5 家后台即达全网八成直流功率，全网上限 63.47 MW。</w:t>
       </w:r>
     </w:p>
     <w:p>
@@ -1765,20 +1284,20 @@
       <w:r>
         <w:drawing>
           <wp:inline>
-            <wp:extent cx="4907280" cy="3058304"/>
+            <wp:extent cx="4907280" cy="2169003"/>
             <wp:effectExtent b="0" l="0" r="0" t="0"/>
-            <wp:docPr descr="" title="" id="52" name="Picture"/>
+            <wp:docPr descr="" title="" id="48" name="Picture"/>
             <a:graphic>
               <a:graphicData uri="http://schemas.openxmlformats.org/drawingml/2006/picture">
                 <pic:pic>
                   <pic:nvPicPr>
-                    <pic:cNvPr descr="figs/fig6_detector.png" id="53" name="Picture"/>
+                    <pic:cNvPr descr="figs/fig13_reach.png" id="49" name="Picture"/>
                     <pic:cNvPicPr>
                       <a:picLocks noChangeArrowheads="1" noChangeAspect="1"/>
                     </pic:cNvPicPr>
                   </pic:nvPicPr>
                   <pic:blipFill>
-                    <a:blip r:embed="rId51"/>
+                    <a:blip r:embed="rId47"/>
                     <a:stretch>
                       <a:fillRect/>
                     </a:stretch>
@@ -1786,7 +1305,7 @@
                   <pic:spPr bwMode="auto">
                     <a:xfrm>
                       <a:off x="0" y="0"/>
-                      <a:ext cx="4907280" cy="3058304"/>
+                      <a:ext cx="4907280" cy="2169003"/>
                     </a:xfrm>
                     <a:prstGeom prst="rect">
                       <a:avLst/>
@@ -1820,18 +1339,17 @@
         <w:t xml:space="preserve"> </w:t>
       </w:r>
       <w:r>
-        <w:t xml:space="preserve">物理一致性检测器在真实日序列上的行为。上：全网日会话数与”规模×节律”28 日稳健基线（基线随全年增长上升，会话 1 月 9,578 次→12 月 14,330 次）；下：观测/期望一致性比，4-28 大停电全网同步跌至 0.53（良性）、注入的伪造电表读数单站冲高越过上带（告警）。</w:t>
-      </w:r>
-    </w:p>
-    <w:bookmarkEnd w:id="54"/>
-    <w:bookmarkEnd w:id="55"/>
-    <w:bookmarkStart w:id="58" w:name="实验设计与评估"/>
-    <w:p>
-      <w:pPr>
-        <w:pStyle w:val="Heading1"/>
-      </w:pPr>
-      <w:r>
-        <w:t xml:space="preserve">6 实验设计与评估</w:t>
+        <w:t xml:space="preserve">可达性上界模型：攻击者位置 × OCPP 安全配置。加密压制 A1/A2，但对 A3（后台攻陷）与 A4（DoS）无效。</w:t>
+      </w:r>
+    </w:p>
+    <w:bookmarkEnd w:id="50"/>
+    <w:bookmarkStart w:id="60" w:name="爆炸半径与集中度"/>
+    <w:p>
+      <w:pPr>
+        <w:pStyle w:val="Heading2"/>
+      </w:pPr>
+      <w:r>
+        <w:t xml:space="preserve">4.3 爆炸半径与集中度</w:t>
       </w:r>
     </w:p>
     <w:p>
@@ -1839,225 +1357,119 @@
         <w:pStyle w:val="FirstParagraph"/>
       </w:pPr>
       <w:r>
-        <w:t xml:space="preserve">仿真尚未执行，本节给出测量计划与指标定义；涉及结果处仅陈述评价框架与标注为”示意”的定性方向。</w:t>
-      </w:r>
-    </w:p>
-    <w:bookmarkStart w:id="56" w:name="场景矩阵与指标"/>
-    <w:p>
-      <w:pPr>
-        <w:pStyle w:val="Heading2"/>
-      </w:pPr>
-      <w:r>
-        <w:t xml:space="preserve">6.1 场景矩阵与指标</w:t>
-      </w:r>
-    </w:p>
-    <w:p>
-      <w:pPr>
-        <w:pStyle w:val="FirstParagraph"/>
-      </w:pPr>
-      <w:r>
-        <w:t xml:space="preserve">实验在四维笛卡尔积上展开（完整取值见附录 B）：攻击者位置</w:t>
-      </w:r>
-      <w:r>
-        <w:t xml:space="preserve"> </w:t>
-      </w:r>
-      <w:r>
-        <w:rPr>
-          <w:iCs/>
-          <w:i/>
-        </w:rPr>
-        <w:t xml:space="preserve">A</w:t>
-      </w:r>
-      <w:r>
-        <w:t xml:space="preserve">∈{A1–A4}；OCPP 版本与安全配置</w:t>
-      </w:r>
-      <w:r>
-        <w:t xml:space="preserve"> </w:t>
-      </w:r>
-      <w:r>
-        <w:rPr>
-          <w:iCs/>
-          <w:i/>
-        </w:rPr>
-        <w:t xml:space="preserve">V</w:t>
-      </w:r>
-      <w:r>
-        <w:t xml:space="preserve">∈{1.6；2.0.1 档 1/2/3；2.1}；防御配置</w:t>
-      </w:r>
-      <w:r>
-        <w:t xml:space="preserve"> </w:t>
-      </w:r>
-      <w:r>
-        <w:rPr>
-          <w:iCs/>
-          <w:i/>
-        </w:rPr>
-        <w:t xml:space="preserve">D</w:t>
-      </w:r>
-      <w:r>
-        <w:t xml:space="preserve">∈{无防御、链路加密与双向认证、指令限速、运营商/区域隔离、联邦检测、规模×节律一致性检测}（单独与组合）；攻击规模与协同度</w:t>
-      </w:r>
-      <w:r>
-        <w:t xml:space="preserve"> </w:t>
-      </w:r>
-      <w:r>
-        <w:rPr>
-          <w:iCs/>
-          <w:i/>
-        </w:rPr>
-        <w:t xml:space="preserve">C</w:t>
-      </w:r>
-      <w:r>
-        <w:t xml:space="preserve">（单站/单运营商/跨运营商、随机/择直流高功率、独立/时间同步）。设攻击在</w:t>
-      </w:r>
-      <w:r>
-        <w:t xml:space="preserve"> </w:t>
-      </w:r>
-      <w:r>
-        <w:rPr>
-          <w:iCs/>
-          <w:i/>
-        </w:rPr>
-        <w:t xml:space="preserve">t</w:t>
-      </w:r>
-      <w:r>
-        <w:t xml:space="preserve">₀ 注入首条恶意消息、</w:t>
-      </w:r>
-      <w:r>
-        <w:rPr>
-          <w:iCs/>
-          <w:i/>
-        </w:rPr>
-        <w:t xml:space="preserve">t_d</w:t>
-      </w:r>
-      <w:r>
-        <w:t xml:space="preserve"> </w:t>
-      </w:r>
-      <w:r>
-        <w:t xml:space="preserve">为首个可归因真阳性告警、</w:t>
-      </w:r>
-      <w:r>
-        <w:rPr>
-          <w:iCs/>
-          <w:i/>
-        </w:rPr>
-        <w:t xml:space="preserve">t_c</w:t>
-      </w:r>
-      <w:r>
-        <w:t xml:space="preserve"> </w:t>
-      </w:r>
-      <w:r>
-        <w:t xml:space="preserve">为遏制使受控量降至阈值。度量：检测时延 τ_d=</w:t>
-      </w:r>
-      <w:r>
-        <w:rPr>
-          <w:iCs/>
-          <w:i/>
-        </w:rPr>
-        <w:t xml:space="preserve">t_d</w:t>
-      </w:r>
-      <w:r>
-        <w:t xml:space="preserve">−</w:t>
-      </w:r>
-      <w:r>
-        <w:rPr>
-          <w:iCs/>
-          <w:i/>
-        </w:rPr>
-        <w:t xml:space="preserve">t</w:t>
-      </w:r>
-      <w:r>
-        <w:t xml:space="preserve">₀、遏制时间 τ_c=</w:t>
-      </w:r>
-      <w:r>
-        <w:rPr>
-          <w:iCs/>
-          <w:i/>
-        </w:rPr>
-        <w:t xml:space="preserve">t_c</w:t>
-      </w:r>
-      <w:r>
-        <w:t xml:space="preserve">−</w:t>
-      </w:r>
-      <w:r>
-        <w:rPr>
-          <w:iCs/>
-          <w:i/>
-        </w:rPr>
-        <w:t xml:space="preserve">t_d</w:t>
-      </w:r>
-      <w:r>
-        <w:t xml:space="preserve">；残余损失（</w:t>
-      </w:r>
-      <w:r>
-        <w:rPr>
-          <w:iCs/>
-          <w:i/>
-        </w:rPr>
-        <w:t xml:space="preserve">t</w:t>
-      </w:r>
-      <w:r>
-        <w:t xml:space="preserve">₀–</w:t>
-      </w:r>
-      <w:r>
-        <w:rPr>
-          <w:iCs/>
-          <w:i/>
-        </w:rPr>
-        <w:t xml:space="preserve">t_c</w:t>
-      </w:r>
-      <w:r>
-        <w:t xml:space="preserve"> </w:t>
-      </w:r>
-      <w:r>
-        <w:t xml:space="preserve">窗口）被操纵电量 ΔE、被拒会话 N_rej、受影响市镇 |M|；计费偏差 Δ€ 与偷电量；误报率 FPR（指标形式化见附录 C）。</w:t>
-      </w:r>
-    </w:p>
-    <w:bookmarkEnd w:id="56"/>
-    <w:bookmarkStart w:id="57" w:name="基线消融与统计"/>
-    <w:p>
-      <w:pPr>
-        <w:pStyle w:val="Heading2"/>
-      </w:pPr>
-      <w:r>
-        <w:t xml:space="preserve">6.2 基线、消融与统计</w:t>
-      </w:r>
-    </w:p>
-    <w:p>
-      <w:pPr>
-        <w:pStyle w:val="FirstParagraph"/>
-      </w:pPr>
-      <w:r>
-        <w:t xml:space="preserve">基线取无防御给出损失上界；逐一启用各遏制手段再评估组合栈。平行对比在实验室脚本流量[9,10]上标定的检测器与在本文真实背景流量上标定者，二者差距即本文待验证的核心贡献。真实异常套件充当”闸门”：任一配置须在三类真实异常上将误报率控制在上限 α 内，否则不计入主比较。预期方向（示意、不附数值）：链路加密使中间人类（A1）可控 MW 趋近零而对后台被攻破（A3）无效；指令限速主要压低 A3 的峰值可控 MW 与遏制时间（图 A1 的分析模型表明，隔离加限速可把 30 分钟时延内的可达功率从数十 MW 压到数 MW）；物理一致性检测对伪造电表/偷电检测较快、对纯 DoS 较弱；联邦检测缩短协同攻击检测时延但以更高误报与数据共享成本为代价。每个场景格重复运行，报告中位数与 95% 自助置信区间，配对比较采用共同随机数，全部种子与配置入库以保证可复现。</w:t>
-      </w:r>
-    </w:p>
-    <w:bookmarkEnd w:id="57"/>
-    <w:bookmarkEnd w:id="58"/>
-    <w:bookmarkStart w:id="59" w:name="地图可视化与工具链"/>
-    <w:p>
-      <w:pPr>
-        <w:pStyle w:val="Heading1"/>
-      </w:pPr>
-      <w:r>
-        <w:t xml:space="preserve">7 地图可视化与工具链</w:t>
-      </w:r>
-    </w:p>
-    <w:p>
-      <w:pPr>
-        <w:pStyle w:val="FirstParagraph"/>
+        <w:t xml:space="preserve">后台被攻破的后果取决于该后台机队的规模与地理覆盖。攻破单家后台可控 2.6–12.3 MW（图 7）：Endesa X Way 12.33 MW、Iberdrola Clientes 9.75 MW（AMB 网络所属后台）、BSM 8.67 MW。但地理爆炸半径差异巨大（图 8）：Endesa 覆盖 18 个市镇、Iberdrola 覆盖 31 个市镇（最广）、而 BSM 虽功率相当却集中在市中心 2 个市镇。可控功率在运营商间高度集中（图 9，Gini 0.70）：前 10 家后台即聚合约 80% 的额定功率，意味着少数后台的安全态势决定了全网的可操纵规模。</w:t>
+      </w:r>
+    </w:p>
+    <w:p>
+      <w:pPr>
+        <w:pStyle w:val="BodyText"/>
+      </w:pPr>
+      <w:r>
+        <w:drawing>
+          <wp:inline>
+            <wp:extent cx="4480560" cy="2175372"/>
+            <wp:effectExtent b="0" l="0" r="0" t="0"/>
+            <wp:docPr descr="" title="" id="52" name="Picture"/>
+            <a:graphic>
+              <a:graphicData uri="http://schemas.openxmlformats.org/drawingml/2006/picture">
+                <pic:pic>
+                  <pic:nvPicPr>
+                    <pic:cNvPr descr="figs/fig4_blast.png" id="53" name="Picture"/>
+                    <pic:cNvPicPr>
+                      <a:picLocks noChangeArrowheads="1" noChangeAspect="1"/>
+                    </pic:cNvPicPr>
+                  </pic:nvPicPr>
+                  <pic:blipFill>
+                    <a:blip r:embed="rId51"/>
+                    <a:stretch>
+                      <a:fillRect/>
+                    </a:stretch>
+                  </pic:blipFill>
+                  <pic:spPr bwMode="auto">
+                    <a:xfrm>
+                      <a:off x="0" y="0"/>
+                      <a:ext cx="4480560" cy="2175372"/>
+                    </a:xfrm>
+                    <a:prstGeom prst="rect">
+                      <a:avLst/>
+                    </a:prstGeom>
+                    <a:noFill/>
+                    <a:ln w="9525">
+                      <a:noFill/>
+                      <a:headEnd/>
+                      <a:tailEnd/>
+                    </a:ln>
+                  </pic:spPr>
+                </pic:pic>
+              </a:graphicData>
+            </a:graphic>
+          </wp:inline>
+        </w:drawing>
+      </w:r>
+    </w:p>
+    <w:p>
+      <w:pPr>
+        <w:pStyle w:val="BodyText"/>
       </w:pPr>
       <w:r>
         <w:rPr>
           <w:bCs/>
           <w:b/>
         </w:rPr>
-        <w:t xml:space="preserve">地图。</w:t>
-      </w:r>
-      <w:r>
-        <w:t xml:space="preserve"> </w:t>
-      </w:r>
-      <w:r>
-        <w:t xml:space="preserve">底图复用[11]已建成的图层：基于 Uber H3 分辨率 8 的 894 个网格（414 个建成区）构成的功能分区，与 621 个站点的点图层（图 1）；站点按运营商着色并连向各自 CSMS，直接呈现”攻击面随后台归属而分割”的核心结构。其上叠加两类动态内容：时间轴回放（被控站点点亮、功率曲线、检测触发时刻、隔离后恢复，与第 6 节”被发现前时窗”一一对应），以及结果图层（受控 MW 热力、受影响市镇高亮、被拒会话聚集）。受控功率上限是登记表额定功率的函数，故热力层在仿真执行前即给出静态上界，仿真结果只在此上界内取值。</w:t>
+        <w:t xml:space="preserve">图 7</w:t>
+      </w:r>
+      <w:r>
+        <w:t xml:space="preserve"> </w:t>
+      </w:r>
+      <w:r>
+        <w:t xml:space="preserve">后台被攻破的爆炸半径（前 8 家运营商）：单个 CSMS 被攻破时的可控额定功率（总/直流）及其充电点数与覆盖市镇数。</w:t>
+      </w:r>
+    </w:p>
+    <w:p>
+      <w:pPr>
+        <w:pStyle w:val="BodyText"/>
+      </w:pPr>
+      <w:r>
+        <w:drawing>
+          <wp:inline>
+            <wp:extent cx="5227320" cy="2090128"/>
+            <wp:effectExtent b="0" l="0" r="0" t="0"/>
+            <wp:docPr descr="" title="" id="55" name="Picture"/>
+            <a:graphic>
+              <a:graphicData uri="http://schemas.openxmlformats.org/drawingml/2006/picture">
+                <pic:pic>
+                  <pic:nvPicPr>
+                    <pic:cNvPr descr="figs/fig08_gis_blast.png" id="56" name="Picture"/>
+                    <pic:cNvPicPr>
+                      <a:picLocks noChangeArrowheads="1" noChangeAspect="1"/>
+                    </pic:cNvPicPr>
+                  </pic:nvPicPr>
+                  <pic:blipFill>
+                    <a:blip r:embed="rId54"/>
+                    <a:stretch>
+                      <a:fillRect/>
+                    </a:stretch>
+                  </pic:blipFill>
+                  <pic:spPr bwMode="auto">
+                    <a:xfrm>
+                      <a:off x="0" y="0"/>
+                      <a:ext cx="5227320" cy="2090128"/>
+                    </a:xfrm>
+                    <a:prstGeom prst="rect">
+                      <a:avLst/>
+                    </a:prstGeom>
+                    <a:noFill/>
+                    <a:ln w="9525">
+                      <a:noFill/>
+                      <a:headEnd/>
+                      <a:tailEnd/>
+                    </a:ln>
+                  </pic:spPr>
+                </pic:pic>
+              </a:graphicData>
+            </a:graphic>
+          </wp:inline>
+        </w:drawing>
       </w:r>
     </w:p>
     <w:p>
@@ -2069,13 +1481,1199 @@
           <w:bCs/>
           <w:b/>
         </w:rPr>
-        <w:t xml:space="preserve">工具链。</w:t>
-      </w:r>
-      <w:r>
-        <w:t xml:space="preserve"> </w:t>
-      </w:r>
-      <w:r>
-        <w:t xml:space="preserve">每个充电桩由 Python</w:t>
+        <w:t xml:space="preserve">图 8</w:t>
+      </w:r>
+      <w:r>
+        <w:t xml:space="preserve">（GIS）后台沦陷的地理爆炸半径。红色为受影响市镇与该运营商站点；三家功率相近的后台，地理覆盖面从 2 个到 31 个市镇不等。</w:t>
+      </w:r>
+    </w:p>
+    <w:p>
+      <w:pPr>
+        <w:pStyle w:val="BodyText"/>
+      </w:pPr>
+      <w:r>
+        <w:drawing>
+          <wp:inline>
+            <wp:extent cx="4907280" cy="2314754"/>
+            <wp:effectExtent b="0" l="0" r="0" t="0"/>
+            <wp:docPr descr="" title="" id="58" name="Picture"/>
+            <a:graphic>
+              <a:graphicData uri="http://schemas.openxmlformats.org/drawingml/2006/picture">
+                <pic:pic>
+                  <pic:nvPicPr>
+                    <pic:cNvPr descr="figs/fig19_lorenz.png" id="59" name="Picture"/>
+                    <pic:cNvPicPr>
+                      <a:picLocks noChangeArrowheads="1" noChangeAspect="1"/>
+                    </pic:cNvPicPr>
+                  </pic:nvPicPr>
+                  <pic:blipFill>
+                    <a:blip r:embed="rId57"/>
+                    <a:stretch>
+                      <a:fillRect/>
+                    </a:stretch>
+                  </pic:blipFill>
+                  <pic:spPr bwMode="auto">
+                    <a:xfrm>
+                      <a:off x="0" y="0"/>
+                      <a:ext cx="4907280" cy="2314754"/>
+                    </a:xfrm>
+                    <a:prstGeom prst="rect">
+                      <a:avLst/>
+                    </a:prstGeom>
+                    <a:noFill/>
+                    <a:ln w="9525">
+                      <a:noFill/>
+                      <a:headEnd/>
+                      <a:tailEnd/>
+                    </a:ln>
+                  </pic:spPr>
+                </pic:pic>
+              </a:graphicData>
+            </a:graphic>
+          </wp:inline>
+        </w:drawing>
+      </w:r>
+    </w:p>
+    <w:p>
+      <w:pPr>
+        <w:pStyle w:val="BodyText"/>
+      </w:pPr>
+      <w:r>
+        <w:rPr>
+          <w:bCs/>
+          <w:b/>
+        </w:rPr>
+        <w:t xml:space="preserve">图 9</w:t>
+      </w:r>
+      <w:r>
+        <w:t xml:space="preserve"> </w:t>
+      </w:r>
+      <w:r>
+        <w:t xml:space="preserve">可控功率的运营商集中度。(a) 前 10 家后台≈80% 功率；(b) 洛伦兹曲线，Gini 0.70。</w:t>
+      </w:r>
+    </w:p>
+    <w:bookmarkEnd w:id="60"/>
+    <w:bookmarkEnd w:id="61"/>
+    <w:bookmarkStart w:id="77" w:name="防御检测与遏制"/>
+    <w:p>
+      <w:pPr>
+        <w:pStyle w:val="Heading1"/>
+      </w:pPr>
+      <w:r>
+        <w:t xml:space="preserve">5 防御：检测与遏制</w:t>
+      </w:r>
+    </w:p>
+    <w:p>
+      <w:pPr>
+        <w:pStyle w:val="FirstParagraph"/>
+      </w:pPr>
+      <w:r>
+        <w:t xml:space="preserve">与攻击侧一致，全部检测与遏制逻辑置于网络层与 CSMS，电网量仅作结果指标。仿真尚未执行，本节给出检测器构造、指标形式化与评估方案，不报告”测得”数值；基于真实数据可直接计算的量（如时间暴露）据实给出。</w:t>
+      </w:r>
+    </w:p>
+    <w:bookmarkStart w:id="71" w:name="时间暴露与-dos-的时空分布"/>
+    <w:p>
+      <w:pPr>
+        <w:pStyle w:val="Heading2"/>
+      </w:pPr>
+      <w:r>
+        <w:t xml:space="preserve">5.1 时间暴露与 DoS 的时空分布</w:t>
+      </w:r>
+    </w:p>
+    <w:p>
+      <w:pPr>
+        <w:pStyle w:val="FirstParagraph"/>
+      </w:pPr>
+      <w:r>
+        <w:t xml:space="preserve">防御的紧迫性取决于真实流量的时间暴露（图 10、图 11）。工作日会话到达在 18 时达日均 2.0 倍，45.4% 的会话在 12–19 时开始（图 10a、图 11）；因此对 AMB 网络（Iberdrola 后台）的一次拒绝服务，被拒会话强烈依赖攻击时刻——中断 3 小时在傍晚最多拒绝约 89 次/日会话，深夜不足其 1/4（图 10b）。把该时间维投影到地理上（图 12），傍晚后台中断的被拒会话集中在机场物流区与若干高需求市镇。这说明”被发现前的损失”不仅取决于遏制速度，也取决于攻击落在节律与地理的哪一段。</w:t>
+      </w:r>
+    </w:p>
+    <w:p>
+      <w:pPr>
+        <w:pStyle w:val="BodyText"/>
+      </w:pPr>
+      <w:r>
+        <w:drawing>
+          <wp:inline>
+            <wp:extent cx="4907280" cy="2840520"/>
+            <wp:effectExtent b="0" l="0" r="0" t="0"/>
+            <wp:docPr descr="" title="" id="63" name="Picture"/>
+            <a:graphic>
+              <a:graphicData uri="http://schemas.openxmlformats.org/drawingml/2006/picture">
+                <pic:pic>
+                  <pic:nvPicPr>
+                    <pic:cNvPr descr="figs/fig5_temporal.png" id="64" name="Picture"/>
+                    <pic:cNvPicPr>
+                      <a:picLocks noChangeArrowheads="1" noChangeAspect="1"/>
+                    </pic:cNvPicPr>
+                  </pic:nvPicPr>
+                  <pic:blipFill>
+                    <a:blip r:embed="rId62"/>
+                    <a:stretch>
+                      <a:fillRect/>
+                    </a:stretch>
+                  </pic:blipFill>
+                  <pic:spPr bwMode="auto">
+                    <a:xfrm>
+                      <a:off x="0" y="0"/>
+                      <a:ext cx="4907280" cy="2840520"/>
+                    </a:xfrm>
+                    <a:prstGeom prst="rect">
+                      <a:avLst/>
+                    </a:prstGeom>
+                    <a:noFill/>
+                    <a:ln w="9525">
+                      <a:noFill/>
+                      <a:headEnd/>
+                      <a:tailEnd/>
+                    </a:ln>
+                  </pic:spPr>
+                </pic:pic>
+              </a:graphicData>
+            </a:graphic>
+          </wp:inline>
+        </w:drawing>
+      </w:r>
+    </w:p>
+    <w:p>
+      <w:pPr>
+        <w:pStyle w:val="BodyText"/>
+      </w:pPr>
+      <w:r>
+        <w:rPr>
+          <w:bCs/>
+          <w:b/>
+        </w:rPr>
+        <w:t xml:space="preserve">图 10</w:t>
+      </w:r>
+      <w:r>
+        <w:t xml:space="preserve"> </w:t>
+      </w:r>
+      <w:r>
+        <w:t xml:space="preserve">时间暴露（AMB 网络 2025 全年会话）。(a) 工作日/周末到达节律；(b) 后台中断 1/3 小时在不同起始时刻的被拒会话数。</w:t>
+      </w:r>
+    </w:p>
+    <w:p>
+      <w:pPr>
+        <w:pStyle w:val="BodyText"/>
+      </w:pPr>
+      <w:r>
+        <w:drawing>
+          <wp:inline>
+            <wp:extent cx="5013960" cy="2264938"/>
+            <wp:effectExtent b="0" l="0" r="0" t="0"/>
+            <wp:docPr descr="" title="" id="66" name="Picture"/>
+            <a:graphic>
+              <a:graphicData uri="http://schemas.openxmlformats.org/drawingml/2006/picture">
+                <pic:pic>
+                  <pic:nvPicPr>
+                    <pic:cNvPr descr="figs/fig14_arrival.png" id="67" name="Picture"/>
+                    <pic:cNvPicPr>
+                      <a:picLocks noChangeArrowheads="1" noChangeAspect="1"/>
+                    </pic:cNvPicPr>
+                  </pic:nvPicPr>
+                  <pic:blipFill>
+                    <a:blip r:embed="rId65"/>
+                    <a:stretch>
+                      <a:fillRect/>
+                    </a:stretch>
+                  </pic:blipFill>
+                  <pic:spPr bwMode="auto">
+                    <a:xfrm>
+                      <a:off x="0" y="0"/>
+                      <a:ext cx="5013960" cy="2264938"/>
+                    </a:xfrm>
+                    <a:prstGeom prst="rect">
+                      <a:avLst/>
+                    </a:prstGeom>
+                    <a:noFill/>
+                    <a:ln w="9525">
+                      <a:noFill/>
+                      <a:headEnd/>
+                      <a:tailEnd/>
+                    </a:ln>
+                  </pic:spPr>
+                </pic:pic>
+              </a:graphicData>
+            </a:graphic>
+          </wp:inline>
+        </w:drawing>
+      </w:r>
+    </w:p>
+    <w:p>
+      <w:pPr>
+        <w:pStyle w:val="BodyText"/>
+      </w:pPr>
+      <w:r>
+        <w:rPr>
+          <w:bCs/>
+          <w:b/>
+        </w:rPr>
+        <w:t xml:space="preserve">图 11</w:t>
+      </w:r>
+      <w:r>
+        <w:t xml:space="preserve"> </w:t>
+      </w:r>
+      <w:r>
+        <w:t xml:space="preserve">真实充电到达的时间结构。(a) 星期×小时；(b) 月份×小时。工作日傍晚与全年增长清晰可见，是 DoS 时窗与检测基线的依据。</w:t>
+      </w:r>
+    </w:p>
+    <w:p>
+      <w:pPr>
+        <w:pStyle w:val="BodyText"/>
+      </w:pPr>
+      <w:r>
+        <w:drawing>
+          <wp:inline>
+            <wp:extent cx="3520440" cy="2962169"/>
+            <wp:effectExtent b="0" l="0" r="0" t="0"/>
+            <wp:docPr descr="" title="" id="69" name="Picture"/>
+            <a:graphic>
+              <a:graphicData uri="http://schemas.openxmlformats.org/drawingml/2006/picture">
+                <pic:pic>
+                  <pic:nvPicPr>
+                    <pic:cNvPr descr="figs/fig10_gis_dos.png" id="70" name="Picture"/>
+                    <pic:cNvPicPr>
+                      <a:picLocks noChangeArrowheads="1" noChangeAspect="1"/>
+                    </pic:cNvPicPr>
+                  </pic:nvPicPr>
+                  <pic:blipFill>
+                    <a:blip r:embed="rId68"/>
+                    <a:stretch>
+                      <a:fillRect/>
+                    </a:stretch>
+                  </pic:blipFill>
+                  <pic:spPr bwMode="auto">
+                    <a:xfrm>
+                      <a:off x="0" y="0"/>
+                      <a:ext cx="3520440" cy="2962169"/>
+                    </a:xfrm>
+                    <a:prstGeom prst="rect">
+                      <a:avLst/>
+                    </a:prstGeom>
+                    <a:noFill/>
+                    <a:ln w="9525">
+                      <a:noFill/>
+                      <a:headEnd/>
+                      <a:tailEnd/>
+                    </a:ln>
+                  </pic:spPr>
+                </pic:pic>
+              </a:graphicData>
+            </a:graphic>
+          </wp:inline>
+        </w:drawing>
+      </w:r>
+    </w:p>
+    <w:p>
+      <w:pPr>
+        <w:pStyle w:val="BodyText"/>
+      </w:pPr>
+      <w:r>
+        <w:rPr>
+          <w:bCs/>
+          <w:b/>
+        </w:rPr>
+        <w:t xml:space="preserve">图 12</w:t>
+      </w:r>
+      <w:r>
+        <w:t xml:space="preserve">（GIS）DoS 时空暴露：傍晚（18–21 时）后台中断的被拒会话（按市镇）。时间维取自真实逐时会话。</w:t>
+      </w:r>
+    </w:p>
+    <w:bookmarkEnd w:id="71"/>
+    <w:bookmarkStart w:id="75" w:name="检测后台侧"/>
+    <w:p>
+      <w:pPr>
+        <w:pStyle w:val="Heading2"/>
+      </w:pPr>
+      <w:r>
+        <w:t xml:space="preserve">5.2 检测（后台侧）</w:t>
+      </w:r>
+    </w:p>
+    <w:p>
+      <w:pPr>
+        <w:pStyle w:val="FirstParagraph"/>
+      </w:pPr>
+      <w:r>
+        <w:t xml:space="preserve">检测融合两路特征：传输层流量特征由 NFStream 从 OCPP/WebSocket 连接提取（包/字节速率、到达间隔、连接频繁建断、心跳节律），识别 DoS 洪泛与中间人痕迹；OCPP 消息层特征包括消息类型序列、远程控制指令下发节律、授权/重放模式与 MeterValues 内部一致性[20]。</w:t>
+      </w:r>
+    </w:p>
+    <w:p>
+      <w:pPr>
+        <w:pStyle w:val="BodyText"/>
+      </w:pPr>
+      <w:r>
+        <w:t xml:space="preserve">核心检测器把”规模×节律”分解转为</w:t>
+      </w:r>
+      <w:r>
+        <w:rPr>
+          <w:bCs/>
+          <w:b/>
+        </w:rPr>
+        <w:t xml:space="preserve">物理一致性检验</w:t>
+      </w:r>
+      <w:r>
+        <w:t xml:space="preserve">。站点</w:t>
+      </w:r>
+      <w:r>
+        <w:t xml:space="preserve"> </w:t>
+      </w:r>
+      <w:r>
+        <w:rPr>
+          <w:iCs/>
+          <w:i/>
+        </w:rPr>
+        <w:t xml:space="preserve">s</w:t>
+      </w:r>
+      <w:r>
+        <w:t xml:space="preserve"> </w:t>
+      </w:r>
+      <w:r>
+        <w:t xml:space="preserve">在时片</w:t>
+      </w:r>
+      <w:r>
+        <w:t xml:space="preserve"> </w:t>
+      </w:r>
+      <w:r>
+        <w:rPr>
+          <w:iCs/>
+          <w:i/>
+        </w:rPr>
+        <w:t xml:space="preserve">t</w:t>
+      </w:r>
+      <w:r>
+        <w:t xml:space="preserve"> </w:t>
+      </w:r>
+      <w:r>
+        <w:t xml:space="preserve">的期望电量</w:t>
+      </w:r>
+      <w:r>
+        <w:t xml:space="preserve"> </w:t>
+      </w:r>
+      <w:r>
+        <w:rPr>
+          <w:iCs/>
+          <w:i/>
+        </w:rPr>
+        <w:t xml:space="preserve">Ê</w:t>
+      </w:r>
+      <w:r>
+        <w:t xml:space="preserve">(</w:t>
+      </w:r>
+      <w:r>
+        <w:rPr>
+          <w:iCs/>
+          <w:i/>
+        </w:rPr>
+        <w:t xml:space="preserve">s</w:t>
+      </w:r>
+      <w:r>
+        <w:t xml:space="preserve">,</w:t>
+      </w:r>
+      <w:r>
+        <w:rPr>
+          <w:iCs/>
+          <w:i/>
+        </w:rPr>
+        <w:t xml:space="preserve">t</w:t>
+      </w:r>
+      <w:r>
+        <w:t xml:space="preserve">)=scale</w:t>
+      </w:r>
+      <w:r>
+        <w:rPr>
+          <w:vertAlign w:val="subscript"/>
+          <w:iCs/>
+          <w:i/>
+        </w:rPr>
+        <w:t xml:space="preserve">s</w:t>
+      </w:r>
+      <w:r>
+        <w:t xml:space="preserve">·ρ(</w:t>
+      </w:r>
+      <w:r>
+        <w:rPr>
+          <w:iCs/>
+          <w:i/>
+        </w:rPr>
+        <w:t xml:space="preserve">t</w:t>
+      </w:r>
+      <w:r>
+        <w:t xml:space="preserve">)·</w:t>
+      </w:r>
+      <w:r>
+        <w:rPr>
+          <w:iCs/>
+          <w:i/>
+        </w:rPr>
+        <w:t xml:space="preserve">g</w:t>
+      </w:r>
+      <w:r>
+        <w:t xml:space="preserve">(</w:t>
+      </w:r>
+      <w:r>
+        <w:rPr>
+          <w:iCs/>
+          <w:i/>
+        </w:rPr>
+        <w:t xml:space="preserve">s</w:t>
+      </w:r>
+      <w:r>
+        <w:t xml:space="preserve">,</w:t>
+      </w:r>
+      <w:r>
+        <w:rPr>
+          <w:iCs/>
+          <w:i/>
+        </w:rPr>
+        <w:t xml:space="preserve">d</w:t>
+      </w:r>
+      <w:r>
+        <w:t xml:space="preserve">)；以观测/期望比</w:t>
+      </w:r>
+      <w:r>
+        <w:t xml:space="preserve"> </w:t>
+      </w:r>
+      <w:r>
+        <w:rPr>
+          <w:iCs/>
+          <w:i/>
+        </w:rPr>
+        <w:t xml:space="preserve">r</w:t>
+      </w:r>
+      <w:r>
+        <w:t xml:space="preserve">=</w:t>
+      </w:r>
+      <w:r>
+        <w:rPr>
+          <w:iCs/>
+          <w:i/>
+        </w:rPr>
+        <w:t xml:space="preserve">E</w:t>
+      </w:r>
+      <w:r>
+        <w:rPr>
+          <w:vertAlign w:val="subscript"/>
+        </w:rPr>
+        <w:t xml:space="preserve">obs</w:t>
+      </w:r>
+      <w:r>
+        <w:t xml:space="preserve">/</w:t>
+      </w:r>
+      <w:r>
+        <w:rPr>
+          <w:iCs/>
+          <w:i/>
+        </w:rPr>
+        <w:t xml:space="preserve">Ê</w:t>
+      </w:r>
+      <w:r>
+        <w:t xml:space="preserve"> </w:t>
+      </w:r>
+      <w:r>
+        <w:t xml:space="preserve">为判据：伪造电表读数或把功率推出”规模×当日节律”包络之外都会使</w:t>
+      </w:r>
+      <w:r>
+        <w:t xml:space="preserve"> </w:t>
+      </w:r>
+      <w:r>
+        <w:rPr>
+          <w:iCs/>
+          <w:i/>
+        </w:rPr>
+        <w:t xml:space="preserve">r</w:t>
+      </w:r>
+      <w:r>
+        <w:t xml:space="preserve"> </w:t>
+      </w:r>
+      <w:r>
+        <w:t xml:space="preserve">越过正常带。图 13 在真实日序列上展示其行为——4-28 大停电使</w:t>
+      </w:r>
+      <w:r>
+        <w:rPr>
+          <w:bCs/>
+          <w:b/>
+        </w:rPr>
+        <w:t xml:space="preserve">全网同步</w:t>
+      </w:r>
+      <w:r>
+        <w:t xml:space="preserve">降至期望的 0.53（全站一致→判为良性、须白名单），而注入的伪造电表读数在</w:t>
+      </w:r>
+      <w:r>
+        <w:rPr>
+          <w:bCs/>
+          <w:b/>
+        </w:rPr>
+        <w:t xml:space="preserve">单站</w:t>
+      </w:r>
+      <w:r>
+        <w:t xml:space="preserve">使比值冲高越过上带（告警）；二者的区分正来自”规模×节律”的联合期望。跨运营商联邦检测使各运营商日志本地化、仅共享模型参数与异常统计[10,21]，契合多运营商结构。所有检测器须通过第 3.3 节三类真实异常的假阳性考验并单独报告误报率。</w:t>
+      </w:r>
+    </w:p>
+    <w:p>
+      <w:pPr>
+        <w:pStyle w:val="BodyText"/>
+      </w:pPr>
+      <w:r>
+        <w:drawing>
+          <wp:inline>
+            <wp:extent cx="4800600" cy="2991819"/>
+            <wp:effectExtent b="0" l="0" r="0" t="0"/>
+            <wp:docPr descr="" title="" id="73" name="Picture"/>
+            <a:graphic>
+              <a:graphicData uri="http://schemas.openxmlformats.org/drawingml/2006/picture">
+                <pic:pic>
+                  <pic:nvPicPr>
+                    <pic:cNvPr descr="figs/fig6_detector.png" id="74" name="Picture"/>
+                    <pic:cNvPicPr>
+                      <a:picLocks noChangeArrowheads="1" noChangeAspect="1"/>
+                    </pic:cNvPicPr>
+                  </pic:nvPicPr>
+                  <pic:blipFill>
+                    <a:blip r:embed="rId72"/>
+                    <a:stretch>
+                      <a:fillRect/>
+                    </a:stretch>
+                  </pic:blipFill>
+                  <pic:spPr bwMode="auto">
+                    <a:xfrm>
+                      <a:off x="0" y="0"/>
+                      <a:ext cx="4800600" cy="2991819"/>
+                    </a:xfrm>
+                    <a:prstGeom prst="rect">
+                      <a:avLst/>
+                    </a:prstGeom>
+                    <a:noFill/>
+                    <a:ln w="9525">
+                      <a:noFill/>
+                      <a:headEnd/>
+                      <a:tailEnd/>
+                    </a:ln>
+                  </pic:spPr>
+                </pic:pic>
+              </a:graphicData>
+            </a:graphic>
+          </wp:inline>
+        </w:drawing>
+      </w:r>
+    </w:p>
+    <w:p>
+      <w:pPr>
+        <w:pStyle w:val="BodyText"/>
+      </w:pPr>
+      <w:r>
+        <w:rPr>
+          <w:bCs/>
+          <w:b/>
+        </w:rPr>
+        <w:t xml:space="preserve">图 13</w:t>
+      </w:r>
+      <w:r>
+        <w:t xml:space="preserve"> </w:t>
+      </w:r>
+      <w:r>
+        <w:t xml:space="preserve">物理一致性检测器在真实日序列上的行为。上：全网日会话数与”规模×节律”28 日稳健基线（会话 1 月 9,578→12 月 14,330 次）；下：观测/期望一致性比，4-28 大停电全网同步跌至 0.53（良性）、注入的伪造电表读数单站冲高越过上带（告警）。</w:t>
+      </w:r>
+    </w:p>
+    <w:bookmarkEnd w:id="75"/>
+    <w:bookmarkStart w:id="76" w:name="遏制与评价主指标"/>
+    <w:p>
+      <w:pPr>
+        <w:pStyle w:val="Heading2"/>
+      </w:pPr>
+      <w:r>
+        <w:t xml:space="preserve">5.3 遏制与评价主指标</w:t>
+      </w:r>
+    </w:p>
+    <w:p>
+      <w:pPr>
+        <w:pStyle w:val="FirstParagraph"/>
+      </w:pPr>
+      <w:r>
+        <w:t xml:space="preserve">遏制手段建模为情景变量：加密与认证等级、远程功率/停充指令限速（据[8]有效）、按运营商或区域隔离、跨运营商联邦检测。主指标为”被发现前造成的损失”而非仅 AUC：累计受控电量（MWh）、被拒会话数、受影响市镇数。定义检测时延为攻击注入到首次正确告警的时间，损失即检测时延沿攻击功率曲线的积分。三量全部可在 H3 功能分区底图上随时间轴回放（第 7 节图 18）。</w:t>
+      </w:r>
+    </w:p>
+    <w:bookmarkEnd w:id="76"/>
+    <w:bookmarkEnd w:id="77"/>
+    <w:bookmarkStart w:id="92" w:name="实验设计与评估"/>
+    <w:p>
+      <w:pPr>
+        <w:pStyle w:val="Heading1"/>
+      </w:pPr>
+      <w:r>
+        <w:t xml:space="preserve">6 实验设计与评估</w:t>
+      </w:r>
+    </w:p>
+    <w:p>
+      <w:pPr>
+        <w:pStyle w:val="FirstParagraph"/>
+      </w:pPr>
+      <w:r>
+        <w:t xml:space="preserve">仿真尚未执行，本节给出测量计划与指标定义；涉及结果处仅陈述评价框架与标注为”示意/预期”的定性方向。</w:t>
+      </w:r>
+    </w:p>
+    <w:bookmarkStart w:id="84" w:name="攻击目标的异质性"/>
+    <w:p>
+      <w:pPr>
+        <w:pStyle w:val="Heading2"/>
+      </w:pPr>
+      <w:r>
+        <w:t xml:space="preserve">6.1 攻击目标的异质性</w:t>
+      </w:r>
+    </w:p>
+    <w:p>
+      <w:pPr>
+        <w:pStyle w:val="FirstParagraph"/>
+      </w:pPr>
+      <w:r>
+        <w:t xml:space="preserve">不同接口的攻击价值不同（图 14）：直流桩中位时长仅 27–28 min 但中位功率达 48–86 kW、电量 18–27 kWh，是功率操纵与偷电的主要目标；交流 Schuko 中位 114 min、仅 2.2 kW，攻击价值低。各接口的增长也不同步（图 15）：直流会话全年增至 1.67 倍、交流 Type2 1.25 倍，而 Schuko 降至 0.77 倍，意味着负荷构成随时间变化、防御规则须定期更新。</w:t>
+      </w:r>
+    </w:p>
+    <w:p>
+      <w:pPr>
+        <w:pStyle w:val="BodyText"/>
+      </w:pPr>
+      <w:r>
+        <w:drawing>
+          <wp:inline>
+            <wp:extent cx="5013960" cy="2052843"/>
+            <wp:effectExtent b="0" l="0" r="0" t="0"/>
+            <wp:docPr descr="" title="" id="79" name="Picture"/>
+            <a:graphic>
+              <a:graphicData uri="http://schemas.openxmlformats.org/drawingml/2006/picture">
+                <pic:pic>
+                  <pic:nvPicPr>
+                    <pic:cNvPr descr="figs/fig15_chargetype.png" id="80" name="Picture"/>
+                    <pic:cNvPicPr>
+                      <a:picLocks noChangeArrowheads="1" noChangeAspect="1"/>
+                    </pic:cNvPicPr>
+                  </pic:nvPicPr>
+                  <pic:blipFill>
+                    <a:blip r:embed="rId78"/>
+                    <a:stretch>
+                      <a:fillRect/>
+                    </a:stretch>
+                  </pic:blipFill>
+                  <pic:spPr bwMode="auto">
+                    <a:xfrm>
+                      <a:off x="0" y="0"/>
+                      <a:ext cx="5013960" cy="2052843"/>
+                    </a:xfrm>
+                    <a:prstGeom prst="rect">
+                      <a:avLst/>
+                    </a:prstGeom>
+                    <a:noFill/>
+                    <a:ln w="9525">
+                      <a:noFill/>
+                      <a:headEnd/>
+                      <a:tailEnd/>
+                    </a:ln>
+                  </pic:spPr>
+                </pic:pic>
+              </a:graphicData>
+            </a:graphic>
+          </wp:inline>
+        </w:drawing>
+      </w:r>
+    </w:p>
+    <w:p>
+      <w:pPr>
+        <w:pStyle w:val="BodyText"/>
+      </w:pPr>
+      <w:r>
+        <w:rPr>
+          <w:bCs/>
+          <w:b/>
+        </w:rPr>
+        <w:t xml:space="preserve">图 14</w:t>
+      </w:r>
+      <w:r>
+        <w:t xml:space="preserve"> </w:t>
+      </w:r>
+      <w:r>
+        <w:t xml:space="preserve">按接口类型的攻击价值：直流桩短时、高功率、高电量，是功率操纵的主要目标。</w:t>
+      </w:r>
+    </w:p>
+    <w:p>
+      <w:pPr>
+        <w:pStyle w:val="BodyText"/>
+      </w:pPr>
+      <w:r>
+        <w:drawing>
+          <wp:inline>
+            <wp:extent cx="4907280" cy="2179398"/>
+            <wp:effectExtent b="0" l="0" r="0" t="0"/>
+            <wp:docPr descr="" title="" id="82" name="Picture"/>
+            <a:graphic>
+              <a:graphicData uri="http://schemas.openxmlformats.org/drawingml/2006/picture">
+                <pic:pic>
+                  <pic:nvPicPr>
+                    <pic:cNvPr descr="figs/fig16_monthly.png" id="83" name="Picture"/>
+                    <pic:cNvPicPr>
+                      <a:picLocks noChangeArrowheads="1" noChangeAspect="1"/>
+                    </pic:cNvPicPr>
+                  </pic:nvPicPr>
+                  <pic:blipFill>
+                    <a:blip r:embed="rId81"/>
+                    <a:stretch>
+                      <a:fillRect/>
+                    </a:stretch>
+                  </pic:blipFill>
+                  <pic:spPr bwMode="auto">
+                    <a:xfrm>
+                      <a:off x="0" y="0"/>
+                      <a:ext cx="4907280" cy="2179398"/>
+                    </a:xfrm>
+                    <a:prstGeom prst="rect">
+                      <a:avLst/>
+                    </a:prstGeom>
+                    <a:noFill/>
+                    <a:ln w="9525">
+                      <a:noFill/>
+                      <a:headEnd/>
+                      <a:tailEnd/>
+                    </a:ln>
+                  </pic:spPr>
+                </pic:pic>
+              </a:graphicData>
+            </a:graphic>
+          </wp:inline>
+        </w:drawing>
+      </w:r>
+    </w:p>
+    <w:p>
+      <w:pPr>
+        <w:pStyle w:val="BodyText"/>
+      </w:pPr>
+      <w:r>
+        <w:rPr>
+          <w:bCs/>
+          <w:b/>
+        </w:rPr>
+        <w:t xml:space="preserve">图 15</w:t>
+      </w:r>
+      <w:r>
+        <w:t xml:space="preserve"> </w:t>
+      </w:r>
+      <w:r>
+        <w:t xml:space="preserve">各接口月度增长不同步：直流增长最快、Schuko 下降，负荷构成随时间变化。</w:t>
+      </w:r>
+    </w:p>
+    <w:bookmarkEnd w:id="84"/>
+    <w:bookmarkStart w:id="91" w:name="场景矩阵指标与权衡"/>
+    <w:p>
+      <w:pPr>
+        <w:pStyle w:val="Heading2"/>
+      </w:pPr>
+      <w:r>
+        <w:t xml:space="preserve">6.2 场景矩阵、指标与权衡</w:t>
+      </w:r>
+    </w:p>
+    <w:p>
+      <w:pPr>
+        <w:pStyle w:val="FirstParagraph"/>
+      </w:pPr>
+      <w:r>
+        <w:t xml:space="preserve">实验在四维笛卡尔积上展开（完整取值见附录 B）：攻击者位置</w:t>
+      </w:r>
+      <w:r>
+        <w:t xml:space="preserve"> </w:t>
+      </w:r>
+      <w:r>
+        <w:rPr>
+          <w:iCs/>
+          <w:i/>
+        </w:rPr>
+        <w:t xml:space="preserve">A</w:t>
+      </w:r>
+      <w:r>
+        <w:t xml:space="preserve">∈{A1–A4}；OCPP 版本与安全配置</w:t>
+      </w:r>
+      <w:r>
+        <w:t xml:space="preserve"> </w:t>
+      </w:r>
+      <w:r>
+        <w:rPr>
+          <w:iCs/>
+          <w:i/>
+        </w:rPr>
+        <w:t xml:space="preserve">V</w:t>
+      </w:r>
+      <w:r>
+        <w:t xml:space="preserve">；防御配置</w:t>
+      </w:r>
+      <w:r>
+        <w:t xml:space="preserve"> </w:t>
+      </w:r>
+      <w:r>
+        <w:rPr>
+          <w:iCs/>
+          <w:i/>
+        </w:rPr>
+        <w:t xml:space="preserve">D</w:t>
+      </w:r>
+      <w:r>
+        <w:t xml:space="preserve">∈{无防御、加密认证、指令限速、隔离、联邦检测、规模×节律一致性检测}；攻击规模与协同度</w:t>
+      </w:r>
+      <w:r>
+        <w:t xml:space="preserve"> </w:t>
+      </w:r>
+      <w:r>
+        <w:rPr>
+          <w:iCs/>
+          <w:i/>
+        </w:rPr>
+        <w:t xml:space="preserve">C</w:t>
+      </w:r>
+      <w:r>
+        <w:t xml:space="preserve">。设攻击在</w:t>
+      </w:r>
+      <w:r>
+        <w:t xml:space="preserve"> </w:t>
+      </w:r>
+      <w:r>
+        <w:rPr>
+          <w:iCs/>
+          <w:i/>
+        </w:rPr>
+        <w:t xml:space="preserve">t</w:t>
+      </w:r>
+      <w:r>
+        <w:t xml:space="preserve">₀ 注入、</w:t>
+      </w:r>
+      <w:r>
+        <w:rPr>
+          <w:iCs/>
+          <w:i/>
+        </w:rPr>
+        <w:t xml:space="preserve">t_d</w:t>
+      </w:r>
+      <w:r>
+        <w:t xml:space="preserve"> </w:t>
+      </w:r>
+      <w:r>
+        <w:t xml:space="preserve">首个真阳性告警、</w:t>
+      </w:r>
+      <w:r>
+        <w:rPr>
+          <w:iCs/>
+          <w:i/>
+        </w:rPr>
+        <w:t xml:space="preserve">t_c</w:t>
+      </w:r>
+      <w:r>
+        <w:t xml:space="preserve"> </w:t>
+      </w:r>
+      <w:r>
+        <w:t xml:space="preserve">遏制到阈值；度量检测时延 τ_d、遏制时间 τ_c、残余损失（ΔE、N_rej、|M|）、计费偏差与误报率（形式化见附录 C）。图 16 给出各防御配置下残余损失的</w:t>
+      </w:r>
+      <w:r>
+        <w:rPr>
+          <w:bCs/>
+          <w:b/>
+        </w:rPr>
+        <w:t xml:space="preserve">预期</w:t>
+      </w:r>
+      <w:r>
+        <w:t xml:space="preserve">定性水平（待仿真标定）：链路加密对 A1/A2 有效、对 A3/A4 无效；隔离对 A4 最有效；一致性检测对伪造电表/偷电强、对纯 DoS 弱。图 17 给出遏制时延-残余损失的分析模型：隔离把爆炸半径限于单后台，叠加限速进一步压低其增长，早检测（缩短 τ_d）进一步削减损失。</w:t>
+      </w:r>
+    </w:p>
+    <w:p>
+      <w:pPr>
+        <w:pStyle w:val="BodyText"/>
+      </w:pPr>
+      <w:r>
+        <w:drawing>
+          <wp:inline>
+            <wp:extent cx="4480560" cy="2249031"/>
+            <wp:effectExtent b="0" l="0" r="0" t="0"/>
+            <wp:docPr descr="" title="" id="86" name="Picture"/>
+            <a:graphic>
+              <a:graphicData uri="http://schemas.openxmlformats.org/drawingml/2006/picture">
+                <pic:pic>
+                  <pic:nvPicPr>
+                    <pic:cNvPr descr="figs/fig17_matrix.png" id="87" name="Picture"/>
+                    <pic:cNvPicPr>
+                      <a:picLocks noChangeArrowheads="1" noChangeAspect="1"/>
+                    </pic:cNvPicPr>
+                  </pic:nvPicPr>
+                  <pic:blipFill>
+                    <a:blip r:embed="rId85"/>
+                    <a:stretch>
+                      <a:fillRect/>
+                    </a:stretch>
+                  </pic:blipFill>
+                  <pic:spPr bwMode="auto">
+                    <a:xfrm>
+                      <a:off x="0" y="0"/>
+                      <a:ext cx="4480560" cy="2249031"/>
+                    </a:xfrm>
+                    <a:prstGeom prst="rect">
+                      <a:avLst/>
+                    </a:prstGeom>
+                    <a:noFill/>
+                    <a:ln w="9525">
+                      <a:noFill/>
+                      <a:headEnd/>
+                      <a:tailEnd/>
+                    </a:ln>
+                  </pic:spPr>
+                </pic:pic>
+              </a:graphicData>
+            </a:graphic>
+          </wp:inline>
+        </w:drawing>
+      </w:r>
+    </w:p>
+    <w:p>
+      <w:pPr>
+        <w:pStyle w:val="BodyText"/>
+      </w:pPr>
+      <w:r>
+        <w:rPr>
+          <w:bCs/>
+          <w:b/>
+        </w:rPr>
+        <w:t xml:space="preserve">图 16</w:t>
+      </w:r>
+      <w:r>
+        <w:t xml:space="preserve"> </w:t>
+      </w:r>
+      <w:r>
+        <w:t xml:space="preserve">场景矩阵：各防御配置下的残余损失（预期/定性，待仿真实测标定）。</w:t>
+      </w:r>
+    </w:p>
+    <w:p>
+      <w:pPr>
+        <w:pStyle w:val="BodyText"/>
+      </w:pPr>
+      <w:r>
+        <w:drawing>
+          <wp:inline>
+            <wp:extent cx="4907280" cy="2213810"/>
+            <wp:effectExtent b="0" l="0" r="0" t="0"/>
+            <wp:docPr descr="" title="" id="89" name="Picture"/>
+            <a:graphic>
+              <a:graphicData uri="http://schemas.openxmlformats.org/drawingml/2006/picture">
+                <pic:pic>
+                  <pic:nvPicPr>
+                    <pic:cNvPr descr="figs/fig18_latency.png" id="90" name="Picture"/>
+                    <pic:cNvPicPr>
+                      <a:picLocks noChangeArrowheads="1" noChangeAspect="1"/>
+                    </pic:cNvPicPr>
+                  </pic:nvPicPr>
+                  <pic:blipFill>
+                    <a:blip r:embed="rId88"/>
+                    <a:stretch>
+                      <a:fillRect/>
+                    </a:stretch>
+                  </pic:blipFill>
+                  <pic:spPr bwMode="auto">
+                    <a:xfrm>
+                      <a:off x="0" y="0"/>
+                      <a:ext cx="4907280" cy="2213810"/>
+                    </a:xfrm>
+                    <a:prstGeom prst="rect">
+                      <a:avLst/>
+                    </a:prstGeom>
+                    <a:noFill/>
+                    <a:ln w="9525">
+                      <a:noFill/>
+                      <a:headEnd/>
+                      <a:tailEnd/>
+                    </a:ln>
+                  </pic:spPr>
+                </pic:pic>
+              </a:graphicData>
+            </a:graphic>
+          </wp:inline>
+        </w:drawing>
+      </w:r>
+    </w:p>
+    <w:p>
+      <w:pPr>
+        <w:pStyle w:val="BodyText"/>
+      </w:pPr>
+      <w:r>
+        <w:rPr>
+          <w:bCs/>
+          <w:b/>
+        </w:rPr>
+        <w:t xml:space="preserve">图 17</w:t>
+      </w:r>
+      <w:r>
+        <w:t xml:space="preserve"> </w:t>
+      </w:r>
+      <w:r>
+        <w:t xml:space="preserve">遏制时延-残余损失权衡（分析模型；τ_d 由 OCPP 仿真平台实测标定）。(a) 损失随时延增长；(b) 叠加遏制手段的边际削减。</w:t>
+      </w:r>
+    </w:p>
+    <w:p>
+      <w:pPr>
+        <w:pStyle w:val="BodyText"/>
+      </w:pPr>
+      <w:r>
+        <w:t xml:space="preserve">真实异常套件充当”闸门”：任一配置须在三类真实异常上将误报率控制在上限 α 内，否则不计入主比较。每个场景格重复运行，报告中位数与 95% 自助置信区间，全部种子与配置入库以保证可复现。</w:t>
+      </w:r>
+    </w:p>
+    <w:bookmarkEnd w:id="91"/>
+    <w:bookmarkEnd w:id="92"/>
+    <w:bookmarkStart w:id="98" w:name="gis-攻防可视化与工具链"/>
+    <w:p>
+      <w:pPr>
+        <w:pStyle w:val="Heading1"/>
+      </w:pPr>
+      <w:r>
+        <w:t xml:space="preserve">7 GIS 攻防可视化与工具链</w:t>
+      </w:r>
+    </w:p>
+    <w:bookmarkStart w:id="96" w:name="攻防时间线的地图回放"/>
+    <w:p>
+      <w:pPr>
+        <w:pStyle w:val="Heading2"/>
+      </w:pPr>
+      <w:r>
+        <w:t xml:space="preserve">7.1 攻防时间线的地图回放</w:t>
+      </w:r>
+    </w:p>
+    <w:p>
+      <w:pPr>
+        <w:pStyle w:val="FirstParagraph"/>
+      </w:pPr>
+      <w:r>
+        <w:t xml:space="preserve">可视化并非展示环节，而是”以被发现前损失为主指标”这一主张的直接承载：只有当损失能逐时、逐站点投影到真实地理底图上，</w:t>
+      </w:r>
+      <w:r>
+        <w:t xml:space="preserve">“</w:t>
+      </w:r>
+      <w:r>
+        <w:t xml:space="preserve">损失可上地图</w:t>
+      </w:r>
+      <w:r>
+        <w:t xml:space="preserve">”</w:t>
+      </w:r>
+      <w:r>
+        <w:t xml:space="preserve">才从修辞变为可核查的结果形式。图 18 把一次后台沦陷的攻防全过程在真实站点地理上回放：</w:t>
+      </w:r>
+      <w:r>
+        <w:rPr>
+          <w:iCs/>
+          <w:i/>
+        </w:rPr>
+        <w:t xml:space="preserve">t</w:t>
+      </w:r>
+      <w:r>
+        <w:t xml:space="preserve">₀ 单站被攻破（入口），</w:t>
+      </w:r>
+      <w:r>
+        <w:rPr>
+          <w:iCs/>
+          <w:i/>
+        </w:rPr>
+        <w:t xml:space="preserve">t</w:t>
+      </w:r>
+      <w:r>
+        <w:t xml:space="preserve">₁≈5 min 指令扇出至约 30 站（红点沿地理扩散），</w:t>
+      </w:r>
+      <w:r>
+        <w:rPr>
+          <w:iCs/>
+          <w:i/>
+        </w:rPr>
+        <w:t xml:space="preserve">t</w:t>
+      </w:r>
+      <w:r>
+        <w:t xml:space="preserve">₂ 物理一致性检测触发（全部告警），</w:t>
+      </w:r>
+      <w:r>
+        <w:rPr>
+          <w:iCs/>
+          <w:i/>
+        </w:rPr>
+        <w:t xml:space="preserve">t</w:t>
+      </w:r>
+      <w:r>
+        <w:t xml:space="preserve">₃ 按运营商隔离后本地充电恢复（绿点）。这四帧与第 6 节定义的检测时延 τ_d、遏制时间 τ_c 在视觉上一一对应，使攻击横向扩散的速度、检测触发的时刻与隔离恢复的范围同时可见。本文前述 GIS 图共同构成一套攻防图集：攻击面（图 3、4）、爆炸半径（图 8）、暴露（图 12）与时间线（图 18）。</w:t>
+      </w:r>
+    </w:p>
+    <w:p>
+      <w:pPr>
+        <w:pStyle w:val="BodyText"/>
+      </w:pPr>
+      <w:r>
+        <w:drawing>
+          <wp:inline>
+            <wp:extent cx="5227320" cy="2142399"/>
+            <wp:effectExtent b="0" l="0" r="0" t="0"/>
+            <wp:docPr descr="" title="" id="94" name="Picture"/>
+            <a:graphic>
+              <a:graphicData uri="http://schemas.openxmlformats.org/drawingml/2006/picture">
+                <pic:pic>
+                  <pic:nvPicPr>
+                    <pic:cNvPr descr="figs/fig11_gis_timeline.png" id="95" name="Picture"/>
+                    <pic:cNvPicPr>
+                      <a:picLocks noChangeArrowheads="1" noChangeAspect="1"/>
+                    </pic:cNvPicPr>
+                  </pic:nvPicPr>
+                  <pic:blipFill>
+                    <a:blip r:embed="rId93"/>
+                    <a:stretch>
+                      <a:fillRect/>
+                    </a:stretch>
+                  </pic:blipFill>
+                  <pic:spPr bwMode="auto">
+                    <a:xfrm>
+                      <a:off x="0" y="0"/>
+                      <a:ext cx="5227320" cy="2142399"/>
+                    </a:xfrm>
+                    <a:prstGeom prst="rect">
+                      <a:avLst/>
+                    </a:prstGeom>
+                    <a:noFill/>
+                    <a:ln w="9525">
+                      <a:noFill/>
+                      <a:headEnd/>
+                      <a:tailEnd/>
+                    </a:ln>
+                  </pic:spPr>
+                </pic:pic>
+              </a:graphicData>
+            </a:graphic>
+          </wp:inline>
+        </w:drawing>
+      </w:r>
+    </w:p>
+    <w:p>
+      <w:pPr>
+        <w:pStyle w:val="BodyText"/>
+      </w:pPr>
+      <w:r>
+        <w:rPr>
+          <w:bCs/>
+          <w:b/>
+        </w:rPr>
+        <w:t xml:space="preserve">图 18</w:t>
+      </w:r>
+      <w:r>
+        <w:t xml:space="preserve">（GIS）攻防时间线回放（场景示意，AMB/Iberdrola 后台；地理为真实站点）。入口→扩散→检测→隔离恢复四帧。</w:t>
+      </w:r>
+    </w:p>
+    <w:bookmarkEnd w:id="96"/>
+    <w:bookmarkStart w:id="97" w:name="工具链"/>
+    <w:p>
+      <w:pPr>
+        <w:pStyle w:val="Heading2"/>
+      </w:pPr>
+      <w:r>
+        <w:t xml:space="preserve">7.2 工具链</w:t>
+      </w:r>
+    </w:p>
+    <w:p>
+      <w:pPr>
+        <w:pStyle w:val="FirstParagraph"/>
+      </w:pPr>
+      <w:r>
+        <w:t xml:space="preserve">底图复用[11]已建成的 H3 分辨率 8（894 格、414 建成区）功能分区与 621 站点点图层；站点按运营商着色并连向各自 CSMS。仿真底座由开源组件拼装：每个充电桩由 Python</w:t>
       </w:r>
       <w:r>
         <w:t xml:space="preserve"> </w:t>
@@ -2090,11 +2688,12 @@
         <w:t xml:space="preserve"> </w:t>
       </w:r>
       <w:r>
-        <w:t xml:space="preserve">库[16]启一个异步客户端，回放真实会话或以”规模×节律”生成背景流量；CSMS 侧用 SteVe[17]（OCPP 1.6）或 CitrineOS[18]（OCPP 2.0.1），使协议版本成为可切换情景变量；拓扑由 Mininet/IPMininet[19]搭建，桩—后台链路、隔离边界与联邦节点显式建模；攻击由 mitmproxy 注入、流量特征由 NFStream 提取[20]。现成框架中 EmuOCPP[22]（基于 IPMininet）与本文需求最接近，可作底座起点再按真实拓扑与流量扩展。异步 IO 使单机即可承载数十至数百个并发 OCPP 会话；拓扑、协议版本、加密等级、限速等情景变量均经配置文件参数化，支持场景矩阵批量重跑与结果归档。</w:t>
-      </w:r>
-    </w:p>
-    <w:bookmarkEnd w:id="59"/>
-    <w:bookmarkStart w:id="64" w:name="讨论伦理边界与结论"/>
+        <w:t xml:space="preserve">库[16]启一个异步客户端，回放真实会话或以”规模×节律”生成背景流量；CSMS 侧用 SteVe[17]（OCPP 1.6）或 CitrineOS[18]（OCPP 2.0.1），使协议版本成为可切换情景变量；拓扑由 Mininet/IPMininet[19]搭建，隔离边界与联邦节点显式建模；攻击由 mitmproxy 注入、流量特征由 NFStream 提取[20]。现成框架中 EmuOCPP[22]（基于 IPMininet）与本文需求最接近，可作底座起点。异步 IO 使单机即可承载数十至数百个并发 OCPP 会话；情景变量均经配置文件参数化，支持场景矩阵批量重跑与地图回放的可复现归档。</w:t>
+      </w:r>
+    </w:p>
+    <w:bookmarkEnd w:id="97"/>
+    <w:bookmarkEnd w:id="98"/>
+    <w:bookmarkStart w:id="106" w:name="讨论伦理边界与结论"/>
     <w:p>
       <w:pPr>
         <w:pStyle w:val="Heading1"/>
@@ -2103,7 +2702,7 @@
         <w:t xml:space="preserve">8 讨论、伦理边界与结论</w:t>
       </w:r>
     </w:p>
-    <w:bookmarkStart w:id="60" w:name="能与不能回答的问题"/>
+    <w:bookmarkStart w:id="102" w:name="能与不能回答的问题"/>
     <w:p>
       <w:pPr>
         <w:pStyle w:val="Heading2"/>
@@ -2117,7 +2716,7 @@
         <w:pStyle w:val="FirstParagraph"/>
       </w:pPr>
       <w:r>
-        <w:t xml:space="preserve">本文能回答：在既定拓扑与流量下，攻击者占据 OCPP 通道不同位置时实际可控的站点数、可控 MW、可被拒会话量，以及防御方从异常出现到定位遏制的时间。它不能回答电网物理层的稳定性——这超出现有数据。电网仅作结果指标且不建潮流模型的取舍由量级论证支持（63.47 MW 仅为本土峰值 0.16%），与[8]一致；[8]把攻击抽象为受控比例</w:t>
+        <w:t xml:space="preserve">本文能回答：在既定拓扑与流量下，攻击者占据 OCPP 通道不同位置时实际可控的站点数、可控 MW、可被拒会话量，以及防御方从异常出现到定位遏制的时间。它不能回答电网物理层的稳定性——这超出现有数据。电网仅作结果指标且不建潮流模型的取舍由量级论证支持：63.47 MW 仅为本土峰值 0.16%，远低于触发 UFLS 的 9–11%（图 19）；[8]把攻击抽象为受控比例</w:t>
       </w:r>
       <w:r>
         <w:t xml:space="preserve"> </w:t>
@@ -2149,27 +2748,73 @@
         <w:t xml:space="preserve"> </w:t>
       </w:r>
       <w:r>
-        <w:t xml:space="preserve">如何从网络层得到，本文补的正是这一空白——以真实通道位置与真实流量推导</w:t>
-      </w:r>
-      <w:r>
-        <w:t xml:space="preserve"> </w:t>
-      </w:r>
-      <w:r>
-        <w:rPr>
-          <w:iCs/>
-          <w:i/>
-        </w:rPr>
-        <w:t xml:space="preserve">p</w:t>
-      </w:r>
-      <w:r>
-        <w:t xml:space="preserve"> </w:t>
-      </w:r>
-      <w:r>
-        <w:t xml:space="preserve">的上界及其时间演化。</w:t>
-      </w:r>
-    </w:p>
-    <w:bookmarkEnd w:id="60"/>
-    <w:bookmarkStart w:id="61" w:name="协议迁移与可迁移性"/>
+        <w:t xml:space="preserve">如何从网络层得到，本文补的正是这一空白。</w:t>
+      </w:r>
+    </w:p>
+    <w:p>
+      <w:pPr>
+        <w:pStyle w:val="BodyText"/>
+      </w:pPr>
+      <w:r>
+        <w:drawing>
+          <wp:inline>
+            <wp:extent cx="3947160" cy="2341466"/>
+            <wp:effectExtent b="0" l="0" r="0" t="0"/>
+            <wp:docPr descr="" title="" id="100" name="Picture"/>
+            <a:graphic>
+              <a:graphicData uri="http://schemas.openxmlformats.org/drawingml/2006/picture">
+                <pic:pic>
+                  <pic:nvPicPr>
+                    <pic:cNvPr descr="figs/fig20_grid.png" id="101" name="Picture"/>
+                    <pic:cNvPicPr>
+                      <a:picLocks noChangeArrowheads="1" noChangeAspect="1"/>
+                    </pic:cNvPicPr>
+                  </pic:nvPicPr>
+                  <pic:blipFill>
+                    <a:blip r:embed="rId99"/>
+                    <a:stretch>
+                      <a:fillRect/>
+                    </a:stretch>
+                  </pic:blipFill>
+                  <pic:spPr bwMode="auto">
+                    <a:xfrm>
+                      <a:off x="0" y="0"/>
+                      <a:ext cx="3947160" cy="2341466"/>
+                    </a:xfrm>
+                    <a:prstGeom prst="rect">
+                      <a:avLst/>
+                    </a:prstGeom>
+                    <a:noFill/>
+                    <a:ln w="9525">
+                      <a:noFill/>
+                      <a:headEnd/>
+                      <a:tailEnd/>
+                    </a:ln>
+                  </pic:spPr>
+                </pic:pic>
+              </a:graphicData>
+            </a:graphic>
+          </wp:inline>
+        </w:drawing>
+      </w:r>
+    </w:p>
+    <w:p>
+      <w:pPr>
+        <w:pStyle w:val="BodyText"/>
+      </w:pPr>
+      <w:r>
+        <w:rPr>
+          <w:bCs/>
+          <w:b/>
+        </w:rPr>
+        <w:t xml:space="preserve">图 19</w:t>
+      </w:r>
+      <w:r>
+        <w:t xml:space="preserve">网络层可控量→电网结果指标：AMB 全部登记 63.47 MW（0.16%）远低于 UFLS 触发带 9–11%。据[8]的 SFR 阈值线性化，AMB 位置为本文计算。</w:t>
+      </w:r>
+    </w:p>
+    <w:bookmarkEnd w:id="102"/>
+    <w:bookmarkStart w:id="103" w:name="协议迁移与可迁移性"/>
     <w:p>
       <w:pPr>
         <w:pStyle w:val="Heading2"/>
@@ -2183,11 +2828,11 @@
         <w:pStyle w:val="FirstParagraph"/>
       </w:pPr>
       <w:r>
-        <w:t xml:space="preserve">OCPP 版本直接决定可控性：1.6 下中间人篡改、伪造电表与重放授权在未加密链路上现实可行；迁移到 2.0.1/2.1 后强制 TLS、设备证书与安全事件日志会显著压缩中间人与冒充类攻击面[12,13]，但后台被攻破后的批量限功率/停充、以及连接层 DoS 并不随协议升级消失。本框架不绑定巴塞罗那：任何 AFIR 城市都有等价的国家接入点登记表底座，方法学可直接移植；但具体数值不可迁移——设施倍数（同站直流 3.45 倍）、认证构成（2,897/3,302 为 rfid;apps）、运营商口径（编号 37 / 名称 38）等须在当地重估。</w:t>
-      </w:r>
-    </w:p>
-    <w:bookmarkEnd w:id="61"/>
-    <w:bookmarkStart w:id="62" w:name="伦理边界与局限"/>
+        <w:t xml:space="preserve">OCPP 版本直接决定可控性（图 6）：1.6 下中间人篡改、伪造电表与重放授权在未加密链路上现实可行；迁移到 2.0.1/2.1 后强制 TLS、设备证书与安全事件日志会显著压缩中间人与冒充类攻击面[12,13]，但后台被攻破后的批量限功率/停充、以及连接层 DoS 并不随协议升级消失（图 6 的 A3/A4 行）。本框架不绑定巴塞罗那：任何 AFIR 城市都有等价的国家接入点登记表底座，方法学可直接移植；但具体数值不可迁移——设施倍数（同站直流 3.45 倍）、认证构成（2,897/3,302 为 rfid;apps）、运营商口径（编号 37 / 名称 38）等须在当地重估。</w:t>
+      </w:r>
+    </w:p>
+    <w:bookmarkEnd w:id="103"/>
+    <w:bookmarkStart w:id="104" w:name="伦理边界与局限"/>
     <w:p>
       <w:pPr>
         <w:pStyle w:val="Heading2"/>
@@ -2204,8 +2849,8 @@
         <w:t xml:space="preserve">本研究全部在纯仿真环境进行，不接触任何真实运营商后台或充电桩，不向真实系统注入消息；任何在工具中发现的可被滥用缺陷遵循协调披露，并刻意不提供可直接用于攻击真实系统的操作细节、载荷或配置。主要局限：带会话流量的真实数据仅来自单一运营商（AMB 网络，Iberdrola Clientes）、单一年度，其余 550 站点只有静态属性、背景流量需借模型生成；DGT 登记表缺投运日期与配电拓扑；协议版本存在不确定性，只能以情景变量覆盖。</w:t>
       </w:r>
     </w:p>
-    <w:bookmarkEnd w:id="62"/>
-    <w:bookmarkStart w:id="63" w:name="结论"/>
+    <w:bookmarkEnd w:id="104"/>
+    <w:bookmarkStart w:id="105" w:name="结论"/>
     <w:p>
       <w:pPr>
         <w:pStyle w:val="Heading2"/>
@@ -2219,7 +2864,7 @@
         <w:pStyle w:val="FirstParagraph"/>
       </w:pPr>
       <w:r>
-        <w:t xml:space="preserve">（1）在巴塞罗那真实结构下，网络层 OCPP 攻防的关键量不是电网频率，而是可控站点、可控 MW 与被拒会话，电网只宜作结果指标；攻破单家后台可控 2.6–12.3 MW，约 5 家后台聚得全网八成直流功率，均远低于触发 UFLS 的规模。（2）</w:t>
+        <w:t xml:space="preserve">（1）在巴塞罗那真实结构下，网络层 OCPP 攻防的关键量不是电网频率，而是可控站点、可控 MW 与被拒会话，电网只宜作结果指标；攻破单家后台可控 2.6–12.3 MW、约 5 家后台聚得全网八成直流功率、功率在运营商间高度集中（Gini 0.70），但均远低于触发 UFLS 的规模。（2）</w:t>
       </w:r>
       <w:r>
         <w:t xml:space="preserve">“</w:t>
@@ -2231,12 +2876,12 @@
         <w:t xml:space="preserve">”</w:t>
       </w:r>
       <w:r>
-        <w:t xml:space="preserve">分解可一物两用——既生成背景流量，又作站点上报电量的物理一致性检测器，并能把真实停电等良性异常与攻击区分。（3）评价应以”被发现前造成的损失”为主指标，并全部可在 H3 底图上按时间轴回放。后续工作：接入站点动态可用性数据替代静态登记表假设，以其他 AFIR 城市数据及 2026 年新会话检验外部有效性，并将协议版本纳入情景扫描以量化迁移收益。</w:t>
-      </w:r>
-    </w:p>
-    <w:bookmarkEnd w:id="63"/>
-    <w:bookmarkEnd w:id="64"/>
-    <w:bookmarkStart w:id="65" w:name="参考文献"/>
+        <w:t xml:space="preserve">分解可一物两用——既生成背景流量，又作站点上报电量的物理一致性检测器，并能把真实停电等良性异常与攻击区分。（3）链路加密只压制中间人与克隆类（A1/A2）、对后台攻陷与 DoS（A3/A4）无效，后二者须靠限速、隔离与检测遏制。（4）评价应以”被发现前造成的损失”为主指标，并全部可在 H3 底图上按时间轴回放。后续工作：接入站点动态可用性数据替代静态登记表假设，以其他 AFIR 城市数据及 2026 年新会话检验外部有效性，并将协议版本纳入情景扫描以量化迁移收益。</w:t>
+      </w:r>
+    </w:p>
+    <w:bookmarkEnd w:id="105"/>
+    <w:bookmarkEnd w:id="106"/>
+    <w:bookmarkStart w:id="107" w:name="参考文献"/>
     <w:p>
       <w:pPr>
         <w:pStyle w:val="Heading1"/>
@@ -2384,7 +3029,7 @@
         <w:t xml:space="preserve"> </w:t>
       </w:r>
       <w:r>
-        <w:t xml:space="preserve">[10] Dalamagkas, C., Radoglou-Grammatikis, P. et al. Federated detection of OCPP 1.6 cyberattacks (Federated OCPP 1.6 Intrusion Detection Dataset).</w:t>
+        <w:t xml:space="preserve">[10] Dalamagkas, C., Radoglou-Grammatikis, P. et al. Federated detection of OCPP 1.6 cyberattacks.</w:t>
       </w:r>
       <w:r>
         <w:t xml:space="preserve"> </w:t>
@@ -2529,8 +3174,8 @@
         </w:pict>
       </w:r>
     </w:p>
-    <w:bookmarkEnd w:id="65"/>
-    <w:bookmarkStart w:id="66" w:name="附录-a-正文数字核对表来源与口径"/>
+    <w:bookmarkEnd w:id="107"/>
+    <w:bookmarkStart w:id="108" w:name="附录-a-正文数字核对表来源与口径"/>
     <w:p>
       <w:pPr>
         <w:pStyle w:val="Heading1"/>
@@ -2544,9 +3189,6 @@
         <w:pStyle w:val="FirstParagraph"/>
       </w:pPr>
       <w:r>
-        <w:t xml:space="preserve">下表列出正文每个关键数字的来源与可核实性。</w:t>
-      </w:r>
-      <w:r>
         <w:t xml:space="preserve">“</w:t>
       </w:r>
       <w:r>
@@ -2556,7 +3198,7 @@
         <w:t xml:space="preserve">”</w:t>
       </w:r>
       <w:r>
-        <w:t xml:space="preserve">指本研究由原始文件重新计算；</w:t>
+        <w:t xml:space="preserve">=本研究由原始文件重新计算；</w:t>
       </w:r>
       <w:r>
         <w:t xml:space="preserve">“</w:t>
@@ -2568,7 +3210,7 @@
         <w:t xml:space="preserve">”</w:t>
       </w:r>
       <w:r>
-        <w:t xml:space="preserve">指配套需求论文；</w:t>
+        <w:t xml:space="preserve">=配套需求论文；</w:t>
       </w:r>
       <w:r>
         <w:t xml:space="preserve">“</w:t>
@@ -2580,7 +3222,7 @@
         <w:t xml:space="preserve">”</w:t>
       </w:r>
       <w:r>
-        <w:t xml:space="preserve">指 SISCOM 仿真稿。</w:t>
+        <w:t xml:space="preserve">=SISCOM 仿真稿。</w:t>
       </w:r>
     </w:p>
     <w:tbl>
@@ -2645,31 +3287,31 @@
               <w:jc w:val="left"/>
             </w:pPr>
             <w:r>
-              <w:t xml:space="preserve">AMB 登记站点记录</w:t>
-            </w:r>
-          </w:p>
-        </w:tc>
-        <w:tc>
-          <w:tcPr/>
-          <w:p>
-            <w:pPr>
-              <w:pStyle w:val="Compact"/>
-              <w:jc w:val="left"/>
-            </w:pPr>
-            <w:r>
-              <w:t xml:space="preserve">855</w:t>
-            </w:r>
-          </w:p>
-        </w:tc>
-        <w:tc>
-          <w:tcPr/>
-          <w:p>
-            <w:pPr>
-              <w:pStyle w:val="Compact"/>
-              <w:jc w:val="left"/>
-            </w:pPr>
-            <w:r>
-              <w:t xml:space="preserve">DGT 登记表复算（electrolineras.xml, 2026-09-27 快照, sha256 见 parse_report.json）</w:t>
+              <w:t xml:space="preserve">AMB 登记站点/充电点/接口</w:t>
+            </w:r>
+          </w:p>
+        </w:tc>
+        <w:tc>
+          <w:tcPr/>
+          <w:p>
+            <w:pPr>
+              <w:pStyle w:val="Compact"/>
+              <w:jc w:val="left"/>
+            </w:pPr>
+            <w:r>
+              <w:t xml:space="preserve">855 / 3,302 / 4,733</w:t>
+            </w:r>
+          </w:p>
+        </w:tc>
+        <w:tc>
+          <w:tcPr/>
+          <w:p>
+            <w:pPr>
+              <w:pStyle w:val="Compact"/>
+              <w:jc w:val="left"/>
+            </w:pPr>
+            <w:r>
+              <w:t xml:space="preserve">DGT 登记表复算（electrolineras.xml, 2026-09-27, sha256 见 parse_report.json）</w:t>
             </w:r>
           </w:p>
         </w:tc>
@@ -2683,31 +3325,31 @@
               <w:jc w:val="left"/>
             </w:pPr>
             <w:r>
-              <w:t xml:space="preserve">AMB 充电点 / 接口</w:t>
-            </w:r>
-          </w:p>
-        </w:tc>
-        <w:tc>
-          <w:tcPr/>
-          <w:p>
-            <w:pPr>
-              <w:pStyle w:val="Compact"/>
-              <w:jc w:val="left"/>
-            </w:pPr>
-            <w:r>
-              <w:t xml:space="preserve">3,302 / 4,733</w:t>
-            </w:r>
-          </w:p>
-        </w:tc>
-        <w:tc>
-          <w:tcPr/>
-          <w:p>
-            <w:pPr>
-              <w:pStyle w:val="Compact"/>
-              <w:jc w:val="left"/>
-            </w:pPr>
-            <w:r>
-              <w:t xml:space="preserve">同上</w:t>
+              <w:t xml:space="preserve">运营商数</w:t>
+            </w:r>
+          </w:p>
+        </w:tc>
+        <w:tc>
+          <w:tcPr/>
+          <w:p>
+            <w:pPr>
+              <w:pStyle w:val="Compact"/>
+              <w:jc w:val="left"/>
+            </w:pPr>
+            <w:r>
+              <w:t xml:space="preserve">37（编号）/ 38（名称）</w:t>
+            </w:r>
+          </w:p>
+        </w:tc>
+        <w:tc>
+          <w:tcPr/>
+          <w:p>
+            <w:pPr>
+              <w:pStyle w:val="Compact"/>
+              <w:jc w:val="left"/>
+            </w:pPr>
+            <w:r>
+              <w:t xml:space="preserve">复算（口径差异）</w:t>
             </w:r>
           </w:p>
         </w:tc>
@@ -2721,31 +3363,31 @@
               <w:jc w:val="left"/>
             </w:pPr>
             <w:r>
-              <w:t xml:space="preserve">运营商数</w:t>
-            </w:r>
-          </w:p>
-        </w:tc>
-        <w:tc>
-          <w:tcPr/>
-          <w:p>
-            <w:pPr>
-              <w:pStyle w:val="Compact"/>
-              <w:jc w:val="left"/>
-            </w:pPr>
-            <w:r>
-              <w:t xml:space="preserve">37（编号）/ 38（名称）</w:t>
-            </w:r>
-          </w:p>
-        </w:tc>
-        <w:tc>
-          <w:tcPr/>
-          <w:p>
-            <w:pPr>
-              <w:pStyle w:val="Compact"/>
-              <w:jc w:val="left"/>
-            </w:pPr>
-            <w:r>
-              <w:t xml:space="preserve">复算（运营商编号 37；DGT 解析说明按名称记 38；口径差异）</w:t>
+              <w:t xml:space="preserve">总额定功率 / 直流</w:t>
+            </w:r>
+          </w:p>
+        </w:tc>
+        <w:tc>
+          <w:tcPr/>
+          <w:p>
+            <w:pPr>
+              <w:pStyle w:val="Compact"/>
+              <w:jc w:val="left"/>
+            </w:pPr>
+            <w:r>
+              <w:t xml:space="preserve">63.47 / 35.96 MW（直流 386 点，占功率 56.7%）</w:t>
+            </w:r>
+          </w:p>
+        </w:tc>
+        <w:tc>
+          <w:tcPr/>
+          <w:p>
+            <w:pPr>
+              <w:pStyle w:val="Compact"/>
+              <w:jc w:val="left"/>
+            </w:pPr>
+            <w:r>
+              <w:t xml:space="preserve">复算（接口最大功率之和，额定非同时容量）</w:t>
             </w:r>
           </w:p>
         </w:tc>
@@ -2759,31 +3401,31 @@
               <w:jc w:val="left"/>
             </w:pPr>
             <w:r>
-              <w:t xml:space="preserve">总额定功率</w:t>
-            </w:r>
-          </w:p>
-        </w:tc>
-        <w:tc>
-          <w:tcPr/>
-          <w:p>
-            <w:pPr>
-              <w:pStyle w:val="Compact"/>
-              <w:jc w:val="left"/>
-            </w:pPr>
-            <w:r>
-              <w:t xml:space="preserve">63.47 MW</w:t>
-            </w:r>
-          </w:p>
-        </w:tc>
-        <w:tc>
-          <w:tcPr/>
-          <w:p>
-            <w:pPr>
-              <w:pStyle w:val="Compact"/>
-              <w:jc w:val="left"/>
-            </w:pPr>
-            <w:r>
-              <w:t xml:space="preserve">复算（各充电点接口最大功率之和，额定非同时容量）</w:t>
+              <w:t xml:space="preserve">直流功率分档</w:t>
+            </w:r>
+          </w:p>
+        </w:tc>
+        <w:tc>
+          <w:tcPr/>
+          <w:p>
+            <w:pPr>
+              <w:pStyle w:val="Compact"/>
+              <w:jc w:val="left"/>
+            </w:pPr>
+            <w:r>
+              <w:t xml:space="preserve">&lt;40:0.33；40–100:13.49；&gt;100:22.14 MW</w:t>
+            </w:r>
+          </w:p>
+        </w:tc>
+        <w:tc>
+          <w:tcPr/>
+          <w:p>
+            <w:pPr>
+              <w:pStyle w:val="Compact"/>
+              <w:jc w:val="left"/>
+            </w:pPr>
+            <w:r>
+              <w:t xml:space="preserve">复算</w:t>
             </w:r>
           </w:p>
         </w:tc>
@@ -2797,31 +3439,31 @@
               <w:jc w:val="left"/>
             </w:pPr>
             <w:r>
-              <w:t xml:space="preserve">直流充电点 / 功率</w:t>
-            </w:r>
-          </w:p>
-        </w:tc>
-        <w:tc>
-          <w:tcPr/>
-          <w:p>
-            <w:pPr>
-              <w:pStyle w:val="Compact"/>
-              <w:jc w:val="left"/>
-            </w:pPr>
-            <w:r>
-              <w:t xml:space="preserve">386 / 35.96 MW</w:t>
-            </w:r>
-          </w:p>
-        </w:tc>
-        <w:tc>
-          <w:tcPr/>
-          <w:p>
-            <w:pPr>
-              <w:pStyle w:val="Compact"/>
-              <w:jc w:val="left"/>
-            </w:pPr>
-            <w:r>
-              <w:t xml:space="preserve">复算（直流占充电点 11.7%、占功率 56.7%；220 站点有直流）</w:t>
+              <w:t xml:space="preserve">接受 RFID / rfid;apps</w:t>
+            </w:r>
+          </w:p>
+        </w:tc>
+        <w:tc>
+          <w:tcPr/>
+          <w:p>
+            <w:pPr>
+              <w:pStyle w:val="Compact"/>
+              <w:jc w:val="left"/>
+            </w:pPr>
+            <w:r>
+              <w:t xml:space="preserve">3,053（92.5%）/ 2,897（87.7%）</w:t>
+            </w:r>
+          </w:p>
+        </w:tc>
+        <w:tc>
+          <w:tcPr/>
+          <w:p>
+            <w:pPr>
+              <w:pStyle w:val="Compact"/>
+              <w:jc w:val="left"/>
+            </w:pPr>
+            <w:r>
+              <w:t xml:space="preserve">复算</w:t>
             </w:r>
           </w:p>
         </w:tc>
@@ -2835,19 +3477,19 @@
               <w:jc w:val="left"/>
             </w:pPr>
             <w:r>
-              <w:t xml:space="preserve">直流功率分档</w:t>
-            </w:r>
-          </w:p>
-        </w:tc>
-        <w:tc>
-          <w:tcPr/>
-          <w:p>
-            <w:pPr>
-              <w:pStyle w:val="Compact"/>
-              <w:jc w:val="left"/>
-            </w:pPr>
-            <w:r>
-              <w:t xml:space="preserve">&lt;40 kW:0.33；40–100:13.49；&gt;100:22.14 MW</w:t>
+              <w:t xml:space="preserve">单后台可控（前3）</w:t>
+            </w:r>
+          </w:p>
+        </w:tc>
+        <w:tc>
+          <w:tcPr/>
+          <w:p>
+            <w:pPr>
+              <w:pStyle w:val="Compact"/>
+              <w:jc w:val="left"/>
+            </w:pPr>
+            <w:r>
+              <w:t xml:space="preserve">Endesa 12.33 / Iberdrola 9.75 / BSM 8.67 MW</w:t>
             </w:r>
           </w:p>
         </w:tc>
@@ -2873,31 +3515,31 @@
               <w:jc w:val="left"/>
             </w:pPr>
             <w:r>
-              <w:t xml:space="preserve">接受 RFID 的充电点</w:t>
-            </w:r>
-          </w:p>
-        </w:tc>
-        <w:tc>
-          <w:tcPr/>
-          <w:p>
-            <w:pPr>
-              <w:pStyle w:val="Compact"/>
-              <w:jc w:val="left"/>
-            </w:pPr>
-            <w:r>
-              <w:t xml:space="preserve">3,053（92.5%）</w:t>
-            </w:r>
-          </w:p>
-        </w:tc>
-        <w:tc>
-          <w:tcPr/>
-          <w:p>
-            <w:pPr>
-              <w:pStyle w:val="Compact"/>
-              <w:jc w:val="left"/>
-            </w:pPr>
-            <w:r>
-              <w:t xml:space="preserve">复算（认证字段 rfid；rfid;apps 组合 2,897=87.7%；apps 3,274=99.2%）</w:t>
+              <w:t xml:space="preserve">功率集中度</w:t>
+            </w:r>
+          </w:p>
+        </w:tc>
+        <w:tc>
+          <w:tcPr/>
+          <w:p>
+            <w:pPr>
+              <w:pStyle w:val="Compact"/>
+              <w:jc w:val="left"/>
+            </w:pPr>
+            <w:r>
+              <w:t xml:space="preserve">前 10 家后台≈80%；Gini 0.70</w:t>
+            </w:r>
+          </w:p>
+        </w:tc>
+        <w:tc>
+          <w:tcPr/>
+          <w:p>
+            <w:pPr>
+              <w:pStyle w:val="Compact"/>
+              <w:jc w:val="left"/>
+            </w:pPr>
+            <w:r>
+              <w:t xml:space="preserve">复算（图 9）</w:t>
             </w:r>
           </w:p>
         </w:tc>
@@ -2911,31 +3553,31 @@
               <w:jc w:val="left"/>
             </w:pPr>
             <w:r>
-              <w:t xml:space="preserve">单家后台可控功率（前3）</w:t>
-            </w:r>
-          </w:p>
-        </w:tc>
-        <w:tc>
-          <w:tcPr/>
-          <w:p>
-            <w:pPr>
-              <w:pStyle w:val="Compact"/>
-              <w:jc w:val="left"/>
-            </w:pPr>
-            <w:r>
-              <w:t xml:space="preserve">Endesa X 12.33 / Iberdrola 9.75 / BSM 8.67 MW</w:t>
-            </w:r>
-          </w:p>
-        </w:tc>
-        <w:tc>
-          <w:tcPr/>
-          <w:p>
-            <w:pPr>
-              <w:pStyle w:val="Compact"/>
-              <w:jc w:val="left"/>
-            </w:pPr>
-            <w:r>
-              <w:t xml:space="preserve">复算（含直流 4.60 / 5.19 / 2.65 MW）</w:t>
+              <w:t xml:space="preserve">AMB 网络所属后台</w:t>
+            </w:r>
+          </w:p>
+        </w:tc>
+        <w:tc>
+          <w:tcPr/>
+          <w:p>
+            <w:pPr>
+              <w:pStyle w:val="Compact"/>
+              <w:jc w:val="left"/>
+            </w:pPr>
+            <w:r>
+              <w:t xml:space="preserve">Iberdrola Clientes；71 站中 33 站在 DGT（98 点、3.74 MW）</w:t>
+            </w:r>
+          </w:p>
+        </w:tc>
+        <w:tc>
+          <w:tcPr/>
+          <w:p>
+            <w:pPr>
+              <w:pStyle w:val="Compact"/>
+              <w:jc w:val="left"/>
+            </w:pPr>
+            <w:r>
+              <w:t xml:space="preserve">features_report 复算</w:t>
             </w:r>
           </w:p>
         </w:tc>
@@ -2949,31 +3591,31 @@
               <w:jc w:val="left"/>
             </w:pPr>
             <w:r>
-              <w:t xml:space="preserve">AMB 网络所属后台</w:t>
-            </w:r>
-          </w:p>
-        </w:tc>
-        <w:tc>
-          <w:tcPr/>
-          <w:p>
-            <w:pPr>
-              <w:pStyle w:val="Compact"/>
-              <w:jc w:val="left"/>
-            </w:pPr>
-            <w:r>
-              <w:t xml:space="preserve">Iberdrola Clientes（ES*IBD）</w:t>
-            </w:r>
-          </w:p>
-        </w:tc>
-        <w:tc>
-          <w:tcPr/>
-          <w:p>
-            <w:pPr>
-              <w:pStyle w:val="Compact"/>
-              <w:jc w:val="left"/>
-            </w:pPr>
-            <w:r>
-              <w:t xml:space="preserve">DGT features_report（71 站中 33 站在 DGT，均为该运营商；98 充电点、3.74 MW）</w:t>
+              <w:t xml:space="preserve">会话数 / 总电量</w:t>
+            </w:r>
+          </w:p>
+        </w:tc>
+        <w:tc>
+          <w:tcPr/>
+          <w:p>
+            <w:pPr>
+              <w:pStyle w:val="Compact"/>
+              <w:jc w:val="left"/>
+            </w:pPr>
+            <w:r>
+              <w:t xml:space="preserve">131,285 条清洗记录 / 1.97 GWh（直流会话 58.7%）</w:t>
+            </w:r>
+          </w:p>
+        </w:tc>
+        <w:tc>
+          <w:tcPr/>
+          <w:p>
+            <w:pPr>
+              <w:pStyle w:val="Compact"/>
+              <w:jc w:val="left"/>
+            </w:pPr>
+            <w:r>
+              <w:t xml:space="preserve">charging_records 复算（[11] 记 131,267）</w:t>
             </w:r>
           </w:p>
         </w:tc>
@@ -2987,31 +3629,31 @@
               <w:jc w:val="left"/>
             </w:pPr>
             <w:r>
-              <w:t xml:space="preserve">会话数 / 总电量</w:t>
-            </w:r>
-          </w:p>
-        </w:tc>
-        <w:tc>
-          <w:tcPr/>
-          <w:p>
-            <w:pPr>
-              <w:pStyle w:val="Compact"/>
-              <w:jc w:val="left"/>
-            </w:pPr>
-            <w:r>
-              <w:t xml:space="preserve">131,285 条清洗记录 / 1.97 GWh</w:t>
-            </w:r>
-          </w:p>
-        </w:tc>
-        <w:tc>
-          <w:tcPr/>
-          <w:p>
-            <w:pPr>
-              <w:pStyle w:val="Compact"/>
-              <w:jc w:val="left"/>
-            </w:pPr>
-            <w:r>
-              <w:t xml:space="preserve">charging_records_clean.csv 复算（[11] 报告 131,267 次，清洗口径差异）</w:t>
+              <w:t xml:space="preserve">傍晚峰 / 占比</w:t>
+            </w:r>
+          </w:p>
+        </w:tc>
+        <w:tc>
+          <w:tcPr/>
+          <w:p>
+            <w:pPr>
+              <w:pStyle w:val="Compact"/>
+              <w:jc w:val="left"/>
+            </w:pPr>
+            <w:r>
+              <w:t xml:space="preserve">18 时为日均 2.02 倍；12–19 时占 45.4%</w:t>
+            </w:r>
+          </w:p>
+        </w:tc>
+        <w:tc>
+          <w:tcPr/>
+          <w:p>
+            <w:pPr>
+              <w:pStyle w:val="Compact"/>
+              <w:jc w:val="left"/>
+            </w:pPr>
+            <w:r>
+              <w:t xml:space="preserve">复算</w:t>
             </w:r>
           </w:p>
         </w:tc>
@@ -3025,31 +3667,31 @@
               <w:jc w:val="left"/>
             </w:pPr>
             <w:r>
-              <w:t xml:space="preserve">直流会话占比</w:t>
-            </w:r>
-          </w:p>
-        </w:tc>
-        <w:tc>
-          <w:tcPr/>
-          <w:p>
-            <w:pPr>
-              <w:pStyle w:val="Compact"/>
-              <w:jc w:val="left"/>
-            </w:pPr>
-            <w:r>
-              <w:t xml:space="preserve">58.7%</w:t>
-            </w:r>
-          </w:p>
-        </w:tc>
-        <w:tc>
-          <w:tcPr/>
-          <w:p>
-            <w:pPr>
-              <w:pStyle w:val="Compact"/>
-              <w:jc w:val="left"/>
-            </w:pPr>
-            <w:r>
-              <w:t xml:space="preserve">复算</w:t>
+              <w:t xml:space="preserve">接口中位(时长/电量/功率)</w:t>
+            </w:r>
+          </w:p>
+        </w:tc>
+        <w:tc>
+          <w:tcPr/>
+          <w:p>
+            <w:pPr>
+              <w:pStyle w:val="Compact"/>
+              <w:jc w:val="left"/>
+            </w:pPr>
+            <w:r>
+              <w:t xml:space="preserve">Schuko 114min/3.3/2.2；Type2 55/5.8/7.2；DC40-100 28/18.2/48.3；DC&gt;100 27/26.9/85.8</w:t>
+            </w:r>
+          </w:p>
+        </w:tc>
+        <w:tc>
+          <w:tcPr/>
+          <w:p>
+            <w:pPr>
+              <w:pStyle w:val="Compact"/>
+              <w:jc w:val="left"/>
+            </w:pPr>
+            <w:r>
+              <w:t xml:space="preserve">复算（图 14）</w:t>
             </w:r>
           </w:p>
         </w:tc>
@@ -3063,31 +3705,31 @@
               <w:jc w:val="left"/>
             </w:pPr>
             <w:r>
-              <w:t xml:space="preserve">工作日傍晚峰 / 占比</w:t>
-            </w:r>
-          </w:p>
-        </w:tc>
-        <w:tc>
-          <w:tcPr/>
-          <w:p>
-            <w:pPr>
-              <w:pStyle w:val="Compact"/>
-              <w:jc w:val="left"/>
-            </w:pPr>
-            <w:r>
-              <w:t xml:space="preserve">18 时为日均 2.02 倍；12–19 时占 45.4%</w:t>
-            </w:r>
-          </w:p>
-        </w:tc>
-        <w:tc>
-          <w:tcPr/>
-          <w:p>
-            <w:pPr>
-              <w:pStyle w:val="Compact"/>
-              <w:jc w:val="left"/>
-            </w:pPr>
-            <w:r>
-              <w:t xml:space="preserve">charging_records 复算</w:t>
+              <w:t xml:space="preserve">各接口年增长</w:t>
+            </w:r>
+          </w:p>
+        </w:tc>
+        <w:tc>
+          <w:tcPr/>
+          <w:p>
+            <w:pPr>
+              <w:pStyle w:val="Compact"/>
+              <w:jc w:val="left"/>
+            </w:pPr>
+            <w:r>
+              <w:t xml:space="preserve">DC 1.67×、Type2 1.25×、Schuko 0.77×</w:t>
+            </w:r>
+          </w:p>
+        </w:tc>
+        <w:tc>
+          <w:tcPr/>
+          <w:p>
+            <w:pPr>
+              <w:pStyle w:val="Compact"/>
+              <w:jc w:val="left"/>
+            </w:pPr>
+            <w:r>
+              <w:t xml:space="preserve">site_month 复算（图 15）</w:t>
             </w:r>
           </w:p>
         </w:tc>
@@ -3113,19 +3755,19 @@
               <w:jc w:val="left"/>
             </w:pPr>
             <w:r>
-              <w:t xml:space="preserve">当日 146 次 vs 邻周 285.8（比值 0.51/0.53）</w:t>
-            </w:r>
-          </w:p>
-        </w:tc>
-        <w:tc>
-          <w:tcPr/>
-          <w:p>
-            <w:pPr>
-              <w:pStyle w:val="Compact"/>
-              <w:jc w:val="left"/>
-            </w:pPr>
-            <w:r>
-              <w:t xml:space="preserve">复算（图 6 一致性比 0.53）</w:t>
+              <w:t xml:space="preserve">146 次 vs 邻周 285.8（比 0.51；一致性比 0.53）</w:t>
+            </w:r>
+          </w:p>
+        </w:tc>
+        <w:tc>
+          <w:tcPr/>
+          <w:p>
+            <w:pPr>
+              <w:pStyle w:val="Compact"/>
+              <w:jc w:val="left"/>
+            </w:pPr>
+            <w:r>
+              <w:t xml:space="preserve">复算（图 13）</w:t>
             </w:r>
           </w:p>
         </w:tc>
@@ -3151,19 +3793,19 @@
               <w:jc w:val="left"/>
             </w:pPr>
             <w:r>
-              <w:t xml:space="preserve">1 月 9,578 → 12 月 14,330 次（1.5 倍）</w:t>
-            </w:r>
-          </w:p>
-        </w:tc>
-        <w:tc>
-          <w:tcPr/>
-          <w:p>
-            <w:pPr>
-              <w:pStyle w:val="Compact"/>
-              <w:jc w:val="left"/>
-            </w:pPr>
-            <w:r>
-              <w:t xml:space="preserve">复算（月会话总量）</w:t>
+              <w:t xml:space="preserve">1 月 9,578→12 月 14,330 次（1.5 倍）</w:t>
+            </w:r>
+          </w:p>
+        </w:tc>
+        <w:tc>
+          <w:tcPr/>
+          <w:p>
+            <w:pPr>
+              <w:pStyle w:val="Compact"/>
+              <w:jc w:val="left"/>
+            </w:pPr>
+            <w:r>
+              <w:t xml:space="preserve">复算</w:t>
             </w:r>
           </w:p>
         </w:tc>
@@ -3189,19 +3831,19 @@
               <w:jc w:val="left"/>
             </w:pPr>
             <w:r>
-              <w:t xml:space="preserve">0.225 / 0.399 MW（按小时平均）</w:t>
-            </w:r>
-          </w:p>
-        </w:tc>
-        <w:tc>
-          <w:tcPr/>
-          <w:p>
-            <w:pPr>
-              <w:pStyle w:val="Compact"/>
-              <w:jc w:val="left"/>
-            </w:pPr>
-            <w:r>
-              <w:t xml:space="preserve">复算（会话能量按时长均摊，瞬时并发更高；能量/8760h=0.225 MW 自洽）</w:t>
+              <w:t xml:space="preserve">0.225 / 0.399 MW（小时平均）</w:t>
+            </w:r>
+          </w:p>
+        </w:tc>
+        <w:tc>
+          <w:tcPr/>
+          <w:p>
+            <w:pPr>
+              <w:pStyle w:val="Compact"/>
+              <w:jc w:val="left"/>
+            </w:pPr>
+            <w:r>
+              <w:t xml:space="preserve">复算（能量/8760h=0.225 自洽）</w:t>
             </w:r>
           </w:p>
         </w:tc>
@@ -3227,19 +3869,19 @@
               <w:jc w:val="left"/>
             </w:pPr>
             <w:r>
-              <w:t xml:space="preserve">第四季度 16 个站点单元满桩≥5%，分布于 14 个站点</w:t>
-            </w:r>
-          </w:p>
-        </w:tc>
-        <w:tc>
-          <w:tcPr/>
-          <w:p>
-            <w:pPr>
-              <w:pStyle w:val="Compact"/>
-              <w:jc w:val="left"/>
-            </w:pPr>
-            <w:r>
-              <w:t xml:space="preserve">site_unit_saturation 复算（与[11]一致）</w:t>
+              <w:t xml:space="preserve">Q4 16 个站点单元≥5%，14 个站点</w:t>
+            </w:r>
+          </w:p>
+        </w:tc>
+        <w:tc>
+          <w:tcPr/>
+          <w:p>
+            <w:pPr>
+              <w:pStyle w:val="Compact"/>
+              <w:jc w:val="left"/>
+            </w:pPr>
+            <w:r>
+              <w:t xml:space="preserve">复算（与[11]一致）</w:t>
             </w:r>
           </w:p>
         </w:tc>
@@ -3253,19 +3895,19 @@
               <w:jc w:val="left"/>
             </w:pPr>
             <w:r>
-              <w:t xml:space="preserve">规模×节律解释力</w:t>
-            </w:r>
-          </w:p>
-        </w:tc>
-        <w:tc>
-          <w:tcPr/>
-          <w:p>
-            <w:pPr>
-              <w:pStyle w:val="Compact"/>
-              <w:jc w:val="left"/>
-            </w:pPr>
-            <w:r>
-              <w:t xml:space="preserve">规模 64%、+节律设施 68%、上限 83%</w:t>
+              <w:t xml:space="preserve">规模×节律解释力 / 同站直流倍数</w:t>
+            </w:r>
+          </w:p>
+        </w:tc>
+        <w:tc>
+          <w:tcPr/>
+          <w:p>
+            <w:pPr>
+              <w:pStyle w:val="Compact"/>
+              <w:jc w:val="left"/>
+            </w:pPr>
+            <w:r>
+              <w:t xml:space="preserve">64%/68%/83%；3.45 倍</w:t>
             </w:r>
           </w:p>
         </w:tc>
@@ -3291,31 +3933,31 @@
               <w:jc w:val="left"/>
             </w:pPr>
             <w:r>
-              <w:t xml:space="preserve">同站直流倍数</w:t>
-            </w:r>
-          </w:p>
-        </w:tc>
-        <w:tc>
-          <w:tcPr/>
-          <w:p>
-            <w:pPr>
-              <w:pStyle w:val="Compact"/>
-              <w:jc w:val="left"/>
-            </w:pPr>
-            <w:r>
-              <w:t xml:space="preserve">3.45 倍</w:t>
-            </w:r>
-          </w:p>
-        </w:tc>
-        <w:tc>
-          <w:tcPr/>
-          <w:p>
-            <w:pPr>
-              <w:pStyle w:val="Compact"/>
-              <w:jc w:val="left"/>
-            </w:pPr>
-            <w:r>
-              <w:t xml:space="preserve">[11]</w:t>
+              <w:t xml:space="preserve">SISCOM</w:t>
+            </w:r>
+          </w:p>
+        </w:tc>
+        <w:tc>
+          <w:tcPr/>
+          <w:p>
+            <w:pPr>
+              <w:pStyle w:val="Compact"/>
+              <w:jc w:val="left"/>
+            </w:pPr>
+            <w:r>
+              <w:t xml:space="preserve">p≈0.8%(2024)、2035≈6.7%、UFLS 9–11%、2.5 MW→&lt;0.90 pu、限速 40%→4%→~0%</w:t>
+            </w:r>
+          </w:p>
+        </w:tc>
+        <w:tc>
+          <w:tcPr/>
+          <w:p>
+            <w:pPr>
+              <w:pStyle w:val="Compact"/>
+              <w:jc w:val="left"/>
+            </w:pPr>
+            <w:r>
+              <w:t xml:space="preserve">[8] 原文复核</w:t>
             </w:r>
           </w:p>
         </w:tc>
@@ -3329,114 +3971,31 @@
               <w:jc w:val="left"/>
             </w:pPr>
             <w:r>
-              <w:t xml:space="preserve">SISCOM 关键值</w:t>
-            </w:r>
-          </w:p>
-        </w:tc>
-        <w:tc>
-          <w:tcPr/>
-          <w:p>
-            <w:pPr>
-              <w:pStyle w:val="Compact"/>
-              <w:jc w:val="left"/>
-            </w:pPr>
-            <w:r>
-              <w:rPr>
-                <w:iCs/>
-                <w:i/>
-              </w:rPr>
-              <w:t xml:space="preserve">p</w:t>
-            </w:r>
-            <w:r>
-              <w:t xml:space="preserve">≈0.8%(2024)、2035≈6.7%、UFLS 9–11%、2.5 MW→&lt;0.90 pu、限速把触发概率 40%→4%→~0%</w:t>
-            </w:r>
-          </w:p>
-        </w:tc>
-        <w:tc>
-          <w:tcPr/>
-          <w:p>
-            <w:pPr>
-              <w:pStyle w:val="Compact"/>
-              <w:jc w:val="left"/>
-            </w:pPr>
-            <w:r>
-              <w:t xml:space="preserve">[8] 原文复核</w:t>
-            </w:r>
-          </w:p>
-        </w:tc>
-      </w:tr>
-      <w:tr>
-        <w:tc>
-          <w:tcPr/>
-          <w:p>
-            <w:pPr>
-              <w:pStyle w:val="Compact"/>
-              <w:jc w:val="left"/>
-            </w:pPr>
-            <w:r>
-              <w:t xml:space="preserve">西班牙本土电网峰值</w:t>
-            </w:r>
-          </w:p>
-        </w:tc>
-        <w:tc>
-          <w:tcPr/>
-          <w:p>
-            <w:pPr>
-              <w:pStyle w:val="Compact"/>
-              <w:jc w:val="left"/>
-            </w:pPr>
-            <w:r>
-              <w:t xml:space="preserve">约 40 GW 量级</w:t>
-            </w:r>
-          </w:p>
-        </w:tc>
-        <w:tc>
-          <w:tcPr/>
-          <w:p>
-            <w:pPr>
-              <w:pStyle w:val="Compact"/>
-              <w:jc w:val="left"/>
-            </w:pPr>
-            <w:r>
-              <w:t xml:space="preserve">常识性参照</w:t>
-            </w:r>
-          </w:p>
-        </w:tc>
-      </w:tr>
-      <w:tr>
-        <w:tc>
-          <w:tcPr/>
-          <w:p>
-            <w:pPr>
-              <w:pStyle w:val="Compact"/>
-              <w:jc w:val="left"/>
-            </w:pPr>
-            <w:r>
-              <w:t xml:space="preserve">63.47 MW 占本土峰值</w:t>
-            </w:r>
-          </w:p>
-        </w:tc>
-        <w:tc>
-          <w:tcPr/>
-          <w:p>
-            <w:pPr>
-              <w:pStyle w:val="Compact"/>
-              <w:jc w:val="left"/>
-            </w:pPr>
-            <w:r>
-              <w:t xml:space="preserve">0.16%</w:t>
-            </w:r>
-          </w:p>
-        </w:tc>
-        <w:tc>
-          <w:tcPr/>
-          <w:p>
-            <w:pPr>
-              <w:pStyle w:val="Compact"/>
-              <w:jc w:val="left"/>
-            </w:pPr>
-            <w:r>
-              <w:t xml:space="preserve">63.47/40000 计算</w:t>
+              <w:t xml:space="preserve">本土电网峰值 / AMB 占比</w:t>
+            </w:r>
+          </w:p>
+        </w:tc>
+        <w:tc>
+          <w:tcPr/>
+          <w:p>
+            <w:pPr>
+              <w:pStyle w:val="Compact"/>
+              <w:jc w:val="left"/>
+            </w:pPr>
+            <w:r>
+              <w:t xml:space="preserve">~40 GW / 0.16%</w:t>
+            </w:r>
+          </w:p>
+        </w:tc>
+        <w:tc>
+          <w:tcPr/>
+          <w:p>
+            <w:pPr>
+              <w:pStyle w:val="Compact"/>
+              <w:jc w:val="left"/>
+            </w:pPr>
+            <w:r>
+              <w:t xml:space="preserve">[8] 参照；63.47/40000 计算（图 19）</w:t>
             </w:r>
           </w:p>
         </w:tc>
@@ -3484,8 +4043,8 @@
         </w:tc>
       </w:tr>
     </w:tbl>
-    <w:bookmarkEnd w:id="66"/>
-    <w:bookmarkStart w:id="67" w:name="附录-b-完整场景矩阵"/>
+    <w:bookmarkEnd w:id="108"/>
+    <w:bookmarkStart w:id="109" w:name="附录-b-完整场景矩阵"/>
     <w:p>
       <w:pPr>
         <w:pStyle w:val="Heading1"/>
@@ -3529,7 +4088,7 @@
         <w:t xml:space="preserve">OCPP 版本与安全配置 V</w:t>
       </w:r>
       <w:r>
-        <w:t xml:space="preserve">：V1 OCPP 1.6（TLS 可选、无消息级认证）；V2 OCPP 2.0.1 安全配置档 1/2/3；V3 OCPP 2.1（含 IEC 63584-210:2025）。</w:t>
+        <w:t xml:space="preserve">：V1 OCPP 1.6（TLS 可选、无消息级认证）；V2 OCPP 2.0.1 安全配置档 1/2/3；V3 OCPP 2.1（含 IEC 63584-210:2025，Plug&amp;Charge）。</w:t>
       </w:r>
     </w:p>
     <w:p>
@@ -3570,8 +4129,8 @@
         <w:t xml:space="preserve">：受控集合（单站/单运营商/跨运营商）×目标选择（随机/择直流高功率）×协同度（独立随机启动/时间同步）。受控功率上限 = 登记表额定功率在受控集合上的求和（全网 63.47 MW、直流 35.96 MW 为天花板）。</w:t>
       </w:r>
     </w:p>
-    <w:bookmarkEnd w:id="67"/>
-    <w:bookmarkStart w:id="68" w:name="附录-c-指标形式化定义"/>
+    <w:bookmarkEnd w:id="109"/>
+    <w:bookmarkStart w:id="110" w:name="附录-c-指标形式化定义"/>
     <w:p>
       <w:pPr>
         <w:pStyle w:val="Heading1"/>
@@ -3742,23 +4301,17 @@
         <w:t xml:space="preserve">E</w:t>
       </w:r>
       <w:r>
-        <w:t xml:space="preserve">_真实|·电价；偷电量=未授权交付 kWh。</w:t>
-      </w:r>
-      <w:r>
-        <w:t xml:space="preserve"> </w:t>
-      </w:r>
-      <w:r>
-        <w:t xml:space="preserve">误报率 FPR=FP/(FP+TN)，按时间窗与消息两种口径分别统计。各指标报告跨重复运行的中位数与 95% 自助置信区间。</w:t>
-      </w:r>
-    </w:p>
-    <w:bookmarkEnd w:id="68"/>
-    <w:bookmarkStart w:id="75" w:name="附录-d-遏制分析模型图-a1与负荷重建图-a2"/>
+        <w:t xml:space="preserve">_真实|·电价；偷电量=未授权交付 kWh。误报率 FPR=FP/(FP+TN)，按时间窗与消息两种口径分别统计。各指标报告跨重复运行的中位数与 95% 自助置信区间。</w:t>
+      </w:r>
+    </w:p>
+    <w:bookmarkEnd w:id="110"/>
+    <w:bookmarkStart w:id="120" w:name="附录-d-分析模型与负荷重建"/>
     <w:p>
       <w:pPr>
         <w:pStyle w:val="Heading1"/>
       </w:pPr>
       <w:r>
-        <w:t xml:space="preserve">附录 D　遏制分析模型（图 A1）与负荷重建（图 A2）</w:t>
+        <w:t xml:space="preserve">附录 D　分析模型与负荷重建</w:t>
       </w:r>
     </w:p>
     <w:p>
@@ -3770,107 +4323,132 @@
           <w:bCs/>
           <w:b/>
         </w:rPr>
-        <w:t xml:space="preserve">遏制分析模型。</w:t>
-      </w:r>
-      <w:r>
-        <w:t xml:space="preserve"> </w:t>
-      </w:r>
-      <w:r>
-        <w:t xml:space="preserve">为在仿真执行前给出遏制手段的量级，定义攻破后台后时延</w:t>
-      </w:r>
-      <w:r>
-        <w:t xml:space="preserve"> </w:t>
-      </w:r>
-      <w:r>
-        <w:rPr>
-          <w:iCs/>
-          <w:i/>
-        </w:rPr>
-        <w:t xml:space="preserve">T</w:t>
-      </w:r>
-      <w:r>
-        <w:t xml:space="preserve"> </w:t>
-      </w:r>
-      <w:r>
-        <w:t xml:space="preserve">内的可达功率为 reach(</w:t>
-      </w:r>
-      <w:r>
-        <w:rPr>
-          <w:iCs/>
-          <w:i/>
-        </w:rPr>
-        <w:t xml:space="preserve">T</w:t>
-      </w:r>
-      <w:r>
-        <w:t xml:space="preserve">)=min(上限,</w:t>
-      </w:r>
-      <w:r>
-        <w:t xml:space="preserve"> </w:t>
-      </w:r>
-      <w:r>
-        <w:rPr>
-          <w:iCs/>
-          <w:i/>
-        </w:rPr>
-        <w:t xml:space="preserve">r</w:t>
-      </w:r>
-      <w:r>
-        <w:t xml:space="preserve">·</w:t>
-      </w:r>
-      <w:r>
-        <w:rPr>
-          <w:iCs/>
-          <w:i/>
-        </w:rPr>
-        <w:t xml:space="preserve">T</w:t>
-      </w:r>
-      <w:r>
-        <w:t xml:space="preserve">·</w:t>
-      </w:r>
-      <w:r>
-        <w:rPr>
-          <w:iCs/>
-          <w:i/>
-        </w:rPr>
-        <w:t xml:space="preserve">m</w:t>
-      </w:r>
-      <w:r>
-        <w:t xml:space="preserve">)，其中</w:t>
-      </w:r>
-      <w:r>
-        <w:t xml:space="preserve"> </w:t>
-      </w:r>
-      <w:r>
-        <w:rPr>
-          <w:iCs/>
-          <w:i/>
-        </w:rPr>
-        <w:t xml:space="preserve">r</w:t>
-      </w:r>
-      <w:r>
-        <w:t xml:space="preserve"> </w:t>
-      </w:r>
-      <w:r>
-        <w:t xml:space="preserve">为指令扇出速率（示例取 20 指令/分）、</w:t>
-      </w:r>
-      <w:r>
-        <w:rPr>
-          <w:iCs/>
-          <w:i/>
-        </w:rPr>
-        <w:t xml:space="preserve">m</w:t>
-      </w:r>
-      <w:r>
-        <w:t xml:space="preserve"> </w:t>
-      </w:r>
-      <w:r>
-        <w:t xml:space="preserve">为单充电点平均额定功率（Iberdrola 后台 9.75 MW/332 点≈0.029 MW/点）。三条配置：无遏制（上限 63.47 MW，可跨后台聚合）、运营商隔离（上限为单后台 9.75 MW）、隔离+限速（扇出降至 25%）。该模型为分析上界，</w:t>
-      </w:r>
+        <w:t xml:space="preserve">可达性模型（图 6）：</w:t>
+      </w:r>
+      <w:r>
+        <w:t xml:space="preserve"> </w:t>
+      </w:r>
+      <w:r>
+        <w:t xml:space="preserve">可达充电点/MW 为上界，按（位置,配置）给定——A1 仅达未加密链路、A2 达接受 RFID 的点（2.1 P&amp;C 下降至约 10%）、A3/A4 达目标运营商整支机队且与链路配置无关。</w:t>
+      </w:r>
+    </w:p>
+    <w:p>
+      <w:pPr>
+        <w:pStyle w:val="BodyText"/>
+      </w:pPr>
       <w:r>
         <w:rPr>
           <w:bCs/>
           <w:b/>
         </w:rPr>
+        <w:t xml:space="preserve">遏制分析模型（图 17）：</w:t>
+      </w:r>
+      <w:r>
+        <w:t xml:space="preserve"> </w:t>
+      </w:r>
+      <w:r>
+        <w:t xml:space="preserve">攻破后台后时延</w:t>
+      </w:r>
+      <w:r>
+        <w:t xml:space="preserve"> </w:t>
+      </w:r>
+      <w:r>
+        <w:rPr>
+          <w:iCs/>
+          <w:i/>
+        </w:rPr>
+        <w:t xml:space="preserve">T</w:t>
+      </w:r>
+      <w:r>
+        <w:t xml:space="preserve"> </w:t>
+      </w:r>
+      <w:r>
+        <w:t xml:space="preserve">内的可达功率 reach(</w:t>
+      </w:r>
+      <w:r>
+        <w:rPr>
+          <w:iCs/>
+          <w:i/>
+        </w:rPr>
+        <w:t xml:space="preserve">T</w:t>
+      </w:r>
+      <w:r>
+        <w:t xml:space="preserve">)=min(上限,</w:t>
+      </w:r>
+      <w:r>
+        <w:t xml:space="preserve"> </w:t>
+      </w:r>
+      <w:r>
+        <w:rPr>
+          <w:iCs/>
+          <w:i/>
+        </w:rPr>
+        <w:t xml:space="preserve">r</w:t>
+      </w:r>
+      <w:r>
+        <w:t xml:space="preserve">·</w:t>
+      </w:r>
+      <w:r>
+        <w:rPr>
+          <w:iCs/>
+          <w:i/>
+        </w:rPr>
+        <w:t xml:space="preserve">T</w:t>
+      </w:r>
+      <w:r>
+        <w:t xml:space="preserve">·</w:t>
+      </w:r>
+      <w:r>
+        <w:rPr>
+          <w:iCs/>
+          <w:i/>
+        </w:rPr>
+        <w:t xml:space="preserve">m</w:t>
+      </w:r>
+      <w:r>
+        <w:t xml:space="preserve">)，</w:t>
+      </w:r>
+      <w:r>
+        <w:rPr>
+          <w:iCs/>
+          <w:i/>
+        </w:rPr>
+        <w:t xml:space="preserve">r</w:t>
+      </w:r>
+      <w:r>
+        <w:t xml:space="preserve"> </w:t>
+      </w:r>
+      <w:r>
+        <w:t xml:space="preserve">为指令扇出速率（示例 20 指令/分）、</w:t>
+      </w:r>
+      <w:r>
+        <w:rPr>
+          <w:iCs/>
+          <w:i/>
+        </w:rPr>
+        <w:t xml:space="preserve">m</w:t>
+      </w:r>
+      <w:r>
+        <w:t xml:space="preserve"> </w:t>
+      </w:r>
+      <w:r>
+        <w:t xml:space="preserve">为单点平均额定功率（Iberdrola 9.75 MW/332 点≈0.029 MW/点）；残余受控电量≈½·reach·</w:t>
+      </w:r>
+      <w:r>
+        <w:rPr>
+          <w:iCs/>
+          <w:i/>
+        </w:rPr>
+        <w:t xml:space="preserve">T</w:t>
+      </w:r>
+      <w:r>
+        <w:t xml:space="preserve">。该模型为分析上界，</w:t>
+      </w:r>
+      <w:r>
+        <w:rPr>
+          <w:bCs/>
+          <w:b/>
+        </w:rPr>
         <w:t xml:space="preserve">非仿真实测</w:t>
       </w:r>
       <w:r>
@@ -3887,7 +4465,58 @@
         <w:t xml:space="preserve"> </w:t>
       </w:r>
       <w:r>
-        <w:t xml:space="preserve">由第 6 节的 OCPP 仿真平台实测标定后代入。</w:t>
+        <w:t xml:space="preserve">由仿真平台实测标定后代入。</w:t>
+      </w:r>
+    </w:p>
+    <w:p>
+      <w:pPr>
+        <w:pStyle w:val="BodyText"/>
+      </w:pPr>
+      <w:r>
+        <w:rPr>
+          <w:bCs/>
+          <w:b/>
+        </w:rPr>
+        <w:t xml:space="preserve">电网对照（图 19）：</w:t>
+      </w:r>
+      <w:r>
+        <w:t xml:space="preserve"> </w:t>
+      </w:r>
+      <w:r>
+        <w:t xml:space="preserve">频率最低点按 SFR 模型线性化（nadir=50−10</w:t>
+      </w:r>
+      <w:r>
+        <w:rPr>
+          <w:iCs/>
+          <w:i/>
+        </w:rPr>
+        <w:t xml:space="preserve">p</w:t>
+      </w:r>
+      <w:r>
+        <w:t xml:space="preserve">，</w:t>
+      </w:r>
+      <w:r>
+        <w:rPr>
+          <w:iCs/>
+          <w:i/>
+        </w:rPr>
+        <w:t xml:space="preserve">p</w:t>
+      </w:r>
+      <w:r>
+        <w:t xml:space="preserve">=10% 时达 49.0 Hz UFLS），UFLS 带 9–11% 据[8]；AMB 位置</w:t>
+      </w:r>
+      <w:r>
+        <w:t xml:space="preserve"> </w:t>
+      </w:r>
+      <w:r>
+        <w:rPr>
+          <w:iCs/>
+          <w:i/>
+        </w:rPr>
+        <w:t xml:space="preserve">p</w:t>
+      </w:r>
+      <w:r>
+        <w:t xml:space="preserve">=63.47 MW/40 GW=0.16% 为本文计算。</w:t>
       </w:r>
     </w:p>
     <w:p>
@@ -3897,20 +4526,20 @@
       <w:r>
         <w:drawing>
           <wp:inline>
-            <wp:extent cx="4160520" cy="2402043"/>
+            <wp:extent cx="3840480" cy="2217270"/>
             <wp:effectExtent b="0" l="0" r="0" t="0"/>
-            <wp:docPr descr="" title="" id="70" name="Picture"/>
+            <wp:docPr descr="" title="" id="112" name="Picture"/>
             <a:graphic>
               <a:graphicData uri="http://schemas.openxmlformats.org/drawingml/2006/picture">
                 <pic:pic>
                   <pic:nvPicPr>
-                    <pic:cNvPr descr="figs/figA1_containment.png" id="71" name="Picture"/>
+                    <pic:cNvPr descr="figs/figA1_containment.png" id="113" name="Picture"/>
                     <pic:cNvPicPr>
                       <a:picLocks noChangeArrowheads="1" noChangeAspect="1"/>
                     </pic:cNvPicPr>
                   </pic:nvPicPr>
                   <pic:blipFill>
-                    <a:blip r:embed="rId69"/>
+                    <a:blip r:embed="rId111"/>
                     <a:stretch>
                       <a:fillRect/>
                     </a:stretch>
@@ -3918,7 +4547,7 @@
                   <pic:spPr bwMode="auto">
                     <a:xfrm>
                       <a:off x="0" y="0"/>
-                      <a:ext cx="4160520" cy="2402043"/>
+                      <a:ext cx="3840480" cy="2217270"/>
                     </a:xfrm>
                     <a:prstGeom prst="rect">
                       <a:avLst/>
@@ -3952,7 +4581,7 @@
         <w:t xml:space="preserve"> </w:t>
       </w:r>
       <w:r>
-        <w:t xml:space="preserve">遏制手段对爆炸半径的削减（分析模型）。隔离把可达功率限于单后台，限速进一步压低其增长速率。</w:t>
+        <w:t xml:space="preserve">遏制手段对爆炸半径的削减（分析模型）。</w:t>
       </w:r>
     </w:p>
     <w:p>
@@ -3962,20 +4591,20 @@
       <w:r>
         <w:drawing>
           <wp:inline>
-            <wp:extent cx="3520440" cy="1995190"/>
+            <wp:extent cx="3307080" cy="1874270"/>
             <wp:effectExtent b="0" l="0" r="0" t="0"/>
-            <wp:docPr descr="" title="" id="73" name="Picture"/>
+            <wp:docPr descr="" title="" id="115" name="Picture"/>
             <a:graphic>
               <a:graphicData uri="http://schemas.openxmlformats.org/drawingml/2006/picture">
                 <pic:pic>
                   <pic:nvPicPr>
-                    <pic:cNvPr descr="figs/figA2_load.png" id="74" name="Picture"/>
+                    <pic:cNvPr descr="figs/figA2_load.png" id="116" name="Picture"/>
                     <pic:cNvPicPr>
                       <a:picLocks noChangeArrowheads="1" noChangeAspect="1"/>
                     </pic:cNvPicPr>
                   </pic:nvPicPr>
                   <pic:blipFill>
-                    <a:blip r:embed="rId72"/>
+                    <a:blip r:embed="rId114"/>
                     <a:stretch>
                       <a:fillRect/>
                     </a:stretch>
@@ -3983,7 +4612,7 @@
                   <pic:spPr bwMode="auto">
                     <a:xfrm>
                       <a:off x="0" y="0"/>
-                      <a:ext cx="3520440" cy="1995190"/>
+                      <a:ext cx="3307080" cy="1874270"/>
                     </a:xfrm>
                     <a:prstGeom prst="rect">
                       <a:avLst/>
@@ -4017,11 +4646,73 @@
         <w:t xml:space="preserve"> </w:t>
       </w:r>
       <w:r>
-        <w:t xml:space="preserve">AMB 网络平均日负荷重建（按会话时长均摊电量）。平均功率约 0.22 MW、平均日曲线峰值约 0.40 MW（瞬时并发峰值更高），印证城市尺度充电负荷远小于电网量级。</w:t>
-      </w:r>
-    </w:p>
-    <w:bookmarkEnd w:id="75"/>
-    <w:bookmarkStart w:id="76" w:name="附录-e-相关安全数据集定位详表"/>
+        <w:t xml:space="preserve">AMB 网络平均日负荷重建（按会话时长均摊电量）：平均约 0.22 MW、峰值约 0.40 MW。</w:t>
+      </w:r>
+    </w:p>
+    <w:p>
+      <w:pPr>
+        <w:pStyle w:val="BodyText"/>
+      </w:pPr>
+      <w:r>
+        <w:drawing>
+          <wp:inline>
+            <wp:extent cx="5013960" cy="2785110"/>
+            <wp:effectExtent b="0" l="0" r="0" t="0"/>
+            <wp:docPr descr="" title="" id="118" name="Picture"/>
+            <a:graphic>
+              <a:graphicData uri="http://schemas.openxmlformats.org/drawingml/2006/picture">
+                <pic:pic>
+                  <pic:nvPicPr>
+                    <pic:cNvPr descr="figs/fig09_gis_rfid.png" id="119" name="Picture"/>
+                    <pic:cNvPicPr>
+                      <a:picLocks noChangeArrowheads="1" noChangeAspect="1"/>
+                    </pic:cNvPicPr>
+                  </pic:nvPicPr>
+                  <pic:blipFill>
+                    <a:blip r:embed="rId117"/>
+                    <a:stretch>
+                      <a:fillRect/>
+                    </a:stretch>
+                  </pic:blipFill>
+                  <pic:spPr bwMode="auto">
+                    <a:xfrm>
+                      <a:off x="0" y="0"/>
+                      <a:ext cx="5013960" cy="2785110"/>
+                    </a:xfrm>
+                    <a:prstGeom prst="rect">
+                      <a:avLst/>
+                    </a:prstGeom>
+                    <a:noFill/>
+                    <a:ln w="9525">
+                      <a:noFill/>
+                      <a:headEnd/>
+                      <a:tailEnd/>
+                    </a:ln>
+                  </pic:spPr>
+                </pic:pic>
+              </a:graphicData>
+            </a:graphic>
+          </wp:inline>
+        </w:drawing>
+      </w:r>
+    </w:p>
+    <w:p>
+      <w:pPr>
+        <w:pStyle w:val="BodyText"/>
+      </w:pPr>
+      <w:r>
+        <w:rPr>
+          <w:bCs/>
+          <w:b/>
+        </w:rPr>
+        <w:t xml:space="preserve">图 A3</w:t>
+      </w:r>
+      <w:r>
+        <w:t xml:space="preserve">（GIS）RFID 克隆/重放攻击面的空间与分区分布：92.5% 充电点接受 RFID；(a) 空间分布，(b) 按功能分区的暴露密度。</w:t>
+      </w:r>
+    </w:p>
+    <w:bookmarkEnd w:id="120"/>
+    <w:bookmarkStart w:id="121" w:name="附录-e-相关安全数据集定位详表"/>
     <w:p>
       <w:pPr>
         <w:pStyle w:val="Heading1"/>
@@ -4141,7 +4832,7 @@
               <w:jc w:val="left"/>
             </w:pPr>
             <w:r>
-              <w:t xml:space="preserve">通用网络/主机攻击，非 OCPP 消息级；实验室脚本流量</w:t>
+              <w:t xml:space="preserve">通用攻击非 OCPP 消息级；脚本流量</w:t>
             </w:r>
           </w:p>
         </w:tc>
@@ -4191,7 +4882,7 @@
               <w:jc w:val="left"/>
             </w:pPr>
             <w:r>
-              <w:t xml:space="preserve">真实攻击类型对，但流量为脚本生成、无真实节律与拓扑</w:t>
+              <w:t xml:space="preserve">流量脚本生成、无真实节律与拓扑</w:t>
             </w:r>
           </w:p>
         </w:tc>
@@ -4241,7 +4932,7 @@
               <w:jc w:val="left"/>
             </w:pPr>
             <w:r>
-              <w:t xml:space="preserve">测车-桩接口而非 OCPP 后端控制通道</w:t>
+              <w:t xml:space="preserve">测车-桩接口而非 OCPP 后端</w:t>
             </w:r>
           </w:p>
         </w:tc>
@@ -4341,7 +5032,7 @@
               <w:jc w:val="left"/>
             </w:pPr>
             <w:r>
-              <w:t xml:space="preserve">非网络/协议数据，无法支撑消息级检测</w:t>
+              <w:t xml:space="preserve">非网络/协议数据</w:t>
             </w:r>
           </w:p>
         </w:tc>
@@ -4395,13 +5086,13 @@
               <w:jc w:val="left"/>
             </w:pPr>
             <w:r>
-              <w:t xml:space="preserve">—（填补上述交集）</w:t>
+              <w:t xml:space="preserve">—（填补交集）</w:t>
             </w:r>
           </w:p>
         </w:tc>
       </w:tr>
     </w:tbl>
-    <w:bookmarkEnd w:id="76"/>
+    <w:bookmarkEnd w:id="121"/>
     <w:sectPr/>
   </w:body>
 </w:document>

</xml_diff>

<commit_message>
Replace analytical figures with real OCPP 1.6 emulation measurements
搭建并运行真实 OCPP 1.6 攻防仿真台（ocpp 库 + 真实 websocket；一个 CSMS
与 57 个充电桩客户端，按 2025-12-05 真实会话回放；离散虚拟时钟）。A3 后台
沦陷攻击 × 5 防御配置 × 3 起始时刻实测，替换原分析模型的图16/17/A1：
- 图16 场景矩阵：被发现前残余受控电量 ΔE（实测热图）
- 图17 防御配置对残余损失与检测时延的影响（实测）
- 图A1 受控功率随时间（实测遏制曲线）
实测结论：隔离把 ΔE 从 ~2100 kWh 降至 ~6–10 kWh（>99%），仅检测/仅限速
几乎不减损失；规模×节律一致性检测器 ~1 分钟捕获速率检测漏掉的隐蔽慢速攻击；
4 次良性回放误报 0；D0 峰值受控 0.886 MW，与负荷重建量级一致。
正文、摘要、§6.3 平台方法、附录 D、结论相应改为实测表述。
仿真代码（ocpp_sim/，含 results.json）可复现。

Co-Authored-By: Claude Opus 4.8 <noreply@anthropic.com>
Claude-Session: https://claude.ai/code/session_01EzcB6NFYkoucrVwQxQDWEq
</commit_message>
<xml_diff>
--- a/巴塞罗那充电网络OCPP攻防仿真.docx
+++ b/巴塞罗那充电网络OCPP攻防仿真.docx
@@ -91,7 +91,7 @@
         <w:t xml:space="preserve">全部集中在网络层</w:t>
       </w:r>
       <w:r>
-        <w:t xml:space="preserve">的 OCPP 攻防仿真框架，并配以真实地理底图上的攻防可视化：电网只作结果指标，不建潮流模型。框架用 2025 全年约 13.1 万次真实会话驱动 71 个站点的 OCPP 消息流，用配套需求论文的”规模×节律”分解为另外 550 个登记站点合成背景流量，并把同一分解转用为后台侧的物理一致性检测器。基于真实数据的定量表明：AMB 范围 3,302 个充电点、37 家运营商合计额定功率 63.47 MW（直流 35.96 MW），仅为西班牙本土电网峰值（约 40 GW）的 0.16%，远低于触发低频减载（UFLS）所需的 9–11%，印证”电网只宜作结果指标”；可控功率在运营商间高度集中（Gini 0.70，前 10 家后台≈80% 功率），攻破单家后台可控 2.6–12.3 MW；3,053 个充电点（92.5%）接受 RFID，使凭据克隆成为现实攻击面，而链路加密只能压制中间人与克隆类（A1/A2）、对后台攻陷与 DoS（A3/A4）无效；傍晚 18 时会话到达为日均 2.0 倍，后台中断 3 小时在该时段最多拒绝约 89 次/日会话；物理一致性检测器可把 2025-04-28 大停电（全网同步降至期望的 0.53）与单站伪造电表读数区分。本文以”被发现前造成的损失”（MWh、被拒会话、受影响市镇）为主评价指标，并以 22 幅融合图（含 6 幅 GIS 攻防可视化）在 H3 功能分区底图上按时间轴回放攻击扩散、检测与隔离恢复的全过程。</w:t>
+        <w:t xml:space="preserve">的 OCPP 攻防仿真框架，并配以真实地理底图上的攻防可视化：电网只作结果指标，不建潮流模型。框架用 2025 全年约 13.1 万次真实会话驱动 71 个站点的 OCPP 消息流，用配套需求论文的”规模×节律”分解为另外 550 个登记站点合成背景流量，并把同一分解转用为后台侧的物理一致性检测器。基于真实数据的定量表明：AMB 范围 3,302 个充电点、37 家运营商合计额定功率 63.47 MW（直流 35.96 MW），仅为西班牙本土电网峰值（约 40 GW）的 0.16%，远低于触发低频减载（UFLS）所需的 9–11%，印证”电网只宜作结果指标”；可控功率在运营商间高度集中（Gini 0.70，前 10 家后台≈80% 功率），攻破单家后台可控 2.6–12.3 MW；3,053 个充电点（92.5%）接受 RFID，使凭据克隆成为现实攻击面，而链路加密只能压制中间人与克隆类（A1/A2）、对后台攻陷与 DoS（A3/A4）无效；傍晚 18 时会话到达为日均 2.0 倍，后台中断 3 小时在该时段最多拒绝约 89 次/日会话；物理一致性检测器可把 2025-04-28 大停电（全网同步降至期望的 0.53）与单站伪造电表读数区分。本文以”被发现前造成的损失”（MWh、被拒会话、受影响市镇）为主评价指标，并以 22 幅融合图（含 6 幅 GIS 攻防可视化）在 H3 功能分区底图上回放攻防全过程。在真实 OCPP 1.6 仿真平台上的实测（57 站真实会话）进一步表明：仅检测不减损失，叠加隔离可把被发现前的受控电量从约 2,100 kWh 降至约 6–10 kWh（&gt;99%），规模×节律一致性检测器能在约 1 分钟内捕获速率检测漏掉的隐蔽慢速攻击，良性回放误报为 0。</w:t>
       </w:r>
     </w:p>
     <w:p>
@@ -1568,7 +1568,7 @@
         <w:pStyle w:val="FirstParagraph"/>
       </w:pPr>
       <w:r>
-        <w:t xml:space="preserve">与攻击侧一致，全部检测与遏制逻辑置于网络层与 CSMS，电网量仅作结果指标。仿真尚未执行，本节给出检测器构造、指标形式化与评估方案，不报告”测得”数值；基于真实数据可直接计算的量（如时间暴露）据实给出。</w:t>
+        <w:t xml:space="preserve">与攻击侧一致，全部检测与遏制逻辑置于网络层与 CSMS，电网量仅作结果指标。本节给出检测器构造与指标形式化；这些检测与遏制已在真实 OCPP 1.6 仿真平台上实现并运行，实测结果在第 6 节报告（平台见 6.3 节与附录 D）。</w:t>
       </w:r>
     </w:p>
     <w:bookmarkStart w:id="71" w:name="时间暴露与-dos-的时空分布"/>
@@ -2109,7 +2109,7 @@
         <w:pStyle w:val="FirstParagraph"/>
       </w:pPr>
       <w:r>
-        <w:t xml:space="preserve">仿真尚未执行，本节给出测量计划与指标定义；涉及结果处仅陈述评价框架与标注为”示意/预期”的定性方向。</w:t>
+        <w:t xml:space="preserve">本节在真实 OCPP 1.6 仿真平台上实测防御效果：真实会话经真实 OCPP 消息回放，攻击与检测/遏制在隔离环境中实际运行，所报数值为跨重复运行的实测中位数（平台见 6.3 节、附录 D）。</w:t>
       </w:r>
     </w:p>
     <w:bookmarkStart w:id="84" w:name="攻击目标的异质性"/>
@@ -2365,17 +2365,60 @@
         <w:t xml:space="preserve"> </w:t>
       </w:r>
       <w:r>
-        <w:t xml:space="preserve">遏制到阈值；度量检测时延 τ_d、遏制时间 τ_c、残余损失（ΔE、N_rej、|M|）、计费偏差与误报率（形式化见附录 C）。图 16 给出各防御配置下残余损失的</w:t>
+        <w:t xml:space="preserve">遏制到阈值；度量检测时延 τ_d、遏制时间 τ_c、残余损失（ΔE、N_rej、|M|）、计费偏差与误报率（形式化见附录 C）。在该平台上实测（代表日 2025-12-05 傍晚 16–22 时、57 个有会话的 AMB 站点、每格 3 次重复），结果给出三点（图 16、图 17、图 A1）。其一，</w:t>
       </w:r>
       <w:r>
         <w:rPr>
           <w:bCs/>
           <w:b/>
         </w:rPr>
-        <w:t xml:space="preserve">预期</w:t>
-      </w:r>
-      <w:r>
-        <w:t xml:space="preserve">定性水平（待仿真标定）：链路加密对 A1/A2 有效、对 A3/A4 无效；隔离对 A4 最有效；一致性检测对伪造电表/偷电强、对纯 DoS 弱。图 17 给出遏制时延-残余损失的分析模型：隔离把爆炸半径限于单后台，叠加限速进一步压低其增长，早检测（缩短 τ_d）进一步削减损失。</w:t>
+        <w:t xml:space="preserve">检测必须配合遏制</w:t>
+      </w:r>
+      <w:r>
+        <w:t xml:space="preserve">：仅检测（D5）与无防御（D0）的被发现前残余受控电量同为约 2,100 kWh，而叠加隔离（D3+D5）后降至约 6–10 kWh（降幅 &gt;99%）。其二，</w:t>
+      </w:r>
+      <w:r>
+        <w:rPr>
+          <w:bCs/>
+          <w:b/>
+        </w:rPr>
+        <w:t xml:space="preserve">规模×节律一致性检测器</w:t>
+      </w:r>
+      <w:r>
+        <w:t xml:space="preserve">捕获了指令速率检测漏掉的隐蔽慢速攻击（3 指令/分），约 1 分钟内告警；快速攻击由速率检测在 0–1 分钟内捕获。其三，单用限速（D2）而不隔离几乎不减损失（攻击仍最终波及全部 57 站），但限速叠加隔离把爆炸半径压到约 6 站、峰值受控功率从约 0.89 MW 降到约 0.23 MW。四次良性回放的误报为 0。</w:t>
+      </w:r>
+    </w:p>
+    <w:p>
+      <w:pPr>
+        <w:pStyle w:val="BodyText"/>
+      </w:pPr>
+      <w:r>
+        <w:rPr>
+          <w:bCs/>
+          <w:b/>
+        </w:rPr>
+        <w:t xml:space="preserve">6.3 仿真平台。</w:t>
+      </w:r>
+      <w:r>
+        <w:t xml:space="preserve"> </w:t>
+      </w:r>
+      <w:r>
+        <w:t xml:space="preserve">平台用 Python</w:t>
+      </w:r>
+      <w:r>
+        <w:t xml:space="preserve"> </w:t>
+      </w:r>
+      <w:r>
+        <w:rPr>
+          <w:rStyle w:val="VerbatimChar"/>
+        </w:rPr>
+        <w:t xml:space="preserve">ocpp</w:t>
+      </w:r>
+      <w:r>
+        <w:t xml:space="preserve"> </w:t>
+      </w:r>
+      <w:r>
+        <w:t xml:space="preserve">库[16]实现真实 OCPP 1.6 消息（BootNotification/Authorize/StartTransaction/MeterValues/StopTransaction/Heartbeat，以及 CSMS→桩的 SetChargingProfile/RemoteStopTransaction）；57 个充电桩异步客户端经真实 websocket 连至一个 CSMS，按 2025-12-05 的真实会话回放，采用离散虚拟时钟（1 分钟步进）与墙钟解耦。A3 后台沦陷攻击向各桩扇出限功率/停充（快速 30、隐蔽 3 指令/分）；后台侧检测器并用指令速率（2 分钟内≥5 条控制指令告警）与规模×节律功率一致性（观测/预期&lt;0.5 持续 2 分钟告警）；遏制为指令限速与告警后 1 分钟隔离恢复。每格三次重复（攻击起始 17:30/18:00/18:30），指标取中位数。</w:t>
       </w:r>
     </w:p>
     <w:p>
@@ -2385,7 +2428,7 @@
       <w:r>
         <w:drawing>
           <wp:inline>
-            <wp:extent cx="4480560" cy="2249031"/>
+            <wp:extent cx="4480560" cy="2286149"/>
             <wp:effectExtent b="0" l="0" r="0" t="0"/>
             <wp:docPr descr="" title="" id="86" name="Picture"/>
             <a:graphic>
@@ -2406,7 +2449,7 @@
                   <pic:spPr bwMode="auto">
                     <a:xfrm>
                       <a:off x="0" y="0"/>
-                      <a:ext cx="4480560" cy="2249031"/>
+                      <a:ext cx="4480560" cy="2286149"/>
                     </a:xfrm>
                     <a:prstGeom prst="rect">
                       <a:avLst/>
@@ -2440,7 +2483,7 @@
         <w:t xml:space="preserve"> </w:t>
       </w:r>
       <w:r>
-        <w:t xml:space="preserve">场景矩阵：各防御配置下的残余损失（预期/定性，待仿真实测标定）。</w:t>
+        <w:t xml:space="preserve">OCPP 仿真实测：场景矩阵——各攻击变体 × 防御配置下被发现前的残余受控电量 ΔE（kWh，57 站真实会话；无遏制≈2,100、隔离后≈6–10）。</w:t>
       </w:r>
     </w:p>
     <w:p>
@@ -2450,7 +2493,7 @@
       <w:r>
         <w:drawing>
           <wp:inline>
-            <wp:extent cx="4907280" cy="2213810"/>
+            <wp:extent cx="4907280" cy="2097689"/>
             <wp:effectExtent b="0" l="0" r="0" t="0"/>
             <wp:docPr descr="" title="" id="89" name="Picture"/>
             <a:graphic>
@@ -2471,7 +2514,7 @@
                   <pic:spPr bwMode="auto">
                     <a:xfrm>
                       <a:off x="0" y="0"/>
-                      <a:ext cx="4907280" cy="2213810"/>
+                      <a:ext cx="4907280" cy="2097689"/>
                     </a:xfrm>
                     <a:prstGeom prst="rect">
                       <a:avLst/>
@@ -2505,7 +2548,7 @@
         <w:t xml:space="preserve"> </w:t>
       </w:r>
       <w:r>
-        <w:t xml:space="preserve">遏制时延-残余损失权衡（分析模型；τ_d 由 OCPP 仿真平台实测标定）。(a) 损失随时延增长；(b) 叠加遏制手段的边际削减。</w:t>
+        <w:t xml:space="preserve">OCPP 仿真实测：防御配置对残余损失与检测时延的影响。(a) 残余受控电量 ΔE（对数）；(b) 检测时延 τ_d。仅检测/限速不减损失，隔离降幅 &gt;99%。</w:t>
       </w:r>
     </w:p>
     <w:p>
@@ -2688,7 +2731,22 @@
         <w:t xml:space="preserve"> </w:t>
       </w:r>
       <w:r>
-        <w:t xml:space="preserve">库[16]启一个异步客户端，回放真实会话或以”规模×节律”生成背景流量；CSMS 侧用 SteVe[17]（OCPP 1.6）或 CitrineOS[18]（OCPP 2.0.1），使协议版本成为可切换情景变量；拓扑由 Mininet/IPMininet[19]搭建，隔离边界与联邦节点显式建模；攻击由 mitmproxy 注入、流量特征由 NFStream 提取[20]。现成框架中 EmuOCPP[22]（基于 IPMininet）与本文需求最接近，可作底座起点。异步 IO 使单机即可承载数十至数百个并发 OCPP 会话；情景变量均经配置文件参数化，支持场景矩阵批量重跑与地图回放的可复现归档。</w:t>
+        <w:t xml:space="preserve">库[16]启一个异步客户端，回放真实会话或以”规模×节律”生成背景流量；CSMS 侧用 SteVe[17]（OCPP 1.6）或 CitrineOS[18]（OCPP 2.0.1），使协议版本成为可切换情景变量；拓扑由 Mininet/IPMininet[19]搭建，隔离边界与联邦节点显式建模；攻击由 mitmproxy 注入、流量特征由 NFStream 提取[20]。现成框架中 EmuOCPP[22]（基于 IPMininet）与本文需求最接近，可作全保真底座起点；本文第 6 节的实测即在此类平台的一个轻量实现上完成——用</w:t>
+      </w:r>
+      <w:r>
+        <w:t xml:space="preserve"> </w:t>
+      </w:r>
+      <w:r>
+        <w:rPr>
+          <w:rStyle w:val="VerbatimChar"/>
+        </w:rPr>
+        <w:t xml:space="preserve">ocpp</w:t>
+      </w:r>
+      <w:r>
+        <w:t xml:space="preserve"> </w:t>
+      </w:r>
+      <w:r>
+        <w:t xml:space="preserve">库[16]实现 CSMS 与 57 个充电桩客户端、真实 OCPP 1.6 消息经 websocket 交换（见附录 D）。异步 IO 使单机即可承载数十至数百个并发 OCPP 会话；情景变量均经配置文件参数化，支持场景矩阵批量重跑与地图回放的可复现归档。</w:t>
       </w:r>
     </w:p>
     <w:bookmarkEnd w:id="97"/>
@@ -2876,7 +2934,7 @@
         <w:t xml:space="preserve">”</w:t>
       </w:r>
       <w:r>
-        <w:t xml:space="preserve">分解可一物两用——既生成背景流量，又作站点上报电量的物理一致性检测器，并能把真实停电等良性异常与攻击区分。（3）链路加密只压制中间人与克隆类（A1/A2）、对后台攻陷与 DoS（A3/A4）无效，后二者须靠限速、隔离与检测遏制。（4）评价应以”被发现前造成的损失”为主指标，并全部可在 H3 底图上按时间轴回放。后续工作：接入站点动态可用性数据替代静态登记表假设，以其他 AFIR 城市数据及 2026 年新会话检验外部有效性，并将协议版本纳入情景扫描以量化迁移收益。</w:t>
+        <w:t xml:space="preserve">分解可一物两用——既生成背景流量，又作站点上报电量的物理一致性检测器，并能把真实停电等良性异常与攻击区分。（3）链路加密只压制中间人与克隆类（A1/A2）、对后台攻陷与 DoS（A3/A4）无效，后二者须靠限速、隔离与检测遏制。（4）评价应以”被发现前造成的损失”为主指标，并全部可在 H3 底图上按时间轴回放。（5）真实 OCPP 1.6 仿真实测证实：隔离是遏制的决定性手段（残余受控电量降幅 &gt;99%），而仅检测或仅限速几乎不减损失；规模×节律一致性检测器可捕获速率检测漏掉的隐蔽慢速攻击，且四次良性回放零误报。后续工作：接入站点动态可用性数据替代静态登记表假设，以其他 AFIR 城市数据及 2026 年新会话检验外部有效性，并将协议版本纳入情景扫描以量化迁移收益。</w:t>
       </w:r>
     </w:p>
     <w:bookmarkEnd w:id="105"/>
@@ -4305,13 +4363,13 @@
       </w:r>
     </w:p>
     <w:bookmarkEnd w:id="110"/>
-    <w:bookmarkStart w:id="120" w:name="附录-d-分析模型与负荷重建"/>
+    <w:bookmarkStart w:id="120" w:name="附录-d-ocpp-仿真平台实测口径与负荷重建"/>
     <w:p>
       <w:pPr>
         <w:pStyle w:val="Heading1"/>
       </w:pPr>
       <w:r>
-        <w:t xml:space="preserve">附录 D　分析模型与负荷重建</w:t>
+        <w:t xml:space="preserve">附录 D　OCPP 仿真平台、实测口径与负荷重建</w:t>
       </w:r>
     </w:p>
     <w:p>
@@ -4341,142 +4399,39 @@
           <w:bCs/>
           <w:b/>
         </w:rPr>
-        <w:t xml:space="preserve">遏制分析模型（图 17）：</w:t>
-      </w:r>
-      <w:r>
-        <w:t xml:space="preserve"> </w:t>
-      </w:r>
-      <w:r>
-        <w:t xml:space="preserve">攻破后台后时延</w:t>
-      </w:r>
-      <w:r>
-        <w:t xml:space="preserve"> </w:t>
-      </w:r>
-      <w:r>
-        <w:rPr>
-          <w:iCs/>
-          <w:i/>
-        </w:rPr>
-        <w:t xml:space="preserve">T</w:t>
-      </w:r>
-      <w:r>
-        <w:t xml:space="preserve"> </w:t>
-      </w:r>
-      <w:r>
-        <w:t xml:space="preserve">内的可达功率 reach(</w:t>
-      </w:r>
-      <w:r>
-        <w:rPr>
-          <w:iCs/>
-          <w:i/>
-        </w:rPr>
-        <w:t xml:space="preserve">T</w:t>
-      </w:r>
-      <w:r>
-        <w:t xml:space="preserve">)=min(上限,</w:t>
-      </w:r>
-      <w:r>
-        <w:t xml:space="preserve"> </w:t>
-      </w:r>
-      <w:r>
-        <w:rPr>
-          <w:iCs/>
-          <w:i/>
-        </w:rPr>
-        <w:t xml:space="preserve">r</w:t>
-      </w:r>
-      <w:r>
-        <w:t xml:space="preserve">·</w:t>
-      </w:r>
-      <w:r>
-        <w:rPr>
-          <w:iCs/>
-          <w:i/>
-        </w:rPr>
-        <w:t xml:space="preserve">T</w:t>
-      </w:r>
-      <w:r>
-        <w:t xml:space="preserve">·</w:t>
-      </w:r>
-      <w:r>
-        <w:rPr>
-          <w:iCs/>
-          <w:i/>
-        </w:rPr>
-        <w:t xml:space="preserve">m</w:t>
-      </w:r>
-      <w:r>
-        <w:t xml:space="preserve">)，</w:t>
-      </w:r>
-      <w:r>
-        <w:rPr>
-          <w:iCs/>
-          <w:i/>
-        </w:rPr>
-        <w:t xml:space="preserve">r</w:t>
-      </w:r>
-      <w:r>
-        <w:t xml:space="preserve"> </w:t>
-      </w:r>
-      <w:r>
-        <w:t xml:space="preserve">为指令扇出速率（示例 20 指令/分）、</w:t>
-      </w:r>
-      <w:r>
-        <w:rPr>
-          <w:iCs/>
-          <w:i/>
-        </w:rPr>
-        <w:t xml:space="preserve">m</w:t>
-      </w:r>
-      <w:r>
-        <w:t xml:space="preserve"> </w:t>
-      </w:r>
-      <w:r>
-        <w:t xml:space="preserve">为单点平均额定功率（Iberdrola 9.75 MW/332 点≈0.029 MW/点）；残余受控电量≈½·reach·</w:t>
-      </w:r>
-      <w:r>
-        <w:rPr>
-          <w:iCs/>
-          <w:i/>
-        </w:rPr>
-        <w:t xml:space="preserve">T</w:t>
-      </w:r>
-      <w:r>
-        <w:t xml:space="preserve">。该模型为分析上界，</w:t>
-      </w:r>
+        <w:t xml:space="preserve">OCPP 仿真平台（图 16、17、A1 的来源）：</w:t>
+      </w:r>
+      <w:r>
+        <w:t xml:space="preserve"> </w:t>
+      </w:r>
+      <w:r>
+        <w:t xml:space="preserve">用 Python</w:t>
+      </w:r>
+      <w:r>
+        <w:t xml:space="preserve"> </w:t>
+      </w:r>
+      <w:r>
+        <w:rPr>
+          <w:rStyle w:val="VerbatimChar"/>
+        </w:rPr>
+        <w:t xml:space="preserve">ocpp</w:t>
+      </w:r>
+      <w:r>
+        <w:t xml:space="preserve"> </w:t>
+      </w:r>
+      <w:r>
+        <w:t xml:space="preserve">库[16]实现真实 OCPP 1.6-J 消息，57 个充电桩异步客户端经真实 websocket 连至一个 CSMS，按 2025-12-05（最繁忙工作日，窗口 16–22 时，254 笔真实会话）回放。离散虚拟时钟 1 分钟步进、与墙钟解耦，故每条消息的处理延迟不污染仿真时间。攻击 = A3 后台沦陷：t₀ 起向站点（按日负荷降序）扇出 SetChargingProfile(limit=0) 或 RemoteStopTransaction，速率为快速 30/慢速 3 指令/分；限速防御把 CSMS 外发控制指令上限设为 2/分。检测器并用指令速率与规模×节律功率一致性（预期 = 无攻击调度功率，观测由桩上报 MeterValues 聚合）。指标：τ_d=首个真阳性告警−t₀；残余受控电量 ΔE=受控区间∩会话活动区间内被curtail功率的积分；被拒会话、受控站点、峰值受控功率；误报率由无攻击回放统计。每格三次重复取中位数。实测 D0 峰值受控功率 0.886 MW，与独立负荷重建（图 A2，峰值≈0.40 MW 小时均、瞬时并发更高）量级一致。</w:t>
+      </w:r>
+    </w:p>
+    <w:p>
+      <w:pPr>
+        <w:pStyle w:val="BodyText"/>
+      </w:pPr>
       <w:r>
         <w:rPr>
           <w:bCs/>
           <w:b/>
         </w:rPr>
-        <w:t xml:space="preserve">非仿真实测</w:t>
-      </w:r>
-      <w:r>
-        <w:t xml:space="preserve">；</w:t>
-      </w:r>
-      <w:r>
-        <w:rPr>
-          <w:iCs/>
-          <w:i/>
-        </w:rPr>
-        <w:t xml:space="preserve">T</w:t>
-      </w:r>
-      <w:r>
-        <w:t xml:space="preserve"> </w:t>
-      </w:r>
-      <w:r>
-        <w:t xml:space="preserve">由仿真平台实测标定后代入。</w:t>
-      </w:r>
-    </w:p>
-    <w:p>
-      <w:pPr>
-        <w:pStyle w:val="BodyText"/>
-      </w:pPr>
-      <w:r>
-        <w:rPr>
-          <w:bCs/>
-          <w:b/>
-        </w:rPr>
         <w:t xml:space="preserve">电网对照（图 19）：</w:t>
       </w:r>
       <w:r>
@@ -4526,7 +4481,7 @@
       <w:r>
         <w:drawing>
           <wp:inline>
-            <wp:extent cx="3840480" cy="2217270"/>
+            <wp:extent cx="3840480" cy="2160514"/>
             <wp:effectExtent b="0" l="0" r="0" t="0"/>
             <wp:docPr descr="" title="" id="112" name="Picture"/>
             <a:graphic>
@@ -4547,7 +4502,7 @@
                   <pic:spPr bwMode="auto">
                     <a:xfrm>
                       <a:off x="0" y="0"/>
-                      <a:ext cx="3840480" cy="2217270"/>
+                      <a:ext cx="3840480" cy="2160514"/>
                     </a:xfrm>
                     <a:prstGeom prst="rect">
                       <a:avLst/>
@@ -4581,7 +4536,7 @@
         <w:t xml:space="preserve"> </w:t>
       </w:r>
       <w:r>
-        <w:t xml:space="preserve">遏制手段对爆炸半径的削减（分析模型）。</w:t>
+        <w:t xml:space="preserve">OCPP 仿真实测：受控功率随时间（快速篡改攻击）。D0/仅检测爬升至≈0.89 MW 不降；检测+隔离约 1 分钟归零；限速+隔离峰值≈0.23 MW。</w:t>
       </w:r>
     </w:p>
     <w:p>

</xml_diff>

<commit_message>
Add interactive GIS attack-defense console; upgrade GIS timeline figure
- 交互式攻防指挥台 ocpp_sim/console.html（D3 + 真实仿真数据）：暗色 SOC 界面，
  真实 AMB 地图上动画回放攻击扩散→检测→隔离恢复，可切换防御配置、拖时间轴、
  悬停查站点、实时指标仪表；已发布为 Artifact。
- 逐站 curtail 时刻按扇出次序细化（第 k 个被控站 = k/速率 分钟），使地理扩散
  平滑可见（而非 1 分钟 tick 批量跳变）。
- 图18 GIS 时间线升级为暗色 SOC 故事板（CSMS 攻击流线 + 逐站真实时序 +
  指标读数）：T+0 入口 → T+0.6 扩散 19 站 → T+2 全网 57 站 → 检测+隔离遏制。
- export_console.py / make_fig11_adv.py 可复现；artifact_data.json 为导出数据。
- 正文 §7.1 补充真实仿真驱动说明与指挥台在线链接。

Co-Authored-By: Claude Opus 4.8 <noreply@anthropic.com>
Claude-Session: https://claude.ai/code/session_01EzcB6NFYkoucrVwQxQDWEq
</commit_message>
<xml_diff>
--- a/巴塞罗那充电网络OCPP攻防仿真.docx
+++ b/巴塞罗那充电网络OCPP攻防仿真.docx
@@ -2596,7 +2596,36 @@
         <w:t xml:space="preserve">”</w:t>
       </w:r>
       <w:r>
-        <w:t xml:space="preserve">才从修辞变为可核查的结果形式。图 18 把一次后台沦陷的攻防全过程在真实站点地理上回放：</w:t>
+        <w:t xml:space="preserve">才从修辞变为可核查的结果形式。图 18 由第 6 节的真实 OCPP 仿真逐站事件直接驱动（攻击者按站点繁忙度以 30 指令/分扇出，第</w:t>
+      </w:r>
+      <w:r>
+        <w:t xml:space="preserve"> </w:t>
+      </w:r>
+      <w:r>
+        <w:rPr>
+          <w:iCs/>
+          <w:i/>
+        </w:rPr>
+        <w:t xml:space="preserve">k</w:t>
+      </w:r>
+      <w:r>
+        <w:t xml:space="preserve"> </w:t>
+      </w:r>
+      <w:r>
+        <w:t xml:space="preserve">个被控站在</w:t>
+      </w:r>
+      <w:r>
+        <w:t xml:space="preserve"> </w:t>
+      </w:r>
+      <w:r>
+        <w:rPr>
+          <w:iCs/>
+          <w:i/>
+        </w:rPr>
+        <w:t xml:space="preserve">k</w:t>
+      </w:r>
+      <w:r>
+        <w:t xml:space="preserve">/速率 分钟被控），把一次后台沦陷的攻防全过程在真实站点地理上回放：</w:t>
       </w:r>
       <w:r>
         <w:rPr>
@@ -2606,7 +2635,7 @@
         <w:t xml:space="preserve">t</w:t>
       </w:r>
       <w:r>
-        <w:t xml:space="preserve">₀ 单站被攻破（入口），</w:t>
+        <w:t xml:space="preserve">₀ 入口单站被攻破，</w:t>
       </w:r>
       <w:r>
         <w:rPr>
@@ -2616,27 +2645,17 @@
         <w:t xml:space="preserve">t</w:t>
       </w:r>
       <w:r>
-        <w:t xml:space="preserve">₁≈5 min 指令扇出至约 30 站（红点沿地理扩散），</w:t>
-      </w:r>
-      <w:r>
-        <w:rPr>
-          <w:iCs/>
-          <w:i/>
-        </w:rPr>
-        <w:t xml:space="preserve">t</w:t>
-      </w:r>
-      <w:r>
-        <w:t xml:space="preserve">₂ 物理一致性检测触发（全部告警），</w:t>
-      </w:r>
-      <w:r>
-        <w:rPr>
-          <w:iCs/>
-          <w:i/>
-        </w:rPr>
-        <w:t xml:space="preserve">t</w:t>
-      </w:r>
-      <w:r>
-        <w:t xml:space="preserve">₃ 按运营商隔离后本地充电恢复（绿点）。这四帧与第 6 节定义的检测时延 τ_d、遏制时间 τ_c 在视觉上一一对应，使攻击横向扩散的速度、检测触发的时刻与隔离恢复的范围同时可见。本文前述 GIS 图共同构成一套攻防图集：攻击面（图 3、4）、爆炸半径（图 8）、暴露（图 12）与时间线（图 18）。</w:t>
+        <w:t xml:space="preserve">≈0.6 min 指令沿地理扩散至约 19 站，无遏制时约 2 min 内全网 57 站被控（峰值受控≈0.89 MW）；而检测+隔离在约 1 min 内告警并按运营商隔离、恢复本地充电，被发现前残余受控电量从 2,115 kWh 降至 9.5 kWh。这些帧与第 6 节的 τ_d、τ_c 一一对应，使攻击扩散速度、检测时刻与遏制范围同时可见。配套的</w:t>
+      </w:r>
+      <w:r>
+        <w:rPr>
+          <w:bCs/>
+          <w:b/>
+        </w:rPr>
+        <w:t xml:space="preserve">交互式攻防指挥台</w:t>
+      </w:r>
+      <w:r>
+        <w:t xml:space="preserve">（暗色 SOC 界面，可切换防御配置、拖动时间轴、悬停查站点）在线回放同一真实仿真：https://claude.ai/artifact/HGTEGXjcdi4uarwkPWdoS9 。本文前述 GIS 图共同构成一套攻防图集：攻击面（图 3、4）、爆炸半径（图 8）、暴露（图 12）与时间线（图 18）。</w:t>
       </w:r>
     </w:p>
     <w:p>
@@ -2646,7 +2665,7 @@
       <w:r>
         <w:drawing>
           <wp:inline>
-            <wp:extent cx="5227320" cy="2142399"/>
+            <wp:extent cx="5227320" cy="2362318"/>
             <wp:effectExtent b="0" l="0" r="0" t="0"/>
             <wp:docPr descr="" title="" id="94" name="Picture"/>
             <a:graphic>
@@ -2667,7 +2686,7 @@
                   <pic:spPr bwMode="auto">
                     <a:xfrm>
                       <a:off x="0" y="0"/>
-                      <a:ext cx="5227320" cy="2142399"/>
+                      <a:ext cx="5227320" cy="2362318"/>
                     </a:xfrm>
                     <a:prstGeom prst="rect">
                       <a:avLst/>
@@ -2698,7 +2717,7 @@
         <w:t xml:space="preserve">图 18</w:t>
       </w:r>
       <w:r>
-        <w:t xml:space="preserve">（GIS）攻防时间线回放（场景示意，AMB/Iberdrola 后台；地理为真实站点）。入口→扩散→检测→隔离恢复四帧。</w:t>
+        <w:t xml:space="preserve">（GIS）攻防时间线回放：由真实 OCPP 1.6 仿真逐站事件驱动（AMB/Iberdrola 后台，地理为真实站点）。红方块=被攻破的 CSMS，红线=攻击指令扇出，青=正常、红=被控、绿=已隔离/恢复。前三帧为无遏制扩散，末帧为检测+隔离的遏制结果（ΔE 9.5 vs 2,115 kWh）。</w:t>
       </w:r>
     </w:p>
     <w:bookmarkEnd w:id="96"/>

</xml_diff>

<commit_message>
3D deck.gl console (V4): 4 attack vectors, OCPP-version gate, GIF
交互指挥台升级为 3D（deck.gl MapView，可旋转俯仰）：站点为随攻击实时变化
的三维柱（限功率塌缩/篡改暴涨/DoS 离线/恢复），CSMS 三维攻击弧，市镇底面
choropleth。新增三重切换——4 攻击向量（后台限功率、批量停充、链路中间人
篡改电表、后台 DoS 洪泛）× 3 防御 × 3 OCPP 版本（1.6/2.0.1/2.1 可行性门，
TLS 阻断中间人）；实时报文流终端、检测器双信号遥测、威胁等级。
引擎新增 mitm_meter / dos 两种攻击模式（真实消息级：篡改 MeterValues、
连接洪泛），计费偏差与一致性高值检测。export_console.py 产 4×3 真实数据，
geo 经 pyproj 重投影 WGS84。make_gif.py 产三维柱状图攻防动画 GIF。
正文 §7.1 记述 3D/多向量/版本对比能力。

Co-Authored-By: Claude Opus 4.8 <noreply@anthropic.com>
Claude-Session: https://claude.ai/code/session_01EzcB6NFYkoucrVwQxQDWEq
</commit_message>
<xml_diff>
--- a/巴塞罗那充电网络OCPP攻防仿真.docx
+++ b/巴塞罗那充电网络OCPP攻防仿真.docx
@@ -2652,10 +2652,10 @@
           <w:bCs/>
           <w:b/>
         </w:rPr>
-        <w:t xml:space="preserve">交互式攻防指挥台</w:t>
-      </w:r>
-      <w:r>
-        <w:t xml:space="preserve">（暗色 SOC 界面，可切换防御配置、拖动时间轴、悬停查站点）在线回放同一真实仿真：https://claude.ai/artifact/HGTEGXjcdi4uarwkPWdoS9 。本文前述 GIS 图共同构成一套攻防图集：攻击面（图 3、4）、爆炸半径（图 8）、暴露（图 12）与时间线（图 18）。</w:t>
+        <w:t xml:space="preserve">交互式三维攻防指挥台</w:t>
+      </w:r>
+      <w:r>
+        <w:t xml:space="preserve">（deck.gl 三维地图，站点为随攻击实时变化的三维柱——限功率时塌缩、篡改电表时暴涨、DoS 时离线——CSMS 射出三维攻击弧，市镇底面随受控功率变色；可切换 4 种攻击向量（后台限功率/批量停充、链路中间人篡改电表、后台 DoS 洪泛）、3 种防御与 3 个 OCPP 版本，含实时 OCPP 报文流终端、检测器双信号遥测与威胁等级）在线回放真实仿真：https://claude.ai/artifact/HGTEGXjcdi4uarwkPWdoS9 。其中协议版本切换直观印证第 4 节的可达性分析——升级到 OCPP 2.0.1/2.1 后，链路中间人篡改向量被 TLS 阻断，而后台沦陷与 DoS 不受影响。本文前述 GIS 图共同构成一套攻防图集：攻击面（图 3、4）、爆炸半径（图 8）、暴露（图 12）与时间线（图 18）。</w:t>
       </w:r>
     </w:p>
     <w:p>

</xml_diff>

<commit_message>
Add city-scale multi-operator 3D console + link from paper
City command console (console_city.html): 621 locations across 39 CSMS
backends on the real AMB geography; select the compromised backend (single
operator or coordinated top-k) and defense (none / detect+isolate), driven by
the real multi-operator simulation. Three.js 3D with a 2D-canvas fallback so
it renders even without WebGL/CDN (headless-verified: campaign k=5 D0 11889
kWh/449 sites/34 munis, iso 26.5 kWh/-99.8%).

Paper §7 updated to describe and link the city console.

Co-Authored-By: Claude Opus 4.8 <noreply@anthropic.com>
Claude-Session: https://claude.ai/code/session_01EzcB6NFYkoucrVwQxQDWEq
</commit_message>
<xml_diff>
--- a/巴塞罗那充电网络OCPP攻防仿真.docx
+++ b/巴塞罗那充电网络OCPP攻防仿真.docx
@@ -2720,10 +2720,36 @@
           <w:bCs/>
           <w:b/>
         </w:rPr>
-        <w:t xml:space="preserve">交互式三维攻防指挥台</w:t>
-      </w:r>
-      <w:r>
-        <w:t xml:space="preserve">（站点为随攻击实时变化的三维柱——限功率塌缩、篡改暴涨、DoS 离线——CSMS 射出三维攻击弧，市镇底面随受控功率变色；可切换运营商后台、4 种攻击向量、3 种防御与 3 个 OCPP 版本，含实时 OCPP 报文流终端、检测器双信号遥测与威胁等级）在线回放真实仿真：https://claude.ai/artifact/HGTEGXjcdi4uarwkPWdoS9 。协议版本切换直观印证第 4 节可达性分析——升级到 2.0.1/2.1 后链路中间人篡改被 TLS 阻断，而后台沦陷与 DoS 不受影响。</w:t>
+        <w:t xml:space="preserve">交互式城市级三维攻防指挥台</w:t>
+      </w:r>
+      <w:r>
+        <w:t xml:space="preserve">（621 个地点为随攻击实时变化的三维柱，被攻破后台的站点塌缩为红、隔离后转绿，CSMS 射出三维攻击弧，36 个市镇底面随受控功率变色；可切换</w:t>
+      </w:r>
+      <w:r>
+        <w:rPr>
+          <w:bCs/>
+          <w:b/>
+        </w:rPr>
+        <w:t xml:space="preserve">被攻破后台</w:t>
+      </w:r>
+      <w:r>
+        <w:t xml:space="preserve">——单家或协同攻破功率前</w:t>
+      </w:r>
+      <w:r>
+        <w:t xml:space="preserve"> </w:t>
+      </w:r>
+      <w:r>
+        <w:rPr>
+          <w:iCs/>
+          <w:i/>
+        </w:rPr>
+        <w:t xml:space="preserve">k</w:t>
+      </w:r>
+      <w:r>
+        <w:t xml:space="preserve"> </w:t>
+      </w:r>
+      <w:r>
+        <w:t xml:space="preserve">家——与防御（无防御／检测+隔离），含实时 OCPP 报文流终端与威胁等级，WebGL 不可用时自动回退二维俯视图以保证加载）在线回放真实多运营商仿真：https://claude.ai/artifact/7Cw59TNsjvbhJfMYzWnsLL 。切换被攻破后台直观印证控制平面碎片化——任何单次后台攻陷的爆炸半径都被该运营商机队边界锁死（Endesa 波及 18 市镇 vs BSM 仅 3 市镇），而逐后台隔离把受控电量压到数十 kWh。</w:t>
       </w:r>
     </w:p>
     <w:p>

</xml_diff>

<commit_message>
Recolor all dark figures to light/high-contrast + add plain-language logic framework
- Convert the 5 dark SOC-style figures (figC1/C2/C4/C5 city GIS, fig11 AMB
  storyboard) to a light, colorful, high-contrast palette for direct readability.
- Fix fig11 CRS mismatch (reproject municipalities to WGS84 to match site coords)
  and its stale data keys.
- Add figLOGIC_framework.png: a plain-language logic framework diagram for
  non-experts (problem -> fragmentation insight -> one-operator calibration ->
  findings -> conclusion), inserted as 图0 and noted in the abstract.

Co-Authored-By: Claude Opus 4.8 <noreply@anthropic.com>
Claude-Session: https://claude.ai/code/session_01EzcB6NFYkoucrVwQxQDWEq
</commit_message>
<xml_diff>
--- a/巴塞罗那充电网络OCPP攻防仿真.docx
+++ b/巴塞罗那充电网络OCPP攻防仿真.docx
@@ -38,7 +38,7 @@
         <w:t xml:space="preserve">2026-10</w:t>
       </w:r>
     </w:p>
-    <w:bookmarkStart w:id="20" w:name="摘要"/>
+    <w:bookmarkStart w:id="23" w:name="摘要"/>
     <w:p>
       <w:pPr>
         <w:pStyle w:val="Heading1"/>
@@ -206,7 +206,7 @@
         <w:t xml:space="preserve">”</w:t>
       </w:r>
       <w:r>
-        <w:t xml:space="preserve">一致性检测器可把 2025-04-28 大停电（全网同步降至期望 0.53）与单站伪造电表读数区分；链路加密只压制中间人与克隆类（A1/A2），对后台攻陷与 DoS（A3/A4）无效。全文以”被发现前造成的损失”（MWh、被拒会话、受影响市镇）为主评价指标，并以 26 幅融合图（含 9 幅 GIS 攻防可视化，其中 4 幅为城市级多运营商）与一个交互式三维指挥台在真实地图上回放攻防全过程。</w:t>
+        <w:t xml:space="preserve">一致性检测器可把 2025-04-28 大停电（全网同步降至期望 0.53）与单站伪造电表读数区分；链路加密只压制中间人与克隆类（A1/A2），对后台攻陷与 DoS（A3/A4）无效。全文以”被发现前造成的损失”（MWh、被拒会话、受影响市镇）为主评价指标，并以 1 幅面向非专业读者的全文逻辑框架图加 26 幅融合图（含 9 幅 GIS 攻防可视化，其中 4 幅为城市级多运营商）与一个交互式三维指挥台在真实地图上回放攻防全过程。全部图表采用浅色高对比配色以便直观观测。</w:t>
       </w:r>
     </w:p>
     <w:p>
@@ -225,160 +225,6 @@
       </w:r>
       <w:r>
         <w:t xml:space="preserve">电动汽车充电；OCPP；CSMS；控制平面碎片化；城市级网络层攻防仿真；多运营商；GIS 可视化；入侵检测；关键基础设施安全；巴塞罗那</w:t>
-      </w:r>
-    </w:p>
-    <w:bookmarkEnd w:id="20"/>
-    <w:bookmarkStart w:id="24" w:name="引言"/>
-    <w:p>
-      <w:pPr>
-        <w:pStyle w:val="Heading1"/>
-      </w:pPr>
-      <w:r>
-        <w:t xml:space="preserve">1 引言</w:t>
-      </w:r>
-    </w:p>
-    <w:p>
-      <w:pPr>
-        <w:pStyle w:val="FirstParagraph"/>
-      </w:pPr>
-      <w:r>
-        <w:t xml:space="preserve">公共充电网络正在欧盟城市快速扩建。《替代燃料基础设施法规》（AFIR）要求运营商经各成员国的国家接入点公开充电点的静态与动态信息[1]，其实施条例进一步细化了数据可用性口径[2]；但真实充电会话通常不在公开之列，面向真实流量的充电网络安全研究因此长期缺乏底座。与此同时，针对充电接口物理层与无线层的攻击已被反复证实[3,4,5]，但这些工作大多止步于单桩或单链路，难以回答”在一座城市的真实充电网络里，一次入侵能横向扩散到多大范围”。</w:t>
-      </w:r>
-    </w:p>
-    <w:p>
-      <w:pPr>
-        <w:pStyle w:val="BodyText"/>
-      </w:pPr>
-      <w:r>
-        <w:t xml:space="preserve">本文把研究单位收敛到充电桩（EVSE）与运营商后台（CSMS）之间的 OCPP 控制通道[6,7]，并把问题放到</w:t>
-      </w:r>
-      <w:r>
-        <w:rPr>
-          <w:bCs/>
-          <w:b/>
-        </w:rPr>
-        <w:t xml:space="preserve">整座城市</w:t>
-      </w:r>
-      <w:r>
-        <w:t xml:space="preserve">的尺度。关键观察是：一座城市的充电控制平面并非一张统一的网，而是由</w:t>
-      </w:r>
-      <w:r>
-        <w:rPr>
-          <w:bCs/>
-          <w:b/>
-        </w:rPr>
-        <w:t xml:space="preserve">数十家运营商各自独立的 CSMS 后台</w:t>
-      </w:r>
-      <w:r>
-        <w:t xml:space="preserve">拼成的碎片化结构——攻击者攻破一家后台，其横向可达范围被该运营商的机队边界所限，无法越界到另一家。这把”攻击者处在通道哪个位置、能波及多少站点”从单桩问题升格为</w:t>
-      </w:r>
-      <w:r>
-        <w:rPr>
-          <w:bCs/>
-          <w:b/>
-        </w:rPr>
-        <w:t xml:space="preserve">城市拓扑问题</w:t>
-      </w:r>
-      <w:r>
-        <w:t xml:space="preserve">：全城的韧性取决于控制平面的碎片化程度与各后台的安全态势。相较物理层，网络层攻防也更贴近运营商当前真实可部署的检测与遏制手段。</w:t>
-      </w:r>
-    </w:p>
-    <w:p>
-      <w:pPr>
-        <w:pStyle w:val="BodyText"/>
-      </w:pPr>
-      <w:r>
-        <w:t xml:space="preserve">现有工作留下两处空白。其一，电网尺度研究通常把攻击抽象成一个”受控比例</w:t>
-      </w:r>
-      <w:r>
-        <w:t xml:space="preserve"> </w:t>
-      </w:r>
-      <w:r>
-        <w:rPr>
-          <w:iCs/>
-          <w:i/>
-        </w:rPr>
-        <w:t xml:space="preserve">p</w:t>
-      </w:r>
-      <w:r>
-        <w:t xml:space="preserve">”：配套仿真研究[8]给出 2024 年欧洲大陆尺度</w:t>
-      </w:r>
-      <w:r>
-        <w:t xml:space="preserve"> </w:t>
-      </w:r>
-      <w:r>
-        <w:rPr>
-          <w:iCs/>
-          <w:i/>
-        </w:rPr>
-        <w:t xml:space="preserve">p</w:t>
-      </w:r>
-      <w:r>
-        <w:t xml:space="preserve">≈0.8%，需升至约 9–11% 才触发低频减载（UFLS），却不回答</w:t>
-      </w:r>
-      <w:r>
-        <w:t xml:space="preserve"> </w:t>
-      </w:r>
-      <w:r>
-        <w:rPr>
-          <w:iCs/>
-          <w:i/>
-        </w:rPr>
-        <w:t xml:space="preserve">p</w:t>
-      </w:r>
-      <w:r>
-        <w:t xml:space="preserve"> </w:t>
-      </w:r>
-      <w:r>
-        <w:t xml:space="preserve">如何从网络层、在多运营商结构下获得。其二，用于训练入侵检测的数据集多依赖实验室脚本流量[9,10]，缺乏真实城市充电的多运营商规模差异与日节律。本文不以”操纵电网”为主线：据 DGT 国家接入点登记表复算，AMB 范围 37 家运营商、3,302 个充电点合计额定功率仅 63.47 MW，即便完全控制，相对西班牙本土约 40 GW 峰值也仅 0.16%，在系统频率层面不成立（图 16），与[8]一致。因此电网仅作结果指标，不建潮流模型。</w:t>
-      </w:r>
-    </w:p>
-    <w:p>
-      <w:pPr>
-        <w:pStyle w:val="BodyText"/>
-      </w:pPr>
-      <w:r>
-        <w:rPr>
-          <w:bCs/>
-          <w:b/>
-        </w:rPr>
-        <w:t xml:space="preserve">研究问题：</w:t>
-      </w:r>
-      <w:r>
-        <w:t xml:space="preserve"> </w:t>
-      </w:r>
-      <w:r>
-        <w:t xml:space="preserve">在巴塞罗那真实的多运营商结构与真实充电流量下，攻击者攻破一家或协同攻破多家 CSMS 后台时，实际能控制多少站点、多少 MW、拒绝多少会话、波及多少市镇；防御方又能多快发现并逐后台遏制？</w:t>
-      </w:r>
-      <w:r>
-        <w:rPr>
-          <w:bCs/>
-          <w:b/>
-        </w:rPr>
-        <w:t xml:space="preserve">贡献：</w:t>
-      </w:r>
-      <w:r>
-        <w:t xml:space="preserve">（1）以真实多运营商拓扑与真实流量为底座、覆盖整座城市的网络层 OCPP 攻防</w:t>
-      </w:r>
-      <w:r>
-        <w:rPr>
-          <w:bCs/>
-          <w:b/>
-        </w:rPr>
-        <w:t xml:space="preserve">实测</w:t>
-      </w:r>
-      <w:r>
-        <w:t xml:space="preserve">仿真（621 地点/39 后台）；（2）一个清晰的</w:t>
-      </w:r>
-      <w:r>
-        <w:rPr>
-          <w:bCs/>
-          <w:b/>
-        </w:rPr>
-        <w:t xml:space="preserve">宏观↔微观两层方法</w:t>
-      </w:r>
-      <w:r>
-        <w:t xml:space="preserve">——以唯一有真实会话的一家运营商标定单后台攻防动力学，再按登记容量迁移到全城，从方法上消解”多家与一家混杂”；（3）把”规模×节律”分解一物两用（背景流量生成器 + 物理一致性检测器）；（4）以”被发现前造成的损失”为主评价指标，并以 24 幅融合图（含 7 幅城市级 GIS 攻防可视化与交互式三维指挥台）在真实地图上回放。第 2 节数据与协议背景，第 3 节威胁模型、仿真底座与宏观/微观方法，第 4 节攻击面与可控性上限，第 5 节检测与遏制，第 6 节微观标定与宏观城市实测，第 7 节 GIS 可视化与工具链，第 8 节讨论与结论。</w:t>
       </w:r>
     </w:p>
     <w:p>
@@ -388,20 +234,239 @@
       <w:r>
         <w:drawing>
           <wp:inline>
-            <wp:extent cx="4373880" cy="3636825"/>
+            <wp:extent cx="5120640" cy="2987039"/>
             <wp:effectExtent b="0" l="0" r="0" t="0"/>
-            <wp:docPr descr="" title="" id="22" name="Picture"/>
+            <wp:docPr descr="" title="" id="21" name="Picture"/>
             <a:graphic>
               <a:graphicData uri="http://schemas.openxmlformats.org/drawingml/2006/picture">
                 <pic:pic>
                   <pic:nvPicPr>
-                    <pic:cNvPr descr="figs/figC1_citymap.png" id="23" name="Picture"/>
+                    <pic:cNvPr descr="figs/figLOGIC_framework.png" id="22" name="Picture"/>
                     <pic:cNvPicPr>
                       <a:picLocks noChangeArrowheads="1" noChangeAspect="1"/>
                     </pic:cNvPicPr>
                   </pic:nvPicPr>
                   <pic:blipFill>
-                    <a:blip r:embed="rId21"/>
+                    <a:blip r:embed="rId20"/>
+                    <a:stretch>
+                      <a:fillRect/>
+                    </a:stretch>
+                  </pic:blipFill>
+                  <pic:spPr bwMode="auto">
+                    <a:xfrm>
+                      <a:off x="0" y="0"/>
+                      <a:ext cx="5120640" cy="2987039"/>
+                    </a:xfrm>
+                    <a:prstGeom prst="rect">
+                      <a:avLst/>
+                    </a:prstGeom>
+                    <a:noFill/>
+                    <a:ln w="9525">
+                      <a:noFill/>
+                      <a:headEnd/>
+                      <a:tailEnd/>
+                    </a:ln>
+                  </pic:spPr>
+                </pic:pic>
+              </a:graphicData>
+            </a:graphic>
+          </wp:inline>
+        </w:drawing>
+      </w:r>
+    </w:p>
+    <w:p>
+      <w:pPr>
+        <w:pStyle w:val="BodyText"/>
+      </w:pPr>
+      <w:r>
+        <w:rPr>
+          <w:bCs/>
+          <w:b/>
+        </w:rPr>
+        <w:t xml:space="preserve">图 0</w:t>
+      </w:r>
+      <w:r>
+        <w:t xml:space="preserve"> </w:t>
+      </w:r>
+      <w:r>
+        <w:t xml:space="preserve">全文逻辑框架（面向非专业读者）：问题（运营商后台远程控制充电桩）→ 关键洞察（城市控制平面碎片化）→ 方法（一家真实标定、全城推演，全程仿真）→ 主要发现（单后台 17%、协同难、检测+隔离 &lt;1%、电网 0.16%）→ 结论（该防网络层后台通道，碎片化+检测隔离使攻击几乎无损）。</w:t>
+      </w:r>
+    </w:p>
+    <w:bookmarkEnd w:id="23"/>
+    <w:bookmarkStart w:id="27" w:name="引言"/>
+    <w:p>
+      <w:pPr>
+        <w:pStyle w:val="Heading1"/>
+      </w:pPr>
+      <w:r>
+        <w:t xml:space="preserve">1 引言</w:t>
+      </w:r>
+    </w:p>
+    <w:p>
+      <w:pPr>
+        <w:pStyle w:val="FirstParagraph"/>
+      </w:pPr>
+      <w:r>
+        <w:t xml:space="preserve">公共充电网络正在欧盟城市快速扩建。《替代燃料基础设施法规》（AFIR）要求运营商经各成员国的国家接入点公开充电点的静态与动态信息[1]，其实施条例进一步细化了数据可用性口径[2]；但真实充电会话通常不在公开之列，面向真实流量的充电网络安全研究因此长期缺乏底座。与此同时，针对充电接口物理层与无线层的攻击已被反复证实[3,4,5]，但这些工作大多止步于单桩或单链路，难以回答”在一座城市的真实充电网络里，一次入侵能横向扩散到多大范围”。</w:t>
+      </w:r>
+    </w:p>
+    <w:p>
+      <w:pPr>
+        <w:pStyle w:val="BodyText"/>
+      </w:pPr>
+      <w:r>
+        <w:t xml:space="preserve">本文把研究单位收敛到充电桩（EVSE）与运营商后台（CSMS）之间的 OCPP 控制通道[6,7]，并把问题放到</w:t>
+      </w:r>
+      <w:r>
+        <w:rPr>
+          <w:bCs/>
+          <w:b/>
+        </w:rPr>
+        <w:t xml:space="preserve">整座城市</w:t>
+      </w:r>
+      <w:r>
+        <w:t xml:space="preserve">的尺度。关键观察是：一座城市的充电控制平面并非一张统一的网，而是由</w:t>
+      </w:r>
+      <w:r>
+        <w:rPr>
+          <w:bCs/>
+          <w:b/>
+        </w:rPr>
+        <w:t xml:space="preserve">数十家运营商各自独立的 CSMS 后台</w:t>
+      </w:r>
+      <w:r>
+        <w:t xml:space="preserve">拼成的碎片化结构——攻击者攻破一家后台，其横向可达范围被该运营商的机队边界所限，无法越界到另一家。这把”攻击者处在通道哪个位置、能波及多少站点”从单桩问题升格为</w:t>
+      </w:r>
+      <w:r>
+        <w:rPr>
+          <w:bCs/>
+          <w:b/>
+        </w:rPr>
+        <w:t xml:space="preserve">城市拓扑问题</w:t>
+      </w:r>
+      <w:r>
+        <w:t xml:space="preserve">：全城的韧性取决于控制平面的碎片化程度与各后台的安全态势。相较物理层，网络层攻防也更贴近运营商当前真实可部署的检测与遏制手段。</w:t>
+      </w:r>
+    </w:p>
+    <w:p>
+      <w:pPr>
+        <w:pStyle w:val="BodyText"/>
+      </w:pPr>
+      <w:r>
+        <w:t xml:space="preserve">现有工作留下两处空白。其一，电网尺度研究通常把攻击抽象成一个”受控比例</w:t>
+      </w:r>
+      <w:r>
+        <w:t xml:space="preserve"> </w:t>
+      </w:r>
+      <w:r>
+        <w:rPr>
+          <w:iCs/>
+          <w:i/>
+        </w:rPr>
+        <w:t xml:space="preserve">p</w:t>
+      </w:r>
+      <w:r>
+        <w:t xml:space="preserve">”：配套仿真研究[8]给出 2024 年欧洲大陆尺度</w:t>
+      </w:r>
+      <w:r>
+        <w:t xml:space="preserve"> </w:t>
+      </w:r>
+      <w:r>
+        <w:rPr>
+          <w:iCs/>
+          <w:i/>
+        </w:rPr>
+        <w:t xml:space="preserve">p</w:t>
+      </w:r>
+      <w:r>
+        <w:t xml:space="preserve">≈0.8%，需升至约 9–11% 才触发低频减载（UFLS），却不回答</w:t>
+      </w:r>
+      <w:r>
+        <w:t xml:space="preserve"> </w:t>
+      </w:r>
+      <w:r>
+        <w:rPr>
+          <w:iCs/>
+          <w:i/>
+        </w:rPr>
+        <w:t xml:space="preserve">p</w:t>
+      </w:r>
+      <w:r>
+        <w:t xml:space="preserve"> </w:t>
+      </w:r>
+      <w:r>
+        <w:t xml:space="preserve">如何从网络层、在多运营商结构下获得。其二，用于训练入侵检测的数据集多依赖实验室脚本流量[9,10]，缺乏真实城市充电的多运营商规模差异与日节律。本文不以”操纵电网”为主线：据 DGT 国家接入点登记表复算，AMB 范围 37 家运营商、3,302 个充电点合计额定功率仅 63.47 MW，即便完全控制，相对西班牙本土约 40 GW 峰值也仅 0.16%，在系统频率层面不成立（图 16），与[8]一致。因此电网仅作结果指标，不建潮流模型。</w:t>
+      </w:r>
+    </w:p>
+    <w:p>
+      <w:pPr>
+        <w:pStyle w:val="BodyText"/>
+      </w:pPr>
+      <w:r>
+        <w:rPr>
+          <w:bCs/>
+          <w:b/>
+        </w:rPr>
+        <w:t xml:space="preserve">研究问题：</w:t>
+      </w:r>
+      <w:r>
+        <w:t xml:space="preserve"> </w:t>
+      </w:r>
+      <w:r>
+        <w:t xml:space="preserve">在巴塞罗那真实的多运营商结构与真实充电流量下，攻击者攻破一家或协同攻破多家 CSMS 后台时，实际能控制多少站点、多少 MW、拒绝多少会话、波及多少市镇；防御方又能多快发现并逐后台遏制？</w:t>
+      </w:r>
+      <w:r>
+        <w:rPr>
+          <w:bCs/>
+          <w:b/>
+        </w:rPr>
+        <w:t xml:space="preserve">贡献：</w:t>
+      </w:r>
+      <w:r>
+        <w:t xml:space="preserve">（1）以真实多运营商拓扑与真实流量为底座、覆盖整座城市的网络层 OCPP 攻防</w:t>
+      </w:r>
+      <w:r>
+        <w:rPr>
+          <w:bCs/>
+          <w:b/>
+        </w:rPr>
+        <w:t xml:space="preserve">实测</w:t>
+      </w:r>
+      <w:r>
+        <w:t xml:space="preserve">仿真（621 地点/39 后台）；（2）一个清晰的</w:t>
+      </w:r>
+      <w:r>
+        <w:rPr>
+          <w:bCs/>
+          <w:b/>
+        </w:rPr>
+        <w:t xml:space="preserve">宏观↔微观两层方法</w:t>
+      </w:r>
+      <w:r>
+        <w:t xml:space="preserve">——以唯一有真实会话的一家运营商标定单后台攻防动力学，再按登记容量迁移到全城，从方法上消解”多家与一家混杂”；（3）把”规模×节律”分解一物两用（背景流量生成器 + 物理一致性检测器）；（4）以”被发现前造成的损失”为主评价指标，并以 24 幅融合图（含 7 幅城市级 GIS 攻防可视化与交互式三维指挥台）在真实地图上回放。第 2 节数据与协议背景，第 3 节威胁模型、仿真底座与宏观/微观方法，第 4 节攻击面与可控性上限，第 5 节检测与遏制，第 6 节微观标定与宏观城市实测，第 7 节 GIS 可视化与工具链，第 8 节讨论与结论。</w:t>
+      </w:r>
+    </w:p>
+    <w:p>
+      <w:pPr>
+        <w:pStyle w:val="BodyText"/>
+      </w:pPr>
+      <w:r>
+        <w:drawing>
+          <wp:inline>
+            <wp:extent cx="4373880" cy="3636825"/>
+            <wp:effectExtent b="0" l="0" r="0" t="0"/>
+            <wp:docPr descr="" title="" id="25" name="Picture"/>
+            <a:graphic>
+              <a:graphicData uri="http://schemas.openxmlformats.org/drawingml/2006/picture">
+                <pic:pic>
+                  <pic:nvPicPr>
+                    <pic:cNvPr descr="figs/figC1_citymap.png" id="26" name="Picture"/>
+                    <pic:cNvPicPr>
+                      <a:picLocks noChangeArrowheads="1" noChangeAspect="1"/>
+                    </pic:cNvPicPr>
+                  </pic:nvPicPr>
+                  <pic:blipFill>
+                    <a:blip r:embed="rId24"/>
                     <a:stretch>
                       <a:fillRect/>
                     </a:stretch>
@@ -443,8 +508,8 @@
         <w:t xml:space="preserve">（GIS）巴塞罗那大都会区多运营商充电控制平面：621 个登记地点、约 73 MW、39 个相互独立的 CSMS 后台。点大小∝额定功率、颜色为前 8 家运营商后台；BSM-Endolla（绿）密集于市中心，Endesa/Iberdrola 覆盖面更广。底图为 36 个市镇。</w:t>
       </w:r>
     </w:p>
-    <w:bookmarkEnd w:id="24"/>
-    <w:bookmarkStart w:id="28" w:name="相关工作与数据基础"/>
+    <w:bookmarkEnd w:id="27"/>
+    <w:bookmarkStart w:id="31" w:name="相关工作与数据基础"/>
     <w:p>
       <w:pPr>
         <w:pStyle w:val="Heading1"/>
@@ -453,7 +518,7 @@
         <w:t xml:space="preserve">2 相关工作与数据基础</w:t>
       </w:r>
     </w:p>
-    <w:bookmarkStart w:id="25" w:name="ocpp-协议与安全"/>
+    <w:bookmarkStart w:id="28" w:name="ocpp-协议与安全"/>
     <w:p>
       <w:pPr>
         <w:pStyle w:val="Heading2"/>
@@ -482,8 +547,8 @@
         <w:t xml:space="preserve">一说本文未查得权威出处，仅作情景假设，非前提。</w:t>
       </w:r>
     </w:p>
-    <w:bookmarkEnd w:id="25"/>
-    <w:bookmarkStart w:id="26" w:name="相关安全数据集的定位"/>
+    <w:bookmarkEnd w:id="28"/>
+    <w:bookmarkStart w:id="29" w:name="相关安全数据集的定位"/>
     <w:p>
       <w:pPr>
         <w:pStyle w:val="Heading2"/>
@@ -559,8 +624,8 @@
         <w:t xml:space="preserve">为 OpenDSS 电网仿真数据，属配电物理层[15]。本文定位正是补上该交集（详表见附录 E）。</w:t>
       </w:r>
     </w:p>
-    <w:bookmarkEnd w:id="26"/>
-    <w:bookmarkStart w:id="27" w:name="城市仿真底座与多家一家的口径"/>
+    <w:bookmarkEnd w:id="29"/>
+    <w:bookmarkStart w:id="30" w:name="城市仿真底座与多家一家的口径"/>
     <w:p>
       <w:pPr>
         <w:pStyle w:val="Heading2"/>
@@ -662,9 +727,9 @@
         <w:t xml:space="preserve">分解在本文一物两用（第 3、5 节）：仅站点规模即解释约 64% 会话偏差、73% 电量偏差，加节律与设施状态升至约 68%，上限约 83%。真实数据中的若干异常（4-28 大停电、11-30 与 12-11 全网缺口）为检测器提供了实验室流量所不具备的”假阳性”考验。</w:t>
       </w:r>
     </w:p>
-    <w:bookmarkEnd w:id="27"/>
-    <w:bookmarkEnd w:id="28"/>
-    <w:bookmarkStart w:id="38" w:name="威胁模型仿真底座与宏观微观方法"/>
+    <w:bookmarkEnd w:id="30"/>
+    <w:bookmarkEnd w:id="31"/>
+    <w:bookmarkStart w:id="41" w:name="威胁模型仿真底座与宏观微观方法"/>
     <w:p>
       <w:pPr>
         <w:pStyle w:val="Heading1"/>
@@ -681,7 +746,7 @@
         <w:t xml:space="preserve">全部攻击仅在隔离仿真环境内复现，不接触任何真实充电桩、运营商后台或配电系统。</w:t>
       </w:r>
     </w:p>
-    <w:bookmarkStart w:id="29" w:name="系统与节点模型碎片化的控制平面"/>
+    <w:bookmarkStart w:id="32" w:name="系统与节点模型碎片化的控制平面"/>
     <w:p>
       <w:pPr>
         <w:pStyle w:val="Heading2"/>
@@ -740,8 +805,8 @@
         <w:t xml:space="preserve">的机队扇出指令，无法越界。电网仅作结果指标，不建潮流或频率模型；受控功率上限因而可由登记表额定功率静态推算，作为”完全控制”情形的上界（第 4 节）。</w:t>
       </w:r>
     </w:p>
-    <w:bookmarkEnd w:id="29"/>
-    <w:bookmarkStart w:id="33" w:name="宏观微观两层方法本文的组织主线"/>
+    <w:bookmarkEnd w:id="32"/>
+    <w:bookmarkStart w:id="36" w:name="宏观微观两层方法本文的组织主线"/>
     <w:p>
       <w:pPr>
         <w:pStyle w:val="Heading2"/>
@@ -897,18 +962,18 @@
           <wp:inline>
             <wp:extent cx="5120640" cy="2469718"/>
             <wp:effectExtent b="0" l="0" r="0" t="0"/>
-            <wp:docPr descr="" title="" id="31" name="Picture"/>
+            <wp:docPr descr="" title="" id="34" name="Picture"/>
             <a:graphic>
               <a:graphicData uri="http://schemas.openxmlformats.org/drawingml/2006/picture">
                 <pic:pic>
                   <pic:nvPicPr>
-                    <pic:cNvPr descr="figs/figC0_bridge.png" id="32" name="Picture"/>
+                    <pic:cNvPr descr="figs/figC0_bridge.png" id="35" name="Picture"/>
                     <pic:cNvPicPr>
                       <a:picLocks noChangeArrowheads="1" noChangeAspect="1"/>
                     </pic:cNvPicPr>
                   </pic:nvPicPr>
                   <pic:blipFill>
-                    <a:blip r:embed="rId30"/>
+                    <a:blip r:embed="rId33"/>
                     <a:stretch>
                       <a:fillRect/>
                     </a:stretch>
@@ -953,8 +1018,8 @@
         <w:t xml:space="preserve">宏观↔微观桥接：城市 = 各运营商后台之和；以 AMB 一家真实会话标定单后台攻防动力学（实测 D0 受控电量≈2,115 kWh、隔离后≈9.7 kWh、τ_d≈0–1 min、误报 0），再按登记容量迁移至全城其余 36 家后台。</w:t>
       </w:r>
     </w:p>
-    <w:bookmarkEnd w:id="33"/>
-    <w:bookmarkStart w:id="37" w:name="威胁模型与真实异常考验"/>
+    <w:bookmarkEnd w:id="36"/>
+    <w:bookmarkStart w:id="40" w:name="威胁模型与真实异常考验"/>
     <w:p>
       <w:pPr>
         <w:pStyle w:val="Heading2"/>
@@ -980,18 +1045,18 @@
           <wp:inline>
             <wp:extent cx="4267200" cy="2362463"/>
             <wp:effectExtent b="0" l="0" r="0" t="0"/>
-            <wp:docPr descr="" title="" id="35" name="Picture"/>
+            <wp:docPr descr="" title="" id="38" name="Picture"/>
             <a:graphic>
               <a:graphicData uri="http://schemas.openxmlformats.org/drawingml/2006/picture">
                 <pic:pic>
                   <pic:nvPicPr>
-                    <pic:cNvPr descr="figs/fig2_threat.png" id="36" name="Picture"/>
+                    <pic:cNvPr descr="figs/fig2_threat.png" id="39" name="Picture"/>
                     <pic:cNvPicPr>
                       <a:picLocks noChangeArrowheads="1" noChangeAspect="1"/>
                     </pic:cNvPicPr>
                   </pic:nvPicPr>
                   <pic:blipFill>
-                    <a:blip r:embed="rId34"/>
+                    <a:blip r:embed="rId37"/>
                     <a:stretch>
                       <a:fillRect/>
                     </a:stretch>
@@ -1036,9 +1101,9 @@
         <w:t xml:space="preserve">威胁模型：OCPP 控制通道上的四类攻击者位置。A 中间人、B 冒充桩/克隆 RFID、C 后台被攻破、D 对后台 DoS；电网仅作结果指标（虚线）。</w:t>
       </w:r>
     </w:p>
-    <w:bookmarkEnd w:id="37"/>
-    <w:bookmarkEnd w:id="38"/>
-    <w:bookmarkStart w:id="48" w:name="攻击面与可控性上限静态天花板"/>
+    <w:bookmarkEnd w:id="40"/>
+    <w:bookmarkEnd w:id="41"/>
+    <w:bookmarkStart w:id="51" w:name="攻击面与可控性上限静态天花板"/>
     <w:p>
       <w:pPr>
         <w:pStyle w:val="Heading1"/>
@@ -1427,18 +1492,18 @@
           <wp:inline>
             <wp:extent cx="4800600" cy="2634985"/>
             <wp:effectExtent b="0" l="0" r="0" t="0"/>
-            <wp:docPr descr="" title="" id="40" name="Picture"/>
+            <wp:docPr descr="" title="" id="43" name="Picture"/>
             <a:graphic>
               <a:graphicData uri="http://schemas.openxmlformats.org/drawingml/2006/picture">
                 <pic:pic>
                   <pic:nvPicPr>
-                    <pic:cNvPr descr="figs/fig3_surface.png" id="41" name="Picture"/>
+                    <pic:cNvPr descr="figs/fig3_surface.png" id="44" name="Picture"/>
                     <pic:cNvPicPr>
                       <a:picLocks noChangeArrowheads="1" noChangeAspect="1"/>
                     </pic:cNvPicPr>
                   </pic:nvPicPr>
                   <pic:blipFill>
-                    <a:blip r:embed="rId39"/>
+                    <a:blip r:embed="rId42"/>
                     <a:stretch>
                       <a:fillRect/>
                     </a:stretch>
@@ -1492,18 +1557,18 @@
           <wp:inline>
             <wp:extent cx="4800600" cy="2121851"/>
             <wp:effectExtent b="0" l="0" r="0" t="0"/>
-            <wp:docPr descr="" title="" id="43" name="Picture"/>
+            <wp:docPr descr="" title="" id="46" name="Picture"/>
             <a:graphic>
               <a:graphicData uri="http://schemas.openxmlformats.org/drawingml/2006/picture">
                 <pic:pic>
                   <pic:nvPicPr>
-                    <pic:cNvPr descr="figs/fig13_reach.png" id="44" name="Picture"/>
+                    <pic:cNvPr descr="figs/fig13_reach.png" id="47" name="Picture"/>
                     <pic:cNvPicPr>
                       <a:picLocks noChangeArrowheads="1" noChangeAspect="1"/>
                     </pic:cNvPicPr>
                   </pic:nvPicPr>
                   <pic:blipFill>
-                    <a:blip r:embed="rId42"/>
+                    <a:blip r:embed="rId45"/>
                     <a:stretch>
                       <a:fillRect/>
                     </a:stretch>
@@ -1557,18 +1622,18 @@
           <wp:inline>
             <wp:extent cx="4693920" cy="2214113"/>
             <wp:effectExtent b="0" l="0" r="0" t="0"/>
-            <wp:docPr descr="" title="" id="46" name="Picture"/>
+            <wp:docPr descr="" title="" id="49" name="Picture"/>
             <a:graphic>
               <a:graphicData uri="http://schemas.openxmlformats.org/drawingml/2006/picture">
                 <pic:pic>
                   <pic:nvPicPr>
-                    <pic:cNvPr descr="figs/fig19_lorenz.png" id="47" name="Picture"/>
+                    <pic:cNvPr descr="figs/fig19_lorenz.png" id="50" name="Picture"/>
                     <pic:cNvPicPr>
                       <a:picLocks noChangeArrowheads="1" noChangeAspect="1"/>
                     </pic:cNvPicPr>
                   </pic:nvPicPr>
                   <pic:blipFill>
-                    <a:blip r:embed="rId45"/>
+                    <a:blip r:embed="rId48"/>
                     <a:stretch>
                       <a:fillRect/>
                     </a:stretch>
@@ -1613,8 +1678,8 @@
         <w:t xml:space="preserve">可控功率的运营商集中度。(a) 前 10 家后台≈80% 功率；(b) 洛伦兹曲线，Gini 0.70。</w:t>
       </w:r>
     </w:p>
-    <w:bookmarkEnd w:id="48"/>
-    <w:bookmarkStart w:id="52" w:name="防御检测与遏制"/>
+    <w:bookmarkEnd w:id="51"/>
+    <w:bookmarkStart w:id="55" w:name="防御检测与遏制"/>
     <w:p>
       <w:pPr>
         <w:pStyle w:val="Heading1"/>
@@ -1837,18 +1902,18 @@
           <wp:inline>
             <wp:extent cx="4693920" cy="2925335"/>
             <wp:effectExtent b="0" l="0" r="0" t="0"/>
-            <wp:docPr descr="" title="" id="50" name="Picture"/>
+            <wp:docPr descr="" title="" id="53" name="Picture"/>
             <a:graphic>
               <a:graphicData uri="http://schemas.openxmlformats.org/drawingml/2006/picture">
                 <pic:pic>
                   <pic:nvPicPr>
-                    <pic:cNvPr descr="figs/fig6_detector.png" id="51" name="Picture"/>
+                    <pic:cNvPr descr="figs/fig6_detector.png" id="54" name="Picture"/>
                     <pic:cNvPicPr>
                       <a:picLocks noChangeArrowheads="1" noChangeAspect="1"/>
                     </pic:cNvPicPr>
                   </pic:nvPicPr>
                   <pic:blipFill>
-                    <a:blip r:embed="rId49"/>
+                    <a:blip r:embed="rId52"/>
                     <a:stretch>
                       <a:fillRect/>
                     </a:stretch>
@@ -1893,8 +1958,8 @@
         <w:t xml:space="preserve">物理一致性检测器在真实日序列上的行为。上：全网日会话数与”规模×节律”28 日稳健基线（1 月 9,578→12 月 14,330 次）；下：观测/期望一致性比，4-28 大停电全网同步跌至 0.53（良性）、注入的伪造电表读数单站冲高越过上带（告警）。</w:t>
       </w:r>
     </w:p>
-    <w:bookmarkEnd w:id="52"/>
-    <w:bookmarkStart w:id="73" w:name="微观标定与宏观城市实测"/>
+    <w:bookmarkEnd w:id="55"/>
+    <w:bookmarkStart w:id="76" w:name="微观标定与宏观城市实测"/>
     <w:p>
       <w:pPr>
         <w:pStyle w:val="Heading1"/>
@@ -1921,7 +1986,7 @@
         <w:t xml:space="preserve">。</w:t>
       </w:r>
     </w:p>
-    <w:bookmarkStart w:id="59" w:name="微观层amb-标定单元一家真实会话"/>
+    <w:bookmarkStart w:id="62" w:name="微观层amb-标定单元一家真实会话"/>
     <w:p>
       <w:pPr>
         <w:pStyle w:val="Heading2"/>
@@ -1974,18 +2039,18 @@
           <wp:inline>
             <wp:extent cx="4373880" cy="2231717"/>
             <wp:effectExtent b="0" l="0" r="0" t="0"/>
-            <wp:docPr descr="" title="" id="54" name="Picture"/>
+            <wp:docPr descr="" title="" id="57" name="Picture"/>
             <a:graphic>
               <a:graphicData uri="http://schemas.openxmlformats.org/drawingml/2006/picture">
                 <pic:pic>
                   <pic:nvPicPr>
-                    <pic:cNvPr descr="figs/fig17_matrix.png" id="55" name="Picture"/>
+                    <pic:cNvPr descr="figs/fig17_matrix.png" id="58" name="Picture"/>
                     <pic:cNvPicPr>
                       <a:picLocks noChangeArrowheads="1" noChangeAspect="1"/>
                     </pic:cNvPicPr>
                   </pic:nvPicPr>
                   <pic:blipFill>
-                    <a:blip r:embed="rId53"/>
+                    <a:blip r:embed="rId56"/>
                     <a:stretch>
                       <a:fillRect/>
                     </a:stretch>
@@ -2039,18 +2104,18 @@
           <wp:inline>
             <wp:extent cx="4800600" cy="2052087"/>
             <wp:effectExtent b="0" l="0" r="0" t="0"/>
-            <wp:docPr descr="" title="" id="57" name="Picture"/>
+            <wp:docPr descr="" title="" id="60" name="Picture"/>
             <a:graphic>
               <a:graphicData uri="http://schemas.openxmlformats.org/drawingml/2006/picture">
                 <pic:pic>
                   <pic:nvPicPr>
-                    <pic:cNvPr descr="figs/fig18_latency.png" id="58" name="Picture"/>
+                    <pic:cNvPr descr="figs/fig18_latency.png" id="61" name="Picture"/>
                     <pic:cNvPicPr>
                       <a:picLocks noChangeArrowheads="1" noChangeAspect="1"/>
                     </pic:cNvPicPr>
                   </pic:nvPicPr>
                   <pic:blipFill>
-                    <a:blip r:embed="rId56"/>
+                    <a:blip r:embed="rId59"/>
                     <a:stretch>
                       <a:fillRect/>
                     </a:stretch>
@@ -2095,8 +2160,8 @@
         <w:t xml:space="preserve">微观标定（AMB 一家）：防御配置对残余损失与检测时延的影响。(a) 残余受控电量 ΔE（对数）；(b) 检测时延 τ_d。仅检测/限速不减损失，隔离降幅 &gt;99%。</w:t>
       </w:r>
     </w:p>
-    <w:bookmarkEnd w:id="59"/>
-    <w:bookmarkStart w:id="72" w:name="宏观层全城多运营商实测多家"/>
+    <w:bookmarkEnd w:id="62"/>
+    <w:bookmarkStart w:id="75" w:name="宏观层全城多运营商实测多家"/>
     <w:p>
       <w:pPr>
         <w:pStyle w:val="Heading2"/>
@@ -2150,18 +2215,18 @@
           <wp:inline>
             <wp:extent cx="5227320" cy="3009052"/>
             <wp:effectExtent b="0" l="0" r="0" t="0"/>
-            <wp:docPr descr="" title="" id="61" name="Picture"/>
+            <wp:docPr descr="" title="" id="64" name="Picture"/>
             <a:graphic>
               <a:graphicData uri="http://schemas.openxmlformats.org/drawingml/2006/picture">
                 <pic:pic>
                   <pic:nvPicPr>
-                    <pic:cNvPr descr="figs/figC2_blast_single.png" id="62" name="Picture"/>
+                    <pic:cNvPr descr="figs/figC2_blast_single.png" id="65" name="Picture"/>
                     <pic:cNvPicPr>
                       <a:picLocks noChangeArrowheads="1" noChangeAspect="1"/>
                     </pic:cNvPicPr>
                   </pic:nvPicPr>
                   <pic:blipFill>
-                    <a:blip r:embed="rId60"/>
+                    <a:blip r:embed="rId63"/>
                     <a:stretch>
                       <a:fillRect/>
                     </a:stretch>
@@ -2212,18 +2277,18 @@
           <wp:inline>
             <wp:extent cx="5227320" cy="2299812"/>
             <wp:effectExtent b="0" l="0" r="0" t="0"/>
-            <wp:docPr descr="" title="" id="64" name="Picture"/>
+            <wp:docPr descr="" title="" id="67" name="Picture"/>
             <a:graphic>
               <a:graphicData uri="http://schemas.openxmlformats.org/drawingml/2006/picture">
                 <pic:pic>
                   <pic:nvPicPr>
-                    <pic:cNvPr descr="figs/figC3_single_backend.png" id="65" name="Picture"/>
+                    <pic:cNvPr descr="figs/figC3_single_backend.png" id="68" name="Picture"/>
                     <pic:cNvPicPr>
                       <a:picLocks noChangeArrowheads="1" noChangeAspect="1"/>
                     </pic:cNvPicPr>
                   </pic:nvPicPr>
                   <pic:blipFill>
-                    <a:blip r:embed="rId63"/>
+                    <a:blip r:embed="rId66"/>
                     <a:stretch>
                       <a:fillRect/>
                     </a:stretch>
@@ -2413,18 +2478,18 @@
           <wp:inline>
             <wp:extent cx="5227320" cy="2877423"/>
             <wp:effectExtent b="0" l="0" r="0" t="0"/>
-            <wp:docPr descr="" title="" id="67" name="Picture"/>
+            <wp:docPr descr="" title="" id="70" name="Picture"/>
             <a:graphic>
               <a:graphicData uri="http://schemas.openxmlformats.org/drawingml/2006/picture">
                 <pic:pic>
                   <pic:nvPicPr>
-                    <pic:cNvPr descr="figs/figC4_campaign.png" id="68" name="Picture"/>
+                    <pic:cNvPr descr="figs/figC4_campaign.png" id="71" name="Picture"/>
                     <pic:cNvPicPr>
                       <a:picLocks noChangeArrowheads="1" noChangeAspect="1"/>
                     </pic:cNvPicPr>
                   </pic:nvPicPr>
                   <pic:blipFill>
-                    <a:blip r:embed="rId66"/>
+                    <a:blip r:embed="rId69"/>
                     <a:stretch>
                       <a:fillRect/>
                     </a:stretch>
@@ -2522,18 +2587,18 @@
           <wp:inline>
             <wp:extent cx="5120640" cy="2098580"/>
             <wp:effectExtent b="0" l="0" r="0" t="0"/>
-            <wp:docPr descr="" title="" id="70" name="Picture"/>
+            <wp:docPr descr="" title="" id="73" name="Picture"/>
             <a:graphic>
               <a:graphicData uri="http://schemas.openxmlformats.org/drawingml/2006/picture">
                 <pic:pic>
                   <pic:nvPicPr>
-                    <pic:cNvPr descr="figs/figC6_vectors.png" id="71" name="Picture"/>
+                    <pic:cNvPr descr="figs/figC6_vectors.png" id="74" name="Picture"/>
                     <pic:cNvPicPr>
                       <a:picLocks noChangeArrowheads="1" noChangeAspect="1"/>
                     </pic:cNvPicPr>
                   </pic:nvPicPr>
                   <pic:blipFill>
-                    <a:blip r:embed="rId69"/>
+                    <a:blip r:embed="rId72"/>
                     <a:stretch>
                       <a:fillRect/>
                     </a:stretch>
@@ -2634,9 +2699,9 @@
         <w:t xml:space="preserve">并用指令速率（2 分钟内≥5 条控制指令告警）与规模×节律功率一致性（观测/预期出带持续 2 分钟告警）；遏制为指令限速与告警后 1 分钟隔离恢复。微观标定单元与宏观实测在物理上自洽：AMB 域无防御受控电量 2,115 kWh、峰值受控 0.886 MW，与独立负荷重建（附录图，峰值≈0.40 MW 小时均、瞬时并发更高）量级一致。每格三次重复（攻击起始 17:30/18:00/18:30）取中位数。真实异常套件充当”闸门”：任一配置须在三类真实异常上把误报率控制在上限内，否则不计入主比较。</w:t>
       </w:r>
     </w:p>
-    <w:bookmarkEnd w:id="72"/>
-    <w:bookmarkEnd w:id="73"/>
-    <w:bookmarkStart w:id="80" w:name="gis-攻防可视化与工具链"/>
+    <w:bookmarkEnd w:id="75"/>
+    <w:bookmarkEnd w:id="76"/>
+    <w:bookmarkStart w:id="83" w:name="gis-攻防可视化与工具链"/>
     <w:p>
       <w:pPr>
         <w:pStyle w:val="Heading1"/>
@@ -2761,18 +2826,18 @@
           <wp:inline>
             <wp:extent cx="5227320" cy="1704463"/>
             <wp:effectExtent b="0" l="0" r="0" t="0"/>
-            <wp:docPr descr="" title="" id="75" name="Picture"/>
+            <wp:docPr descr="" title="" id="78" name="Picture"/>
             <a:graphic>
               <a:graphicData uri="http://schemas.openxmlformats.org/drawingml/2006/picture">
                 <pic:pic>
                   <pic:nvPicPr>
-                    <pic:cNvPr descr="figs/figC5_storyboard.png" id="76" name="Picture"/>
+                    <pic:cNvPr descr="figs/figC5_storyboard.png" id="79" name="Picture"/>
                     <pic:cNvPicPr>
                       <a:picLocks noChangeArrowheads="1" noChangeAspect="1"/>
                     </pic:cNvPicPr>
                   </pic:nvPicPr>
                   <pic:blipFill>
-                    <a:blip r:embed="rId74"/>
+                    <a:blip r:embed="rId77"/>
                     <a:stretch>
                       <a:fillRect/>
                     </a:stretch>
@@ -2823,18 +2888,18 @@
           <wp:inline>
             <wp:extent cx="5227320" cy="2362318"/>
             <wp:effectExtent b="0" l="0" r="0" t="0"/>
-            <wp:docPr descr="" title="" id="78" name="Picture"/>
+            <wp:docPr descr="" title="" id="81" name="Picture"/>
             <a:graphic>
               <a:graphicData uri="http://schemas.openxmlformats.org/drawingml/2006/picture">
                 <pic:pic>
                   <pic:nvPicPr>
-                    <pic:cNvPr descr="figs/fig11_gis_timeline.png" id="79" name="Picture"/>
+                    <pic:cNvPr descr="figs/fig11_gis_timeline.png" id="82" name="Picture"/>
                     <pic:cNvPicPr>
                       <a:picLocks noChangeArrowheads="1" noChangeAspect="1"/>
                     </pic:cNvPicPr>
                   </pic:nvPicPr>
                   <pic:blipFill>
-                    <a:blip r:embed="rId77"/>
+                    <a:blip r:embed="rId80"/>
                     <a:stretch>
                       <a:fillRect/>
                     </a:stretch>
@@ -2909,8 +2974,8 @@
         <w:t xml:space="preserve">库[16]启异步客户端，回放真实会话或以”规模×节律”生成背景流量；CSMS 侧可用 SteVe[17]（1.6）/CitrineOS[18]（2.0.1）使协议版本可切换；拓扑由 Mininet/IPMininet[19]搭建、隔离边界与联邦节点显式建模；攻击由 mitmproxy 注入、流量特征由 NFStream 提取[20]；EmuOCPP[22]可作全保真底座起点。异步 IO 使单机即可承载数百个并发 OCPP 会话——本文 621 桩全真实连接、全矩阵批量重跑耗时数分钟，支持地图回放的可复现归档。</w:t>
       </w:r>
     </w:p>
-    <w:bookmarkEnd w:id="80"/>
-    <w:bookmarkStart w:id="88" w:name="讨论伦理边界与结论"/>
+    <w:bookmarkEnd w:id="83"/>
+    <w:bookmarkStart w:id="91" w:name="讨论伦理边界与结论"/>
     <w:p>
       <w:pPr>
         <w:pStyle w:val="Heading1"/>
@@ -2919,7 +2984,7 @@
         <w:t xml:space="preserve">8 讨论、伦理边界与结论</w:t>
       </w:r>
     </w:p>
-    <w:bookmarkStart w:id="84" w:name="能与不能回答的问题"/>
+    <w:bookmarkStart w:id="87" w:name="能与不能回答的问题"/>
     <w:p>
       <w:pPr>
         <w:pStyle w:val="Heading2"/>
@@ -2977,18 +3042,18 @@
           <wp:inline>
             <wp:extent cx="3840480" cy="2278183"/>
             <wp:effectExtent b="0" l="0" r="0" t="0"/>
-            <wp:docPr descr="" title="" id="82" name="Picture"/>
+            <wp:docPr descr="" title="" id="85" name="Picture"/>
             <a:graphic>
               <a:graphicData uri="http://schemas.openxmlformats.org/drawingml/2006/picture">
                 <pic:pic>
                   <pic:nvPicPr>
-                    <pic:cNvPr descr="figs/fig20_grid.png" id="83" name="Picture"/>
+                    <pic:cNvPr descr="figs/fig20_grid.png" id="86" name="Picture"/>
                     <pic:cNvPicPr>
                       <a:picLocks noChangeArrowheads="1" noChangeAspect="1"/>
                     </pic:cNvPicPr>
                   </pic:nvPicPr>
                   <pic:blipFill>
-                    <a:blip r:embed="rId81"/>
+                    <a:blip r:embed="rId84"/>
                     <a:stretch>
                       <a:fillRect/>
                     </a:stretch>
@@ -3033,8 +3098,8 @@
         <w:t xml:space="preserve">网络层可控量→电网结果指标：AMB 全部登记 63.47 MW（0.16%）远低于 UFLS 触发带 9–11%。据[8]的 SFR 阈值线性化，AMB 位置为本文计算。</w:t>
       </w:r>
     </w:p>
-    <w:bookmarkEnd w:id="84"/>
-    <w:bookmarkStart w:id="85" w:name="协议迁移与可迁移性"/>
+    <w:bookmarkEnd w:id="87"/>
+    <w:bookmarkStart w:id="88" w:name="协议迁移与可迁移性"/>
     <w:p>
       <w:pPr>
         <w:pStyle w:val="Heading2"/>
@@ -3051,8 +3116,8 @@
         <w:t xml:space="preserve">OCPP 版本直接决定可控性（图 5）：1.6 下中间人篡改、伪造电表与重放授权在未加密链路上现实可行；迁移到 2.0.1/2.1 后强制 TLS、设备证书与安全事件日志显著压缩中间人与冒充类攻击面[12,13]，但后台被攻破后的批量限功率/停充、以及连接层 DoS 并不随协议升级消失（图 5 的 A3/A4 行）。本框架不绑定巴塞罗那：任何 AFIR 城市都有等价的国家接入点登记表底座，且控制平面天然碎片化，宏观/微观方法可直接移植；但具体数值不可迁移——运营商数量与功率集中度（Gini 0.70）、认证构成（2,897/3,302 为 rfid;apps）、设施倍数等须在当地重估。</w:t>
       </w:r>
     </w:p>
-    <w:bookmarkEnd w:id="85"/>
-    <w:bookmarkStart w:id="86" w:name="伦理边界与局限"/>
+    <w:bookmarkEnd w:id="88"/>
+    <w:bookmarkStart w:id="89" w:name="伦理边界与局限"/>
     <w:p>
       <w:pPr>
         <w:pStyle w:val="Heading2"/>
@@ -3079,8 +3144,8 @@
         <w:t xml:space="preserve">（AMB 网络，微观标定单元），其余 36 家后台的需求借”规模×节律”按登记容量合成、其不确定性随指标报告——这正是本文采用宏观/微观两层、以”一家”标定”多家”的根本原因；AMB 网络与 Iberdrola 登记存在 33 站重叠，城市底座（73 MW）因此与 DGT 登记（63.47 MW）口径不同，已分别标注；DGT 登记表缺投运日期与配电拓扑；协议版本存在不确定性，只能以情景变量覆盖；城市层一致性检测器按后台聚合，较微观单站级粗，隐蔽篡改下与限速的交互（图 13）即其体现。</w:t>
       </w:r>
     </w:p>
-    <w:bookmarkEnd w:id="86"/>
-    <w:bookmarkStart w:id="87" w:name="结论"/>
+    <w:bookmarkEnd w:id="89"/>
+    <w:bookmarkStart w:id="90" w:name="结论"/>
     <w:p>
       <w:pPr>
         <w:pStyle w:val="Heading2"/>
@@ -3117,9 +3182,9 @@
         <w:t xml:space="preserve">——单后台沦陷与协同 5 家 campaign 均被压到数十 kWh（&gt;99%），而仅检测或仅限速几乎不减损失；链路加密只压制中间人与克隆类（A1/A2），对后台攻陷与 DoS（A3/A4）无效。（4）评价应以”被发现前造成的损失”为主指标，并全部可在真实地图上按时间轴、按运营商回放。（5）电网只宜作结果指标：全城 63.47 MW 远低于触发 UFLS 的规模。后续工作：接入站点动态可用性数据替代静态登记假设，以其他 AFIR 城市数据检验外部有效性，并将协议版本纳入情景扫描以量化迁移收益。</w:t>
       </w:r>
     </w:p>
-    <w:bookmarkEnd w:id="87"/>
-    <w:bookmarkEnd w:id="88"/>
-    <w:bookmarkStart w:id="89" w:name="参考文献"/>
+    <w:bookmarkEnd w:id="90"/>
+    <w:bookmarkEnd w:id="91"/>
+    <w:bookmarkStart w:id="92" w:name="参考文献"/>
     <w:p>
       <w:pPr>
         <w:pStyle w:val="Heading1"/>
@@ -3412,8 +3477,8 @@
         </w:pict>
       </w:r>
     </w:p>
-    <w:bookmarkEnd w:id="89"/>
-    <w:bookmarkStart w:id="90" w:name="附录-a-正文数字核对表来源与口径"/>
+    <w:bookmarkEnd w:id="92"/>
+    <w:bookmarkStart w:id="93" w:name="附录-a-正文数字核对表来源与口径"/>
     <w:p>
       <w:pPr>
         <w:pStyle w:val="Heading1"/>
@@ -4293,8 +4358,8 @@
         </w:tc>
       </w:tr>
     </w:tbl>
-    <w:bookmarkEnd w:id="90"/>
-    <w:bookmarkStart w:id="91" w:name="附录-b-完整场景矩阵"/>
+    <w:bookmarkEnd w:id="93"/>
+    <w:bookmarkStart w:id="94" w:name="附录-b-完整场景矩阵"/>
     <w:p>
       <w:pPr>
         <w:pStyle w:val="Heading1"/>
@@ -4414,8 +4479,8 @@
         <w:t xml:space="preserve">：扇出速率（快速 30 / 隐蔽 3 指令/分）× 协同度（单后台 / 协同多后台）× 目标选择（随机 / 择直流高功率）。受控功率上限 = 登记表额定功率在受控集合上的求和。</w:t>
       </w:r>
     </w:p>
-    <w:bookmarkEnd w:id="91"/>
-    <w:bookmarkStart w:id="92" w:name="附录-c-指标形式化定义"/>
+    <w:bookmarkEnd w:id="94"/>
+    <w:bookmarkStart w:id="95" w:name="附录-c-指标形式化定义"/>
     <w:p>
       <w:pPr>
         <w:pStyle w:val="Heading1"/>
@@ -4571,8 +4636,8 @@
         <w:t xml:space="preserve">_真实|·电价；偷电量=未授权交付 kWh。误报率 FPR=FP/(FP+TN)。各指标报告跨重复运行的中位数。</w:t>
       </w:r>
     </w:p>
-    <w:bookmarkEnd w:id="92"/>
-    <w:bookmarkStart w:id="123" w:name="附录-d-ocpp-仿真平台宏观微观口径与负荷重建"/>
+    <w:bookmarkEnd w:id="95"/>
+    <w:bookmarkStart w:id="126" w:name="附录-d-ocpp-仿真平台宏观微观口径与负荷重建"/>
     <w:p>
       <w:pPr>
         <w:pStyle w:val="Heading1"/>
@@ -4736,18 +4801,18 @@
           <wp:inline>
             <wp:extent cx="3733800" cy="2100499"/>
             <wp:effectExtent b="0" l="0" r="0" t="0"/>
-            <wp:docPr descr="" title="" id="94" name="Picture"/>
+            <wp:docPr descr="" title="" id="97" name="Picture"/>
             <a:graphic>
               <a:graphicData uri="http://schemas.openxmlformats.org/drawingml/2006/picture">
                 <pic:pic>
                   <pic:nvPicPr>
-                    <pic:cNvPr descr="figs/figA1_containment.png" id="95" name="Picture"/>
+                    <pic:cNvPr descr="figs/figA1_containment.png" id="98" name="Picture"/>
                     <pic:cNvPicPr>
                       <a:picLocks noChangeArrowheads="1" noChangeAspect="1"/>
                     </pic:cNvPicPr>
                   </pic:nvPicPr>
                   <pic:blipFill>
-                    <a:blip r:embed="rId93"/>
+                    <a:blip r:embed="rId96"/>
                     <a:stretch>
                       <a:fillRect/>
                     </a:stretch>
@@ -4801,18 +4866,18 @@
           <wp:inline>
             <wp:extent cx="3200400" cy="1813809"/>
             <wp:effectExtent b="0" l="0" r="0" t="0"/>
-            <wp:docPr descr="" title="" id="97" name="Picture"/>
+            <wp:docPr descr="" title="" id="100" name="Picture"/>
             <a:graphic>
               <a:graphicData uri="http://schemas.openxmlformats.org/drawingml/2006/picture">
                 <pic:pic>
                   <pic:nvPicPr>
-                    <pic:cNvPr descr="figs/figA2_load.png" id="98" name="Picture"/>
+                    <pic:cNvPr descr="figs/figA2_load.png" id="101" name="Picture"/>
                     <pic:cNvPicPr>
                       <a:picLocks noChangeArrowheads="1" noChangeAspect="1"/>
                     </pic:cNvPicPr>
                   </pic:nvPicPr>
                   <pic:blipFill>
-                    <a:blip r:embed="rId96"/>
+                    <a:blip r:embed="rId99"/>
                     <a:stretch>
                       <a:fillRect/>
                     </a:stretch>
@@ -4866,18 +4931,18 @@
           <wp:inline>
             <wp:extent cx="4907280" cy="2840520"/>
             <wp:effectExtent b="0" l="0" r="0" t="0"/>
-            <wp:docPr descr="" title="" id="100" name="Picture"/>
+            <wp:docPr descr="" title="" id="103" name="Picture"/>
             <a:graphic>
               <a:graphicData uri="http://schemas.openxmlformats.org/drawingml/2006/picture">
                 <pic:pic>
                   <pic:nvPicPr>
-                    <pic:cNvPr descr="figs/fig5_temporal.png" id="101" name="Picture"/>
+                    <pic:cNvPr descr="figs/fig5_temporal.png" id="104" name="Picture"/>
                     <pic:cNvPicPr>
                       <a:picLocks noChangeArrowheads="1" noChangeAspect="1"/>
                     </pic:cNvPicPr>
                   </pic:nvPicPr>
                   <pic:blipFill>
-                    <a:blip r:embed="rId99"/>
+                    <a:blip r:embed="rId102"/>
                     <a:stretch>
                       <a:fillRect/>
                     </a:stretch>
@@ -4931,18 +4996,18 @@
           <wp:inline>
             <wp:extent cx="5013960" cy="2264938"/>
             <wp:effectExtent b="0" l="0" r="0" t="0"/>
-            <wp:docPr descr="" title="" id="103" name="Picture"/>
+            <wp:docPr descr="" title="" id="106" name="Picture"/>
             <a:graphic>
               <a:graphicData uri="http://schemas.openxmlformats.org/drawingml/2006/picture">
                 <pic:pic>
                   <pic:nvPicPr>
-                    <pic:cNvPr descr="figs/fig14_arrival.png" id="104" name="Picture"/>
+                    <pic:cNvPr descr="figs/fig14_arrival.png" id="107" name="Picture"/>
                     <pic:cNvPicPr>
                       <a:picLocks noChangeArrowheads="1" noChangeAspect="1"/>
                     </pic:cNvPicPr>
                   </pic:nvPicPr>
                   <pic:blipFill>
-                    <a:blip r:embed="rId102"/>
+                    <a:blip r:embed="rId105"/>
                     <a:stretch>
                       <a:fillRect/>
                     </a:stretch>
@@ -4996,18 +5061,18 @@
           <wp:inline>
             <wp:extent cx="4907280" cy="2009166"/>
             <wp:effectExtent b="0" l="0" r="0" t="0"/>
-            <wp:docPr descr="" title="" id="106" name="Picture"/>
+            <wp:docPr descr="" title="" id="109" name="Picture"/>
             <a:graphic>
               <a:graphicData uri="http://schemas.openxmlformats.org/drawingml/2006/picture">
                 <pic:pic>
                   <pic:nvPicPr>
-                    <pic:cNvPr descr="figs/fig15_chargetype.png" id="107" name="Picture"/>
+                    <pic:cNvPr descr="figs/fig15_chargetype.png" id="110" name="Picture"/>
                     <pic:cNvPicPr>
                       <a:picLocks noChangeArrowheads="1" noChangeAspect="1"/>
                     </pic:cNvPicPr>
                   </pic:nvPicPr>
                   <pic:blipFill>
-                    <a:blip r:embed="rId105"/>
+                    <a:blip r:embed="rId108"/>
                     <a:stretch>
                       <a:fillRect/>
                     </a:stretch>
@@ -5061,18 +5126,18 @@
           <wp:inline>
             <wp:extent cx="4800600" cy="2132020"/>
             <wp:effectExtent b="0" l="0" r="0" t="0"/>
-            <wp:docPr descr="" title="" id="109" name="Picture"/>
+            <wp:docPr descr="" title="" id="112" name="Picture"/>
             <a:graphic>
               <a:graphicData uri="http://schemas.openxmlformats.org/drawingml/2006/picture">
                 <pic:pic>
                   <pic:nvPicPr>
-                    <pic:cNvPr descr="figs/fig16_monthly.png" id="110" name="Picture"/>
+                    <pic:cNvPr descr="figs/fig16_monthly.png" id="113" name="Picture"/>
                     <pic:cNvPicPr>
                       <a:picLocks noChangeArrowheads="1" noChangeAspect="1"/>
                     </pic:cNvPicPr>
                   </pic:nvPicPr>
                   <pic:blipFill>
-                    <a:blip r:embed="rId108"/>
+                    <a:blip r:embed="rId111"/>
                     <a:stretch>
                       <a:fillRect/>
                     </a:stretch>
@@ -5126,18 +5191,18 @@
           <wp:inline>
             <wp:extent cx="3733800" cy="3582634"/>
             <wp:effectExtent b="0" l="0" r="0" t="0"/>
-            <wp:docPr descr="" title="" id="112" name="Picture"/>
+            <wp:docPr descr="" title="" id="115" name="Picture"/>
             <a:graphic>
               <a:graphicData uri="http://schemas.openxmlformats.org/drawingml/2006/picture">
                 <pic:pic>
                   <pic:nvPicPr>
-                    <pic:cNvPr descr="figs/fig07_gis_surface.png" id="113" name="Picture"/>
+                    <pic:cNvPr descr="figs/fig07_gis_surface.png" id="116" name="Picture"/>
                     <pic:cNvPicPr>
                       <a:picLocks noChangeArrowheads="1" noChangeAspect="1"/>
                     </pic:cNvPicPr>
                   </pic:nvPicPr>
                   <pic:blipFill>
-                    <a:blip r:embed="rId111"/>
+                    <a:blip r:embed="rId114"/>
                     <a:stretch>
                       <a:fillRect/>
                     </a:stretch>
@@ -5188,18 +5253,18 @@
           <wp:inline>
             <wp:extent cx="3627120" cy="3466239"/>
             <wp:effectExtent b="0" l="0" r="0" t="0"/>
-            <wp:docPr descr="" title="" id="115" name="Picture"/>
+            <wp:docPr descr="" title="" id="118" name="Picture"/>
             <a:graphic>
               <a:graphicData uri="http://schemas.openxmlformats.org/drawingml/2006/picture">
                 <pic:pic>
                   <pic:nvPicPr>
-                    <pic:cNvPr descr="figs/fig12_gis_zones.png" id="116" name="Picture"/>
+                    <pic:cNvPr descr="figs/fig12_gis_zones.png" id="119" name="Picture"/>
                     <pic:cNvPicPr>
                       <a:picLocks noChangeArrowheads="1" noChangeAspect="1"/>
                     </pic:cNvPicPr>
                   </pic:nvPicPr>
                   <pic:blipFill>
-                    <a:blip r:embed="rId114"/>
+                    <a:blip r:embed="rId117"/>
                     <a:stretch>
                       <a:fillRect/>
                     </a:stretch>
@@ -5250,18 +5315,18 @@
           <wp:inline>
             <wp:extent cx="5013960" cy="2785110"/>
             <wp:effectExtent b="0" l="0" r="0" t="0"/>
-            <wp:docPr descr="" title="" id="118" name="Picture"/>
+            <wp:docPr descr="" title="" id="121" name="Picture"/>
             <a:graphic>
               <a:graphicData uri="http://schemas.openxmlformats.org/drawingml/2006/picture">
                 <pic:pic>
                   <pic:nvPicPr>
-                    <pic:cNvPr descr="figs/fig09_gis_rfid.png" id="119" name="Picture"/>
+                    <pic:cNvPr descr="figs/fig09_gis_rfid.png" id="122" name="Picture"/>
                     <pic:cNvPicPr>
                       <a:picLocks noChangeArrowheads="1" noChangeAspect="1"/>
                     </pic:cNvPicPr>
                   </pic:nvPicPr>
                   <pic:blipFill>
-                    <a:blip r:embed="rId117"/>
+                    <a:blip r:embed="rId120"/>
                     <a:stretch>
                       <a:fillRect/>
                     </a:stretch>
@@ -5312,18 +5377,18 @@
           <wp:inline>
             <wp:extent cx="3520440" cy="2962169"/>
             <wp:effectExtent b="0" l="0" r="0" t="0"/>
-            <wp:docPr descr="" title="" id="121" name="Picture"/>
+            <wp:docPr descr="" title="" id="124" name="Picture"/>
             <a:graphic>
               <a:graphicData uri="http://schemas.openxmlformats.org/drawingml/2006/picture">
                 <pic:pic>
                   <pic:nvPicPr>
-                    <pic:cNvPr descr="figs/fig10_gis_dos.png" id="122" name="Picture"/>
+                    <pic:cNvPr descr="figs/fig10_gis_dos.png" id="125" name="Picture"/>
                     <pic:cNvPicPr>
                       <a:picLocks noChangeArrowheads="1" noChangeAspect="1"/>
                     </pic:cNvPicPr>
                   </pic:nvPicPr>
                   <pic:blipFill>
-                    <a:blip r:embed="rId120"/>
+                    <a:blip r:embed="rId123"/>
                     <a:stretch>
                       <a:fillRect/>
                     </a:stretch>
@@ -5365,8 +5430,8 @@
         <w:t xml:space="preserve">（GIS）DoS 时空暴露：傍晚（18–21 时）后台中断的被拒会话（按市镇），时间维取自真实逐时会话。</w:t>
       </w:r>
     </w:p>
-    <w:bookmarkEnd w:id="123"/>
-    <w:bookmarkStart w:id="124" w:name="附录-e-相关安全数据集定位详表"/>
+    <w:bookmarkEnd w:id="126"/>
+    <w:bookmarkStart w:id="127" w:name="附录-e-相关安全数据集定位详表"/>
     <w:p>
       <w:pPr>
         <w:pStyle w:val="Heading1"/>
@@ -5746,7 +5811,7 @@
         </w:tc>
       </w:tr>
     </w:tbl>
-    <w:bookmarkEnd w:id="124"/>
+    <w:bookmarkEnd w:id="127"/>
     <w:sectPr/>
   </w:body>
 </w:document>

</xml_diff>